<commit_message>
loss_chasing manuscript: add two figures, fix variance-share interpretation and study descriptions
Co-Authored-By: Claude Sonnet 5.5 <noreply@anthropic.com>
Claude-Session: https://claude.ai/code/session_013HycsBHnRQDCEHKmLM3Rd4
</commit_message>
<xml_diff>
--- a/loss_chasing/isr/ISR_manuscript_v2.docx
+++ b/loss_chasing/isr/ISR_manuscript_v2.docx
@@ -84,7 +84,7 @@
           <w:sz w:val="24"/>
           <w:szCs w:val="24"/>
         </w:rPr>
-        <w:t xml:space="preserve">Organizations increasingly consider letting large language models (LLMs) operate other AI systems, choosing among patching, redeploying, rolling back, and skipping regression tests. Behavioral economics predicts that a decision maker who codes an outcome as a loss takes more risk to recover it. We test whether the accounting frame of a failed update makes an LLM operator skip verification, in an environment where skipping is dominated and everything is scored by rule. Study 1 executes the registered protocol on three models and finds no support for loss chasing. Studies 2 to 4 then write each frame in 16 independently generated wordings, so that the wording, not the episode, is the unit of replication. Under time pressure a fast commercial model (Claude Haiku 4.5) skips tests in 27.2% of first choices with three turns left and almost never with more time, and its loss frame skips less than its gain-to-goal frame in 15 of 16 wordings (-62.9 percentage points). Two larger commercial models (Sonnet 5.5 and Opus 5.5) never skip in 4,320 first choices each. Enabling extended thinking in the fast model cuts skipping to 9.7%. A 2 x 2 design identifies what drives the skipping: stating the target in the headline raises it by 54 points, whereas loss text lowers it by 13, so goal visibility, not loss accounting, produces the shortcut. We also show that the natural risk-index test of escalation is invalid when a positive-value rollback exists, and we propose excess risk together with test-skipping. The practical implication is to audit an operator model on its own payoff structure, with many wordings and with its reasoning setting fixed.</w:t>
+        <w:t xml:space="preserve">Organizations increasingly consider letting large language models (LLMs) operate other AI systems, choosing among patching, redeploying, rolling back, and skipping regression tests. Behavioral economics predicts that a decision maker who codes an outcome as a loss takes more risk to recover it. We test whether the accounting frame of a failed update makes an LLM operator skip verification, in an environment where skipping is dominated and everything is scored by rule. Study 1 executes the registered protocol on three models and finds no support for loss chasing. Studies 2 to 4 then write each frame in 16 independently generated wordings, so that the wording, not the episode, is the unit of replication. Under time pressure a fast commercial model (Claude Haiku 4.5) skips tests in 27.2% of first choices with three turns left and almost never with more time, and its loss frame skips less than its gain-to-goal frame in 15 of 16 wordings (-62.9 percentage points). Two larger commercial models (Sonnet 5.5 and Opus 5.5) never skip in 4,320 first choices each. Enabling extended thinking in the fast model cuts skipping to 9.7%. A 2 x 2 design identifies what drives the skipping: stating the target in the headline raises it by up to 54 points, whereas loss text lowers it by 13, so goal visibility, not loss accounting, produces the shortcut. We also show that the natural risk-index test of escalation is invalid when a positive-value rollback exists, and we propose excess risk together with test-skipping. The practical implication is to audit an operator model on its own payoff structure, with many wordings and with its reasoning setting fixed.</w:t>
       </w:r>
     </w:p>
     <w:p>
@@ -1006,7 +1006,7 @@
                 <w:sz w:val="20"/>
                 <w:szCs w:val="20"/>
               </w:rPr>
-              <w:t xml:space="preserve">3 frames x 3 failure levels, 12 turns left, 4 headlines per frame in a single wording</w:t>
+              <w:t xml:space="preserve">3 frames x 3 failure levels, 12 turns left, one headline per frame (the registered wording)</w:t>
             </w:r>
           </w:p>
         </w:tc>
@@ -3623,7 +3623,7 @@
           <w:sz w:val="24"/>
           <w:szCs w:val="24"/>
         </w:rPr>
-        <w:t xml:space="preserve">The system role is a fixed on-call lead whose objective is to maximize terminal quality and who is told that a single -5 incident is severe. Output must be JSON with an action and a one-line reason. Parse failures are mapped to hold and flagged. Study 1 used two small open models executed locally on CPU (Qwen2.5-1.5B-Instruct and SmolLM2-1.7B-Instruct) at temperature 0.7 and Claude Haiku 4.5 through its programming interface at temperatures 0.0 and 0.7. For the open models the opening characters of the JSON response were pre-filled in the assistant turn, because a 0.5-billion-parameter pilot replied with a bare action name and every response failed to parse; this forces the output format and could itself influence the choice. Studies 2 to 4 used three commercial models: Haiku 4.5 (temperature 0.7), Sonnet 5.5, and Opus 5.5. The Sonnet and Opus tiers accept no temperature argument and are run at the model default; the runs record this per row. Study 3 enabled extended thinking in Haiku 4.5 with a budget of 2,000 tokens, which also precludes setting a temperature.</w:t>
+        <w:t xml:space="preserve">The system role is a fixed on-call lead whose objective is to maximize terminal quality and who is told that a single -5 incident is severe. Output must be JSON with an action and a one-line reason. Parse failures are mapped to hold and flagged. Study 1 used two small open models executed locally on CPU (Qwen2.5-1.5B-Instruct and SmolLM2-1.7B-Instruct) at temperature 0.7 and Claude Haiku 4.5 through its programming interface at temperatures 0.0 and 0.7. For the open models the opening characters of the JSON response were pre-filled in the assistant turn, because a 0.5-billion-parameter pilot replied with a bare action name and every response failed to parse; this forces the output format and could itself influence the choice. Study 2 used three commercial models: Haiku 4.5 (temperature 0.7), Sonnet 5.5, and Opus 5.5; Studies 3 and 4 used Haiku 4.5. The Sonnet and Opus tiers accept no temperature argument and are run at the model default; the runs record this per row. Study 3 enabled extended thinking in Haiku 4.5 with a budget of 2,000 tokens, which also precludes setting a temperature.</w:t>
       </w:r>
     </w:p>
     <w:p>
@@ -7936,17 +7936,72 @@
     </w:p>
     <w:p>
       <w:pPr>
-        <w:spacing w:after="0" w:before="0" w:line="480"/>
-        <w:ind w:firstLine="720"/>
-        <w:jc w:val="left"/>
+        <w:keepNext/>
+        <w:spacing w:after="60" w:before="120"/>
+        <w:jc w:val="center"/>
       </w:pPr>
       <w:r>
-        <w:rPr>
-          <w:rFonts w:ascii="Times New Roman" w:cs="Times New Roman" w:eastAsia="Times New Roman" w:hAnsi="Times New Roman"/>
-          <w:sz w:val="24"/>
-          <w:szCs w:val="24"/>
-        </w:rPr>
-        <w:t xml:space="preserve">Haiku 4.5 did not skip with twelve turns left, almost never with six (0.5%), and skipped in 27.2% of first choices with three left, with cell rates from 0% to 100%. At three turns left the loss frame was below the gain-to-goal frame in 15 of 16 wordings and above it in none, by 62.9 percentage points on average, and the neutral frame was below it by 50.4 points. Frame explained 52.4% of the variation in the wording-by-frame table, wording 9.7%, and the interaction 37.9%, close to the 1.3% expected from sampling noise alone only for the interaction share, so most of that share reflects wordings that differ in how strongly they separate the frames, not noise. The sign of the frame ordering is therefore a property of the frames across wordings, and the size of the gap varies across wordings. The direction contradicts H1: the loss frame skips less, not more.</w:t>
+        <w:drawing>
+          <wp:inline distT="0" distB="0" distL="0" distR="0">
+            <wp:extent cx="5667375" cy="3295650"/>
+            <wp:effectExtent t="0" r="0" b="0" l="0"/>
+            <wp:docPr id="1" name="Skip rate by turns left and model" descr="Skip rate by turns left and model" title="Skip rate by turns left and model"/>
+            <wp:cNvGraphicFramePr>
+              <a:graphicFrameLocks xmlns:a="http://schemas.openxmlformats.org/drawingml/2006/main" noChangeAspect="1"/>
+            </wp:cNvGraphicFramePr>
+            <a:graphic xmlns:a="http://schemas.openxmlformats.org/drawingml/2006/main">
+              <a:graphicData uri="http://schemas.openxmlformats.org/drawingml/2006/picture">
+                <pic:pic xmlns:pic="http://schemas.openxmlformats.org/drawingml/2006/picture">
+                  <pic:nvPicPr>
+                    <pic:cNvPr id="0" name="" descr=""/>
+                    <pic:cNvPicPr>
+                      <a:picLocks noChangeAspect="1" noChangeArrowheads="1"/>
+                    </pic:cNvPicPr>
+                  </pic:nvPicPr>
+                  <pic:blipFill>
+                    <a:blip r:embed="rId8" cstate="none"/>
+                    <a:srcRect/>
+                    <a:stretch>
+                      <a:fillRect/>
+                    </a:stretch>
+                  </pic:blipFill>
+                  <pic:spPr bwMode="auto">
+                    <a:xfrm>
+                      <a:off x="0" y="0"/>
+                      <a:ext cx="5667375" cy="3295650"/>
+                    </a:xfrm>
+                    <a:prstGeom prst="rect">
+                      <a:avLst/>
+                    </a:prstGeom>
+                  </pic:spPr>
+                </pic:pic>
+              </a:graphicData>
+            </a:graphic>
+          </wp:inline>
+        </w:drawing>
+      </w:r>
+    </w:p>
+    <w:p>
+      <w:pPr>
+        <w:spacing w:after="240" w:before="0" w:line="240"/>
+      </w:pPr>
+      <w:r>
+        <w:rPr>
+          <w:rFonts w:ascii="Times New Roman" w:cs="Times New Roman" w:eastAsia="Times New Roman" w:hAnsi="Times New Roman"/>
+          <w:b/>
+          <w:bCs/>
+          <w:sz w:val="20"/>
+          <w:szCs w:val="20"/>
+        </w:rPr>
+        <w:t xml:space="preserve">Figure 1.</w:t>
+      </w:r>
+      <w:r>
+        <w:rPr>
+          <w:rFonts w:ascii="Times New Roman" w:cs="Times New Roman" w:eastAsia="Times New Roman" w:hAnsi="Times New Roman"/>
+          <w:sz w:val="20"/>
+          <w:szCs w:val="20"/>
+        </w:rPr>
+        <w:t xml:space="preserve"> Test-skip rate by turns left at the first choice and model (all frames and wordings pooled; 1,440 first choices per point). The larger tiers lie on the zero line. The thinking condition was run at three turns left only.</w:t>
       </w:r>
     </w:p>
     <w:p>
@@ -7961,7 +8016,7 @@
           <w:sz w:val="24"/>
           <w:szCs w:val="24"/>
         </w:rPr>
-        <w:t xml:space="preserve">Sonnet 5.5 and Opus 5.5 never chose a skip action in 4,320 first choices each. The floor is not an artifact of failed calls: parse failure was at most 0.09%, no model refused, and the actions chosen were narrow_patch in at least 97% of first choices, with wide_patch in at most 2.8% (more often with fewer turns left) and hold in at most 1.3%, both verified or non-risky options. Because the contrast cannot be estimated, these models neither support nor contradict a frame effect; they show that this environment elicits no skipping from them under any of the 48 sentences.</w:t>
+        <w:t xml:space="preserve">Haiku 4.5 did not skip with twelve turns left, almost never with six (0.5%), and skipped in 27.2% of first choices with three left, with cell rates from 0% to 100%. At three turns left the loss frame was below the gain-to-goal frame in 15 of 16 wordings and above it in none, by 62.9 percentage points on average, and the neutral frame was below it by 50.4 points. Frame explained 52.4% of the variation in the wording-by-frame table, wording 9.7%, and the interaction 37.9%, against a noise floor of only 1.3%. The interaction share is therefore real variation, not sampling noise: wordings differ in how strongly they separate the frames. But the sign of the frame ordering does not depend on the wording, and the frame explains more of the variation than the wording does. The earlier concern that one sentence per frame decides the result is therefore not borne out for this model at this condition; it is the size of the gap, not its direction, that varies across wordings. The direction contradicts H1: the loss frame skips less, not more.</w:t>
       </w:r>
     </w:p>
     <w:p>
@@ -7976,7 +8031,22 @@
           <w:sz w:val="24"/>
           <w:szCs w:val="24"/>
         </w:rPr>
-        <w:t xml:space="preserve">The two open models of Study 1, run with the registered headlines only at 12 and 3 turns left, showed no turn-scarcity effect: the overall skip rate was 18.0% at twelve turns and 18.3% at three for Qwen, and 7.2% versus 7.7% for SmolLM2, and the frame-by-scarcity interaction was not significant in either (likelihood ratio 0.25 and 1.95, </w:t>
+        <w:t xml:space="preserve">Sonnet 5.5 and Opus 5.5 never chose a skip action in 4,320 first choices each. The floor is not an artifact of failed calls: parse failure was at most 0.09%, no model refused, and the actions chosen were narrow_patch in at least 97% of first choices, with wide_patch in at most 2.8% (more often with fewer turns left) and hold in at most 1.3%, both verified or non-risky options. Because the contrast cannot be estimated, these models neither support nor contradict a frame effect; they show that this environment elicits no skipping from them under any of the 48 sentences.</w:t>
+      </w:r>
+    </w:p>
+    <w:p>
+      <w:pPr>
+        <w:spacing w:after="0" w:before="0" w:line="480"/>
+        <w:ind w:firstLine="720"/>
+        <w:jc w:val="left"/>
+      </w:pPr>
+      <w:r>
+        <w:rPr>
+          <w:rFonts w:ascii="Times New Roman" w:cs="Times New Roman" w:eastAsia="Times New Roman" w:hAnsi="Times New Roman"/>
+          <w:sz w:val="24"/>
+          <w:szCs w:val="24"/>
+        </w:rPr>
+        <w:t xml:space="preserve">The two open models of Study 1 were not rerun with the 16 wordings. A pilot with the registered headlines only (three turns left against twelve, zero and three injected failures, 50 episodes per cell at three turns) showed no turn-scarcity effect in them: the overall skip rate was 18.0% at twelve turns and 18.3% at three for Qwen, and 7.2% versus 7.7% for SmolLM2, and the frame-by-scarcity interaction was not significant in either (likelihood ratio 0.25 and 1.95, </w:t>
       </w:r>
       <w:r>
         <w:rPr>
@@ -10196,6 +10266,76 @@
     </w:tbl>
     <w:p>
       <w:pPr>
+        <w:keepNext/>
+        <w:spacing w:after="60" w:before="120"/>
+        <w:jc w:val="center"/>
+      </w:pPr>
+      <w:r>
+        <w:drawing>
+          <wp:inline distT="0" distB="0" distL="0" distR="0">
+            <wp:extent cx="5667375" cy="3657600"/>
+            <wp:effectExtent t="0" r="0" b="0" l="0"/>
+            <wp:docPr id="2" name="Skip rate by frame in Study 4" descr="Skip rate by frame in Study 4" title="Skip rate by frame in Study 4"/>
+            <wp:cNvGraphicFramePr>
+              <a:graphicFrameLocks xmlns:a="http://schemas.openxmlformats.org/drawingml/2006/main" noChangeAspect="1"/>
+            </wp:cNvGraphicFramePr>
+            <a:graphic xmlns:a="http://schemas.openxmlformats.org/drawingml/2006/main">
+              <a:graphicData uri="http://schemas.openxmlformats.org/drawingml/2006/picture">
+                <pic:pic xmlns:pic="http://schemas.openxmlformats.org/drawingml/2006/picture">
+                  <pic:nvPicPr>
+                    <pic:cNvPr id="0" name="" descr=""/>
+                    <pic:cNvPicPr>
+                      <a:picLocks noChangeAspect="1" noChangeArrowheads="1"/>
+                    </pic:cNvPicPr>
+                  </pic:nvPicPr>
+                  <pic:blipFill>
+                    <a:blip r:embed="rId9" cstate="none"/>
+                    <a:srcRect/>
+                    <a:stretch>
+                      <a:fillRect/>
+                    </a:stretch>
+                  </pic:blipFill>
+                  <pic:spPr bwMode="auto">
+                    <a:xfrm>
+                      <a:off x="0" y="0"/>
+                      <a:ext cx="5667375" cy="3657600"/>
+                    </a:xfrm>
+                    <a:prstGeom prst="rect">
+                      <a:avLst/>
+                    </a:prstGeom>
+                  </pic:spPr>
+                </pic:pic>
+              </a:graphicData>
+            </a:graphic>
+          </wp:inline>
+        </w:drawing>
+      </w:r>
+    </w:p>
+    <w:p>
+      <w:pPr>
+        <w:spacing w:after="240" w:before="0" w:line="240"/>
+      </w:pPr>
+      <w:r>
+        <w:rPr>
+          <w:rFonts w:ascii="Times New Roman" w:cs="Times New Roman" w:eastAsia="Times New Roman" w:hAnsi="Times New Roman"/>
+          <w:b/>
+          <w:bCs/>
+          <w:sz w:val="20"/>
+          <w:szCs w:val="20"/>
+        </w:rPr>
+        <w:t xml:space="preserve">Figure 2.</w:t>
+      </w:r>
+      <w:r>
+        <w:rPr>
+          <w:rFonts w:ascii="Times New Roman" w:cs="Times New Roman" w:eastAsia="Times New Roman" w:hAnsi="Times New Roman"/>
+          <w:sz w:val="20"/>
+          <w:szCs w:val="20"/>
+        </w:rPr>
+        <w:t xml:space="preserve"> Study 4: test-skip rate by frame (mean over 16 wordings; Haiku 4.5, three turns left, 480 first choices per bar). Gain, neutral + target, and loss + target state the target in the headline.</w:t>
+      </w:r>
+    </w:p>
+    <w:p>
+      <w:pPr>
         <w:spacing w:after="0" w:before="0" w:line="480"/>
         <w:ind w:firstLine="720"/>
         <w:jc w:val="left"/>
@@ -10206,7 +10346,7 @@
           <w:sz w:val="24"/>
           <w:szCs w:val="24"/>
         </w:rPr>
-        <w:t xml:space="preserve">Stating the target raised skipping substantially whatever the valence (H5): by 54.2 points with neutral text and by 30.2 points with loss text when the facts line also shows the target, and by 31.7 and 23.8 points when it does not. The effect has the same sign in 13 of 16 wordings. Loss text did not raise skipping (H6); it lowered it, by 13.1 points without a target statement and by 37.1 points with one, and the registered contrast came out at -60.4 points. With the target removed from the facts line, neutral and loss text produced no skipping at all (0.0%), so with no target visible anywhere there is nothing to chase.</w:t>
+        <w:t xml:space="preserve">Stating the target raised skipping substantially whatever the valence (H5): by 54.2 points with neutral text and by 30.2 points with loss text when the facts line also shows the target, and by 31.7 and 23.8 points when it does not. The effect is positive in 13 of 16 wordings and negative in 2 (neutral text, target also in the facts line). Loss text did not raise skipping (H6); it lowered it, by 13.1 points without a target statement and by 37.1 points with one, and the registered contrast came out at -60.4 points. With the target removed from the facts line, neutral and loss text produced no skipping at all (0.0%), so when the target is visible nowhere in the prompt, skipping disappears in these two frames.</w:t>
       </w:r>
     </w:p>
     <w:p>
@@ -13652,7 +13792,7 @@
           <w:sz w:val="24"/>
           <w:szCs w:val="24"/>
         </w:rPr>
-        <w:t xml:space="preserve"> After Study 1 we ran a time-pressure pilot with the registered headlines (three turns left, zero and three failures, 50 episodes per cell, the two open models and Haiku 4.5) and a check with four hand-written paraphrases per frame. In the Haiku pilot, the neutral frame skipped in 40 of 50 first choices and the other frames in few. We then replaced the hand-written paraphrases, which we had written after seeing the pilot output, with the 16 independently generated wordings of Study 2, and the pilot and the four-paraphrase check are superseded by Studies 2 to 4 and not reported as results. Study 3 (thinking) and Study 4 (goal visibility and valence) were designed after Study 2. The analysis scripts for Studies 2 to 4 were committed before the runs they analyze. Studies 2 to 4 are not registered.</w:t>
+        <w:t xml:space="preserve"> After Study 1 we ran a time-pressure pilot with the registered headlines (three turns left, zero and three failures, 50 episodes per cell, the two open models and Haiku 4.5) and a check with four hand-written paraphrases per frame. In the Haiku pilot, the neutral frame skipped in 40 of 50 first choices and the other frames in few. We then replaced the hand-written paraphrases, which we had written after seeing the pilot output, with the 16 independently generated wordings of Study 2. The Haiku pilot and the four-paraphrase check are superseded by Studies 2 to 4 and are not reported as results; the open-model part of the time-pressure pilot is the only evidence on open models under time pressure and is reported in Study 2 as a pilot. Study 3 (thinking) and Study 4 (goal visibility and valence) were designed after Study 2. The analysis scripts for Studies 2 to 4 were committed before the runs they analyze. Studies 2 to 4 are not registered.</w:t>
       </w:r>
     </w:p>
     <w:p>

</xml_diff>

<commit_message>
loss_chasing: affect-verb check script, --ci option, agency/goal-setting framing in manuscript
Co-Authored-By: Claude Sonnet 5.5 <noreply@anthropic.com>
Claude-Session: https://claude.ai/code/session_013HycsBHnRQDCEHKmLM3Rd4
</commit_message>
<xml_diff>
--- a/loss_chasing/isr/ISR_manuscript_v2.docx
+++ b/loss_chasing/isr/ISR_manuscript_v2.docx
@@ -190,6 +190,21 @@
           <w:sz w:val="24"/>
           <w:szCs w:val="24"/>
         </w:rPr>
+        <w:t xml:space="preserve">The question also has an information systems reading. Delegating maintenance to an AI operator creates an agency relationship in which the principal cannot observe whether the agent verified its work (Jensen and Meckling 1976; Eisenhardt 1989). The status text that the operator reads is then a control signal, part of the information structure through which the principal directs the agent, in the sense in which algorithmic systems exert control at work (Kellogg et al. 2020). Which signals induce which shortcuts is an open question for delegation to AI (Raisch and Krakowski 2021), and it matters because skipped verification leaves behind the hidden technical debt that makes machine-learning systems costly to maintain (Sculley et al. 2015).</w:t>
+      </w:r>
+    </w:p>
+    <w:p>
+      <w:pPr>
+        <w:spacing w:after="0" w:before="0" w:line="480"/>
+        <w:ind w:firstLine="720"/>
+        <w:jc w:val="left"/>
+      </w:pPr>
+      <w:r>
+        <w:rPr>
+          <w:rFonts w:ascii="Times New Roman" w:cs="Times New Roman" w:eastAsia="Times New Roman" w:hAnsi="Times New Roman"/>
+          <w:sz w:val="24"/>
+          <w:szCs w:val="24"/>
+        </w:rPr>
         <w:t xml:space="preserve">We therefore place an LLM in the role of an on-call lead and manipulate the headline sentence that describes the situation (loss, gain-to-goal, or neutral, all carrying identical facts), the number of injected failures, and, in later studies, the turns remaining, the model, its reasoning setting, and whether the target is stated. Quality, the remaining turn budget, and the options are otherwise held fixed. The payoff structure is designed so that every test-skipping option has a strictly lower expected value than its verified counterpart. Everything is scored by rule, and no human participants are recruited.</w:t>
       </w:r>
     </w:p>
@@ -566,7 +581,7 @@
           <w:sz w:val="24"/>
           <w:szCs w:val="24"/>
         </w:rPr>
-        <w:t xml:space="preserve">Goals act as reference points (Heath et al. 1999), and effort and speed change as a goal gets close (Kivetz et al. 2006). A target stated in a status line therefore offers a second route to the high-variance action that does not run through loss: with few turns left and a visible gap to close, skipping verification is a way to reach the target in time. This route predicts that stating the target raises skipping whatever the valence of the sentence, and it differs from loss chasing, which predicts that loss text raises skipping with the target held fixed. We also expect that a model that deliberates before answering is less likely to accept an inferior option it can reason about. Three hypotheses follow, stated after Study 1 and tested in Studies 2 to 4.</w:t>
+        <w:t xml:space="preserve">Goals act as reference points (Heath et al. 1999), and effort and speed change as a goal gets close (Kivetz et al. 2006). Goal setting raises effort and performance (Locke and Latham 2002), and the same specificity that motivates can also induce shortcut taking and rule bending when a target is hard to reach (Schweitzer et al. 2004; Ordóñez et al. 2009). In agency terms, a target in a status line is a goal communicated by the principal to an agent whose verification effort it cannot observe. A target stated in a status line therefore offers a second route to the high-variance action that does not run through loss: with few turns left and a visible gap to close, skipping verification is a way to reach the target in time. This route predicts that stating the target raises skipping whatever the valence of the sentence, and it differs from loss chasing, which predicts that loss text raises skipping with the target held fixed. We also expect that a model that deliberates before answering is less likely to accept an inferior option it can reason about. Three hypotheses follow, stated after Study 1 and tested in Studies 2 to 4.</w:t>
       </w:r>
     </w:p>
     <w:p>
@@ -10476,6 +10491,21 @@
           <w:sz w:val="24"/>
           <w:szCs w:val="24"/>
         </w:rPr>
+        <w:t xml:space="preserve">For information systems research, the results bear on how control signals work in AI delegation. Research on algorithmic control emphasizes what systems monitor and direct (Kellogg et al. 2020), and research on automation emphasizes human reliance on machines (Raisch and Krakowski 2021). Our data add a third element: the text through which a principal communicates goals to an AI agent is itself a lever on the agent's verification behavior. The pattern that a specific, visible target is associated with shortcut taking in the fast model parallels the human findings on goal setting (Schweitzer et al. 2004; Ordóñez et al. 2009), and it suggests that insights from agency and goal-setting theory may transfer to AI agents, with the caveat that a language model has no motives and that we identify no mechanism.</w:t>
+      </w:r>
+    </w:p>
+    <w:p>
+      <w:pPr>
+        <w:spacing w:after="0" w:before="0" w:line="480"/>
+        <w:ind w:firstLine="720"/>
+        <w:jc w:val="left"/>
+      </w:pPr>
+      <w:r>
+        <w:rPr>
+          <w:rFonts w:ascii="Times New Roman" w:cs="Times New Roman" w:eastAsia="Times New Roman" w:hAnsi="Times New Roman"/>
+          <w:sz w:val="24"/>
+          <w:szCs w:val="24"/>
+        </w:rPr>
         <w:t xml:space="preserve">We also contribute a measurement argument. In environments where a recovery option has positive expected value after a loss, the intuitive escalation test, "does the risk index rise after failures?", is confounded by the normative benchmark: the rational operator lowers it, so the test rewards the wrong behavior in both directions. We recommend that evaluations of this kind (i) compute the expected-value-maximizing action in every state and report excess risk over it, (ii) require the inferior high-risk action, here test-skipping, to rise before calling a pattern loss chasing, (iii) check that the dominance of the inferior action is visible to the operator or learnable by it, since a verbal description of the options can turn a dominated action into a defensible time-risk trade-off when turns are scarce, (iv) estimate any frame effect over many independently generated wordings, treating the wording as the unit of replication, (v) report a floor effect explicitly as a non-test and not as a null, and (vi) vary the target statement and the valence separately, because a "gain" frame that names the goal bundles two manipulations.</w:t>
       </w:r>
     </w:p>
@@ -10674,7 +10704,7 @@
           <w:sz w:val="24"/>
           <w:szCs w:val="24"/>
         </w:rPr>
-        <w:t xml:space="preserve">Heath C, Larrick RP, Wu G (1999) Goals as reference points. </w:t>
+        <w:t xml:space="preserve">Eisenhardt KM (1989) Agency theory: An assessment and review. </w:t>
       </w:r>
       <w:r>
         <w:rPr>
@@ -10684,15 +10714,15 @@
           <w:sz w:val="24"/>
           <w:szCs w:val="24"/>
         </w:rPr>
-        <w:t xml:space="preserve">Cognitive Psychology</w:t>
-      </w:r>
-      <w:r>
-        <w:rPr>
-          <w:rFonts w:ascii="Times New Roman" w:cs="Times New Roman" w:eastAsia="Times New Roman" w:hAnsi="Times New Roman"/>
-          <w:sz w:val="24"/>
-          <w:szCs w:val="24"/>
-        </w:rPr>
-        <w:t xml:space="preserve"> 38(1):79-109.</w:t>
+        <w:t xml:space="preserve">Academy of Management Review</w:t>
+      </w:r>
+      <w:r>
+        <w:rPr>
+          <w:rFonts w:ascii="Times New Roman" w:cs="Times New Roman" w:eastAsia="Times New Roman" w:hAnsi="Times New Roman"/>
+          <w:sz w:val="24"/>
+          <w:szCs w:val="24"/>
+        </w:rPr>
+        <w:t xml:space="preserve"> 14(1):57-74.</w:t>
       </w:r>
     </w:p>
     <w:p>
@@ -10706,7 +10736,7 @@
           <w:sz w:val="24"/>
           <w:szCs w:val="24"/>
         </w:rPr>
-        <w:t xml:space="preserve">Horton JJ (2023) Large language models as simulated economic agents: What can we learn from </w:t>
+        <w:t xml:space="preserve">Heath C, Larrick RP, Wu G (1999) Goals as reference points. </w:t>
       </w:r>
       <w:r>
         <w:rPr>
@@ -10716,15 +10746,15 @@
           <w:sz w:val="24"/>
           <w:szCs w:val="24"/>
         </w:rPr>
-        <w:t xml:space="preserve">Homo silicus</w:t>
-      </w:r>
-      <w:r>
-        <w:rPr>
-          <w:rFonts w:ascii="Times New Roman" w:cs="Times New Roman" w:eastAsia="Times New Roman" w:hAnsi="Times New Roman"/>
-          <w:sz w:val="24"/>
-          <w:szCs w:val="24"/>
-        </w:rPr>
-        <w:t xml:space="preserve">? Preprint, arXiv:2301.07543.</w:t>
+        <w:t xml:space="preserve">Cognitive Psychology</w:t>
+      </w:r>
+      <w:r>
+        <w:rPr>
+          <w:rFonts w:ascii="Times New Roman" w:cs="Times New Roman" w:eastAsia="Times New Roman" w:hAnsi="Times New Roman"/>
+          <w:sz w:val="24"/>
+          <w:szCs w:val="24"/>
+        </w:rPr>
+        <w:t xml:space="preserve"> 38(1):79-109.</w:t>
       </w:r>
     </w:p>
     <w:p>
@@ -10738,7 +10768,7 @@
           <w:sz w:val="24"/>
           <w:szCs w:val="24"/>
         </w:rPr>
-        <w:t xml:space="preserve">Kahneman D, Tversky A (1979) Prospect theory: An analysis of decision under risk. </w:t>
+        <w:t xml:space="preserve">Horton JJ (2023) Large language models as simulated economic agents: What can we learn from </w:t>
       </w:r>
       <w:r>
         <w:rPr>
@@ -10748,15 +10778,15 @@
           <w:sz w:val="24"/>
           <w:szCs w:val="24"/>
         </w:rPr>
-        <w:t xml:space="preserve">Econometrica</w:t>
-      </w:r>
-      <w:r>
-        <w:rPr>
-          <w:rFonts w:ascii="Times New Roman" w:cs="Times New Roman" w:eastAsia="Times New Roman" w:hAnsi="Times New Roman"/>
-          <w:sz w:val="24"/>
-          <w:szCs w:val="24"/>
-        </w:rPr>
-        <w:t xml:space="preserve"> 47(2):263-291.</w:t>
+        <w:t xml:space="preserve">Homo silicus</w:t>
+      </w:r>
+      <w:r>
+        <w:rPr>
+          <w:rFonts w:ascii="Times New Roman" w:cs="Times New Roman" w:eastAsia="Times New Roman" w:hAnsi="Times New Roman"/>
+          <w:sz w:val="24"/>
+          <w:szCs w:val="24"/>
+        </w:rPr>
+        <w:t xml:space="preserve">? Preprint, arXiv:2301.07543.</w:t>
       </w:r>
     </w:p>
     <w:p>
@@ -10770,7 +10800,7 @@
           <w:sz w:val="24"/>
           <w:szCs w:val="24"/>
         </w:rPr>
-        <w:t xml:space="preserve">Kivetz R, Urminsky O, Zheng Y (2006) The goal-gradient hypothesis resurrected: Purchase acceleration, illusionary goal progress, and customer retention. </w:t>
+        <w:t xml:space="preserve">Jensen MC, Meckling WH (1976) Theory of the firm: Managerial behavior, agency costs and ownership structure. </w:t>
       </w:r>
       <w:r>
         <w:rPr>
@@ -10780,15 +10810,15 @@
           <w:sz w:val="24"/>
           <w:szCs w:val="24"/>
         </w:rPr>
-        <w:t xml:space="preserve">Journal of Marketing Research</w:t>
-      </w:r>
-      <w:r>
-        <w:rPr>
-          <w:rFonts w:ascii="Times New Roman" w:cs="Times New Roman" w:eastAsia="Times New Roman" w:hAnsi="Times New Roman"/>
-          <w:sz w:val="24"/>
-          <w:szCs w:val="24"/>
-        </w:rPr>
-        <w:t xml:space="preserve"> 43(1):39-58.</w:t>
+        <w:t xml:space="preserve">Journal of Financial Economics</w:t>
+      </w:r>
+      <w:r>
+        <w:rPr>
+          <w:rFonts w:ascii="Times New Roman" w:cs="Times New Roman" w:eastAsia="Times New Roman" w:hAnsi="Times New Roman"/>
+          <w:sz w:val="24"/>
+          <w:szCs w:val="24"/>
+        </w:rPr>
+        <w:t xml:space="preserve"> 3(4):305-360.</w:t>
       </w:r>
     </w:p>
     <w:p>
@@ -10802,7 +10832,7 @@
           <w:sz w:val="24"/>
           <w:szCs w:val="24"/>
         </w:rPr>
-        <w:t xml:space="preserve">Ouyang L, et al. (2022) Training language models to follow instructions with human feedback. </w:t>
+        <w:t xml:space="preserve">Kahneman D, Tversky A (1979) Prospect theory: An analysis of decision under risk. </w:t>
       </w:r>
       <w:r>
         <w:rPr>
@@ -10812,15 +10842,15 @@
           <w:sz w:val="24"/>
           <w:szCs w:val="24"/>
         </w:rPr>
-        <w:t xml:space="preserve">Advances in Neural Information Processing Systems</w:t>
-      </w:r>
-      <w:r>
-        <w:rPr>
-          <w:rFonts w:ascii="Times New Roman" w:cs="Times New Roman" w:eastAsia="Times New Roman" w:hAnsi="Times New Roman"/>
-          <w:sz w:val="24"/>
-          <w:szCs w:val="24"/>
-        </w:rPr>
-        <w:t xml:space="preserve"> 35.</w:t>
+        <w:t xml:space="preserve">Econometrica</w:t>
+      </w:r>
+      <w:r>
+        <w:rPr>
+          <w:rFonts w:ascii="Times New Roman" w:cs="Times New Roman" w:eastAsia="Times New Roman" w:hAnsi="Times New Roman"/>
+          <w:sz w:val="24"/>
+          <w:szCs w:val="24"/>
+        </w:rPr>
+        <w:t xml:space="preserve"> 47(2):263-291.</w:t>
       </w:r>
     </w:p>
     <w:p>
@@ -10834,7 +10864,25 @@
           <w:sz w:val="24"/>
           <w:szCs w:val="24"/>
         </w:rPr>
-        <w:t xml:space="preserve">Ross J, et al. (2024) LLM economicus? Mapping the behavioral biases of LLMs via utility theory. Preprint, arXiv:2408.02784.</w:t>
+        <w:t xml:space="preserve">Kellogg KC, Valentine MA, Christin A (2020) Algorithms at work: The new contested terrain of control. </w:t>
+      </w:r>
+      <w:r>
+        <w:rPr>
+          <w:rFonts w:ascii="Times New Roman" w:cs="Times New Roman" w:eastAsia="Times New Roman" w:hAnsi="Times New Roman"/>
+          <w:i/>
+          <w:iCs/>
+          <w:sz w:val="24"/>
+          <w:szCs w:val="24"/>
+        </w:rPr>
+        <w:t xml:space="preserve">Academy of Management Annals</w:t>
+      </w:r>
+      <w:r>
+        <w:rPr>
+          <w:rFonts w:ascii="Times New Roman" w:cs="Times New Roman" w:eastAsia="Times New Roman" w:hAnsi="Times New Roman"/>
+          <w:sz w:val="24"/>
+          <w:szCs w:val="24"/>
+        </w:rPr>
+        <w:t xml:space="preserve"> 14(1):366-410.</w:t>
       </w:r>
     </w:p>
     <w:p>
@@ -10848,7 +10896,7 @@
           <w:sz w:val="24"/>
           <w:szCs w:val="24"/>
         </w:rPr>
-        <w:t xml:space="preserve">Samuelson W, Zeckhauser R (1988) Status quo bias in decision making. </w:t>
+        <w:t xml:space="preserve">Kivetz R, Urminsky O, Zheng Y (2006) The goal-gradient hypothesis resurrected: Purchase acceleration, illusionary goal progress, and customer retention. </w:t>
       </w:r>
       <w:r>
         <w:rPr>
@@ -10858,6 +10906,180 @@
           <w:sz w:val="24"/>
           <w:szCs w:val="24"/>
         </w:rPr>
+        <w:t xml:space="preserve">Journal of Marketing Research</w:t>
+      </w:r>
+      <w:r>
+        <w:rPr>
+          <w:rFonts w:ascii="Times New Roman" w:cs="Times New Roman" w:eastAsia="Times New Roman" w:hAnsi="Times New Roman"/>
+          <w:sz w:val="24"/>
+          <w:szCs w:val="24"/>
+        </w:rPr>
+        <w:t xml:space="preserve"> 43(1):39-58.</w:t>
+      </w:r>
+    </w:p>
+    <w:p>
+      <w:pPr>
+        <w:spacing w:after="0" w:before="0" w:line="480"/>
+        <w:ind w:left="720" w:hanging="720"/>
+      </w:pPr>
+      <w:r>
+        <w:rPr>
+          <w:rFonts w:ascii="Times New Roman" w:cs="Times New Roman" w:eastAsia="Times New Roman" w:hAnsi="Times New Roman"/>
+          <w:sz w:val="24"/>
+          <w:szCs w:val="24"/>
+        </w:rPr>
+        <w:t xml:space="preserve">Locke EA, Latham GP (2002) Building a practically useful theory of goal setting and task motivation: A 35-year odyssey. </w:t>
+      </w:r>
+      <w:r>
+        <w:rPr>
+          <w:rFonts w:ascii="Times New Roman" w:cs="Times New Roman" w:eastAsia="Times New Roman" w:hAnsi="Times New Roman"/>
+          <w:i/>
+          <w:iCs/>
+          <w:sz w:val="24"/>
+          <w:szCs w:val="24"/>
+        </w:rPr>
+        <w:t xml:space="preserve">American Psychologist</w:t>
+      </w:r>
+      <w:r>
+        <w:rPr>
+          <w:rFonts w:ascii="Times New Roman" w:cs="Times New Roman" w:eastAsia="Times New Roman" w:hAnsi="Times New Roman"/>
+          <w:sz w:val="24"/>
+          <w:szCs w:val="24"/>
+        </w:rPr>
+        <w:t xml:space="preserve"> 57(9):705-717.</w:t>
+      </w:r>
+    </w:p>
+    <w:p>
+      <w:pPr>
+        <w:spacing w:after="0" w:before="0" w:line="480"/>
+        <w:ind w:left="720" w:hanging="720"/>
+      </w:pPr>
+      <w:r>
+        <w:rPr>
+          <w:rFonts w:ascii="Times New Roman" w:cs="Times New Roman" w:eastAsia="Times New Roman" w:hAnsi="Times New Roman"/>
+          <w:sz w:val="24"/>
+          <w:szCs w:val="24"/>
+        </w:rPr>
+        <w:t xml:space="preserve">Ordóñez LD, Schweitzer ME, Galinsky AD, Bazerman MH (2009) Goals gone wild: The systematic side effects of overprescribing goal setting. </w:t>
+      </w:r>
+      <w:r>
+        <w:rPr>
+          <w:rFonts w:ascii="Times New Roman" w:cs="Times New Roman" w:eastAsia="Times New Roman" w:hAnsi="Times New Roman"/>
+          <w:i/>
+          <w:iCs/>
+          <w:sz w:val="24"/>
+          <w:szCs w:val="24"/>
+        </w:rPr>
+        <w:t xml:space="preserve">Academy of Management Perspectives</w:t>
+      </w:r>
+      <w:r>
+        <w:rPr>
+          <w:rFonts w:ascii="Times New Roman" w:cs="Times New Roman" w:eastAsia="Times New Roman" w:hAnsi="Times New Roman"/>
+          <w:sz w:val="24"/>
+          <w:szCs w:val="24"/>
+        </w:rPr>
+        <w:t xml:space="preserve"> 23(1):6-16.</w:t>
+      </w:r>
+    </w:p>
+    <w:p>
+      <w:pPr>
+        <w:spacing w:after="0" w:before="0" w:line="480"/>
+        <w:ind w:left="720" w:hanging="720"/>
+      </w:pPr>
+      <w:r>
+        <w:rPr>
+          <w:rFonts w:ascii="Times New Roman" w:cs="Times New Roman" w:eastAsia="Times New Roman" w:hAnsi="Times New Roman"/>
+          <w:sz w:val="24"/>
+          <w:szCs w:val="24"/>
+        </w:rPr>
+        <w:t xml:space="preserve">Ouyang L, et al. (2022) Training language models to follow instructions with human feedback. </w:t>
+      </w:r>
+      <w:r>
+        <w:rPr>
+          <w:rFonts w:ascii="Times New Roman" w:cs="Times New Roman" w:eastAsia="Times New Roman" w:hAnsi="Times New Roman"/>
+          <w:i/>
+          <w:iCs/>
+          <w:sz w:val="24"/>
+          <w:szCs w:val="24"/>
+        </w:rPr>
+        <w:t xml:space="preserve">Advances in Neural Information Processing Systems</w:t>
+      </w:r>
+      <w:r>
+        <w:rPr>
+          <w:rFonts w:ascii="Times New Roman" w:cs="Times New Roman" w:eastAsia="Times New Roman" w:hAnsi="Times New Roman"/>
+          <w:sz w:val="24"/>
+          <w:szCs w:val="24"/>
+        </w:rPr>
+        <w:t xml:space="preserve"> 35.</w:t>
+      </w:r>
+    </w:p>
+    <w:p>
+      <w:pPr>
+        <w:spacing w:after="0" w:before="0" w:line="480"/>
+        <w:ind w:left="720" w:hanging="720"/>
+      </w:pPr>
+      <w:r>
+        <w:rPr>
+          <w:rFonts w:ascii="Times New Roman" w:cs="Times New Roman" w:eastAsia="Times New Roman" w:hAnsi="Times New Roman"/>
+          <w:sz w:val="24"/>
+          <w:szCs w:val="24"/>
+        </w:rPr>
+        <w:t xml:space="preserve">Raisch S, Krakowski S (2021) Artificial intelligence and management: The automation-augmentation paradox. </w:t>
+      </w:r>
+      <w:r>
+        <w:rPr>
+          <w:rFonts w:ascii="Times New Roman" w:cs="Times New Roman" w:eastAsia="Times New Roman" w:hAnsi="Times New Roman"/>
+          <w:i/>
+          <w:iCs/>
+          <w:sz w:val="24"/>
+          <w:szCs w:val="24"/>
+        </w:rPr>
+        <w:t xml:space="preserve">Academy of Management Review</w:t>
+      </w:r>
+      <w:r>
+        <w:rPr>
+          <w:rFonts w:ascii="Times New Roman" w:cs="Times New Roman" w:eastAsia="Times New Roman" w:hAnsi="Times New Roman"/>
+          <w:sz w:val="24"/>
+          <w:szCs w:val="24"/>
+        </w:rPr>
+        <w:t xml:space="preserve"> 46(1):192-210.</w:t>
+      </w:r>
+    </w:p>
+    <w:p>
+      <w:pPr>
+        <w:spacing w:after="0" w:before="0" w:line="480"/>
+        <w:ind w:left="720" w:hanging="720"/>
+      </w:pPr>
+      <w:r>
+        <w:rPr>
+          <w:rFonts w:ascii="Times New Roman" w:cs="Times New Roman" w:eastAsia="Times New Roman" w:hAnsi="Times New Roman"/>
+          <w:sz w:val="24"/>
+          <w:szCs w:val="24"/>
+        </w:rPr>
+        <w:t xml:space="preserve">Ross J, et al. (2024) LLM economicus? Mapping the behavioral biases of LLMs via utility theory. Preprint, arXiv:2408.02784.</w:t>
+      </w:r>
+    </w:p>
+    <w:p>
+      <w:pPr>
+        <w:spacing w:after="0" w:before="0" w:line="480"/>
+        <w:ind w:left="720" w:hanging="720"/>
+      </w:pPr>
+      <w:r>
+        <w:rPr>
+          <w:rFonts w:ascii="Times New Roman" w:cs="Times New Roman" w:eastAsia="Times New Roman" w:hAnsi="Times New Roman"/>
+          <w:sz w:val="24"/>
+          <w:szCs w:val="24"/>
+        </w:rPr>
+        <w:t xml:space="preserve">Samuelson W, Zeckhauser R (1988) Status quo bias in decision making. </w:t>
+      </w:r>
+      <w:r>
+        <w:rPr>
+          <w:rFonts w:ascii="Times New Roman" w:cs="Times New Roman" w:eastAsia="Times New Roman" w:hAnsi="Times New Roman"/>
+          <w:i/>
+          <w:iCs/>
+          <w:sz w:val="24"/>
+          <w:szCs w:val="24"/>
+        </w:rPr>
         <w:t xml:space="preserve">Journal of Risk and Uncertainty</w:t>
       </w:r>
       <w:r>
@@ -10867,6 +11089,70 @@
           <w:szCs w:val="24"/>
         </w:rPr>
         <w:t xml:space="preserve"> 1:7-59.</w:t>
+      </w:r>
+    </w:p>
+    <w:p>
+      <w:pPr>
+        <w:spacing w:after="0" w:before="0" w:line="480"/>
+        <w:ind w:left="720" w:hanging="720"/>
+      </w:pPr>
+      <w:r>
+        <w:rPr>
+          <w:rFonts w:ascii="Times New Roman" w:cs="Times New Roman" w:eastAsia="Times New Roman" w:hAnsi="Times New Roman"/>
+          <w:sz w:val="24"/>
+          <w:szCs w:val="24"/>
+        </w:rPr>
+        <w:t xml:space="preserve">Schweitzer ME, Ordóñez L, Douma B (2004) Goal setting as a motivator of unethical behavior. </w:t>
+      </w:r>
+      <w:r>
+        <w:rPr>
+          <w:rFonts w:ascii="Times New Roman" w:cs="Times New Roman" w:eastAsia="Times New Roman" w:hAnsi="Times New Roman"/>
+          <w:i/>
+          <w:iCs/>
+          <w:sz w:val="24"/>
+          <w:szCs w:val="24"/>
+        </w:rPr>
+        <w:t xml:space="preserve">Academy of Management Journal</w:t>
+      </w:r>
+      <w:r>
+        <w:rPr>
+          <w:rFonts w:ascii="Times New Roman" w:cs="Times New Roman" w:eastAsia="Times New Roman" w:hAnsi="Times New Roman"/>
+          <w:sz w:val="24"/>
+          <w:szCs w:val="24"/>
+        </w:rPr>
+        <w:t xml:space="preserve"> 47(3):422-432.</w:t>
+      </w:r>
+    </w:p>
+    <w:p>
+      <w:pPr>
+        <w:spacing w:after="0" w:before="0" w:line="480"/>
+        <w:ind w:left="720" w:hanging="720"/>
+      </w:pPr>
+      <w:r>
+        <w:rPr>
+          <w:rFonts w:ascii="Times New Roman" w:cs="Times New Roman" w:eastAsia="Times New Roman" w:hAnsi="Times New Roman"/>
+          <w:sz w:val="24"/>
+          <w:szCs w:val="24"/>
+        </w:rPr>
+        <w:t xml:space="preserve">Sculley D, et al. (2015) Hidden technical debt in machine learning systems. </w:t>
+      </w:r>
+      <w:r>
+        <w:rPr>
+          <w:rFonts w:ascii="Times New Roman" w:cs="Times New Roman" w:eastAsia="Times New Roman" w:hAnsi="Times New Roman"/>
+          <w:i/>
+          <w:iCs/>
+          <w:sz w:val="24"/>
+          <w:szCs w:val="24"/>
+        </w:rPr>
+        <w:t xml:space="preserve">Advances in Neural Information Processing Systems</w:t>
+      </w:r>
+      <w:r>
+        <w:rPr>
+          <w:rFonts w:ascii="Times New Roman" w:cs="Times New Roman" w:eastAsia="Times New Roman" w:hAnsi="Times New Roman"/>
+          <w:sz w:val="24"/>
+          <w:szCs w:val="24"/>
+        </w:rPr>
+        <w:t xml:space="preserve"> 28.</w:t>
       </w:r>
     </w:p>
     <w:p>

</xml_diff>

<commit_message>
manuscript: wording-level cell ranges, emotive-verb check, multiplicity check at 99.6%
Co-Authored-By: Claude Sonnet 5.5 <noreply@anthropic.com>
Claude-Session: https://claude.ai/code/session_013HycsBHnRQDCEHKmLM3Rd4
</commit_message>
<xml_diff>
--- a/loss_chasing/isr/ISR_manuscript_v2.docx
+++ b/loss_chasing/isr/ISR_manuscript_v2.docx
@@ -8031,7 +8031,37 @@
           <w:sz w:val="24"/>
           <w:szCs w:val="24"/>
         </w:rPr>
-        <w:t xml:space="preserve">Haiku 4.5 did not skip with twelve turns left, almost never with six (0.5%), and skipped in 27.2% of first choices with three left, with cell rates from 0% to 100%. At three turns left the loss frame was below the gain-to-goal frame in 15 of 16 wordings and above it in none, by 62.9 percentage points on average, and the neutral frame was below it by 50.4 points. Frame explained 52.4% of the variation in the wording-by-frame table, wording 9.7%, and the interaction 37.9%, against a noise floor of only 1.3%. The interaction share is therefore real variation, not sampling noise: wordings differ in how strongly they separate the frames. But the sign of the frame ordering does not depend on the wording, and the frame explains more of the variation than the wording does. This suggests that, for this model in this condition, the concern that one sentence per frame decides the result does not apply to the direction of the effect; what varies across wordings is the size of the gap. The direction is opposite to H1: the loss frame skips less, not more.</w:t>
+        <w:t xml:space="preserve">Haiku 4.5 did not skip with twelve turns left, almost never with six (0.5%), and skipped in 27.2% of first choices with three left, with cell rates from 0% to 100%. At three turns left the loss frame was below the gain-to-goal frame in 15 of 16 wordings and above it in none, by 62.9 percentage points on average, and the neutral frame was below it by 50.4 points. Frame explained 52.4% of the variation in the wording-by-frame table, wording 9.7%, and the interaction 37.9%, against a noise floor of only 1.3%. The interaction share is therefore real variation, not sampling noise: wordings differ in how strongly they separate the frames. The loss-below-gain ordering holds in 15 of 16 wordings and the frame explains more of the variation than the wording does, but the ordering of the gain and neutral frames is not stable across wordings. Cell rates varied widely. Loss-frame cells never exceeded 16.7% under any wording, gain-frame cells ranged from 6.7% to 100%, and neutral-frame cells from 0% to 83.3%. Under the registered wording the neutral frame skipped in 83.3% of first choices and the gain frame in 6.7%, the reverse of the average ordering. The robust contrast is therefore that loss text yielded little skipping under every wording, whereas gain and neutral text yielded anything from little to nearly universal skipping depending on the wording. The direction of the loss-minus-gain contrast is opposite to H1: the loss frame skips less, not more.</w:t>
+      </w:r>
+    </w:p>
+    <w:p>
+      <w:pPr>
+        <w:spacing w:after="0" w:before="0" w:line="480"/>
+        <w:ind w:firstLine="720"/>
+        <w:jc w:val="left"/>
+      </w:pPr>
+      <w:r>
+        <w:rPr>
+          <w:rFonts w:ascii="Times New Roman" w:cs="Times New Roman" w:eastAsia="Times New Roman" w:hAnsi="Times New Roman"/>
+          <w:sz w:val="24"/>
+          <w:szCs w:val="24"/>
+        </w:rPr>
+        <w:t xml:space="preserve">The loss wordings differ in how emotive their verb is ("knocked down," "took a hit," "eroded" versus "reduced," "dropped," "decreased"), which could by itself lower skipping. We grouped the 16 loss wordings by verb from the wording text alone, before inspecting any wording-level result: six with emotive verbs (knocked down, slipped, degraded, took a hit, eroded, worsened) and ten with plain verbs. At three turns left the loss frame was below the gain frame by 55.6 points [-87.8, -20.0] across the emotive wordings (5 of 6 below) and by 67.3 points [-89.0, -42.7] across the plain wordings (10 of 10 below); the difference between the groups was +11.8 points [-29.4, +54.3]. Loss-frame skip rates were 3.9% for emotive and 1.0% for plain wordings (difference +2.9 points [-1.3, +8.4]). The negative loss-minus-gain contrast is therefore present among the plain-verb wordings alone, and emotive verbs do not lower loss-frame skipping in these data, although the interval for the group difference is wide.</w:t>
+      </w:r>
+    </w:p>
+    <w:p>
+      <w:pPr>
+        <w:spacing w:after="0" w:before="0" w:line="480"/>
+        <w:ind w:firstLine="720"/>
+        <w:jc w:val="left"/>
+      </w:pPr>
+      <w:r>
+        <w:rPr>
+          <w:rFonts w:ascii="Times New Roman" w:cs="Times New Roman" w:eastAsia="Times New Roman" w:hAnsi="Times New Roman"/>
+          <w:sz w:val="24"/>
+          <w:szCs w:val="24"/>
+        </w:rPr>
+        <w:t xml:space="preserve">Study 2 involves several contrasts. As a check on multiplicity we recomputed the three-turn intervals at the 99.6% level, which corresponds to a Bonferroni adjustment over 12 contrasts: loss minus gain was -62.9 points [-89.2, -33.8] and neutral minus gain -50.4 points [-82.5, -9.0], both still excluding zero.</w:t>
       </w:r>
     </w:p>
     <w:p>
@@ -10574,7 +10604,7 @@
           <w:sz w:val="24"/>
           <w:szCs w:val="24"/>
         </w:rPr>
-        <w:t xml:space="preserve">First, the commercial ladder confounds tier with reasoning and sampling control. Sonnet 5.5 and Opus 5.5 accept no temperature argument and reason by default, and Study 3 suggests that reasoning accounts for much of the difference to Haiku 4.5; the remainder cannot be assigned to size, to training, or to the amount of reasoning, and we do not claim a size effect. Second, the main results come from one model that skips, in one condition (no injected failures) at three turns left; Study 1 covers failure history only at twelve turns left. Third, Studies 2 to 4 were designed after Study 1 and were not registered. Their analysis scripts were written before the runs and their contrasts are descriptive, but the questions they answer were shaped by earlier output, the three studies together make many comparisons, and no interval is adjusted for multiplicity. Fourth, the 16 wordings per frame were generated by a language model and filtered by mechanical rules, with two of three batches served by a fallback model; they cover a wider range than four hand-written paraphrases but are not a random sample of all possible wordings, and loss wordings contain stronger affect verbs ("knocked," "took a hit," "eroded") than the gain and neutral wordings, which could contribute to the lower skipping under loss text. Fifth, the format pre-fill for the open models is an intervention outside the registered protocol, and the open models were run at temperature 0.7 only. Sixth, a scalar quality score compresses multidimensional incidents into one line, and the six closed actions simplify the continuous space of field work. Seventh, a model does not feel loss; it reacts to text statistics, and the design does not identify the mechanism by which a sentence changes a choice. Reasons the models give are post hoc statements and are not used as evidence. Eighth, the operator sees only qualitative option descriptions, so the dominance of verification is visible to the designer but not to the operator; with few turns left, skipping can be a defensible trade-off from the operator's information, so the skipping we observe is not clearly the expected-value-inferior choice that condition (2) of our definition requires. Ninth, results for commercial models depend on the model version at the time of the run. External validity is left to follow-up work applying the same coding scheme to live tickets.</w:t>
+        <w:t xml:space="preserve">First, the commercial ladder confounds tier with reasoning and sampling control. Sonnet 5.5 and Opus 5.5 accept no temperature argument and reason by default, and Study 3 suggests that reasoning accounts for much of the difference to Haiku 4.5; the remainder cannot be assigned to size, to training, or to the amount of reasoning, and we do not claim a size effect. Second, the main results come from one model that skips, in one condition (no injected failures) at three turns left; Study 1 covers failure history only at twelve turns left. Third, Studies 2 to 4 were designed after Study 1 and were not registered. Their analysis scripts were written before the runs and their contrasts are descriptive, but the questions they answer were shaped by earlier output, the three studies together make many comparisons, and the intervals are not adjusted for multiplicity, although the three-turn contrasts of Study 2 stay clear of zero at the 99.6% level. Fourth, the 16 wordings per frame were generated by a language model and filtered by mechanical rules, with two of three batches served by a fallback model; they cover a wider range than four hand-written paraphrases but are not a random sample of all possible wordings, and loss wordings contain stronger affect verbs ("knocked," "took a hit," "eroded") than the gain and neutral wordings, which could contribute to the lower skipping under loss text; the split of loss wordings by verb in Study 2 does not support this, but it is a comparison of six and ten wordings with a wide interval. Fifth, the format pre-fill for the open models is an intervention outside the registered protocol, and the open models were run at temperature 0.7 only. Sixth, a scalar quality score compresses multidimensional incidents into one line, and the six closed actions simplify the continuous space of field work. Seventh, a model does not feel loss; it reacts to text statistics, and the design does not identify the mechanism by which a sentence changes a choice. Reasons the models give are post hoc statements and are not used as evidence. Eighth, the operator sees only qualitative option descriptions, so the dominance of verification is visible to the designer but not to the operator; with few turns left, skipping can be a defensible trade-off from the operator's information, so the skipping we observe is not clearly the expected-value-inferior choice that condition (2) of our definition requires. Ninth, results for commercial models depend on the model version at the time of the run. External validity is left to follow-up work applying the same coding scheme to live tickets.</w:t>
       </w:r>
     </w:p>
     <w:p>

</xml_diff>

<commit_message>
manuscript: Study 4 99.6% intervals; soften contrasts that do not survive
Co-Authored-By: Claude Sonnet 5.5 <noreply@anthropic.com>
Claude-Session: https://claude.ai/code/session_013HycsBHnRQDCEHKmLM3Rd4
</commit_message>
<xml_diff>
--- a/loss_chasing/isr/ISR_manuscript_v2.docx
+++ b/loss_chasing/isr/ISR_manuscript_v2.docx
@@ -10406,7 +10406,22 @@
           <w:sz w:val="24"/>
           <w:szCs w:val="24"/>
         </w:rPr>
-        <w:t xml:space="preserve">Two further results qualify the reading. When both frames state the target in the facts line, the gain frame and the neutral-plus-target frame are not distinguishable (-6.9 points, interval -27.3 to +12.7), so the gain-to-goal effect of the earlier studies appears to be an effect of stating the target and not of a gain wording. When the target appears only in the headline, the gain frame skips more than neutral-plus-target (+24.4 points); the neutral-plus-target frame adds a status sentence to the target headline, and the added sentence reduces skipping, which is consistent with the headline that states only the gap being the most effective prompt but does not identify why.</w:t>
+        <w:t xml:space="preserve">Two further results qualify the reading. When both frames state the target in the facts line, the gain frame and the neutral-plus-target frame are not distinguishable (-6.9 points, interval -27.3 to +12.7), so the gain-to-goal effect of the earlier studies appears to be an effect of stating the target and not of a gain wording. When the target appears only in the headline, the gain frame skipped more than neutral-plus-target (+24.4 points, 95% interval +6.5 to +41.9), but the 99.6% interval includes zero (-1.0 to +49.2), so we do not treat this difference as established. The neutral-plus-target frame adds a status sentence to the target headline, and the added sentence may reduce skipping, but the data do not identify why.</w:t>
+      </w:r>
+    </w:p>
+    <w:p>
+      <w:pPr>
+        <w:spacing w:after="0" w:before="0" w:line="480"/>
+        <w:ind w:firstLine="720"/>
+        <w:jc w:val="left"/>
+      </w:pPr>
+      <w:r>
+        <w:rPr>
+          <w:rFonts w:ascii="Times New Roman" w:cs="Times New Roman" w:eastAsia="Times New Roman" w:hAnsi="Times New Roman"/>
+          <w:sz w:val="24"/>
+          <w:szCs w:val="24"/>
+        </w:rPr>
+        <w:t xml:space="preserve">As in Study 2, we recomputed the Study 4 intervals at the 99.6% level. With the target in the facts line, the goal effect with neutral text (+54.2 points [+27.5, +75.8]), the goal effect with loss text (+30.2 [+8.5, +57.5]), valence without a target statement (-13.1 [-28.8, -1.5]), valence with one (-37.1 [-64.0, -5.8]), and the registered contrast (-60.4 [-87.7, -29.6]) all stay clear of zero; the interaction (-24.0 [-52.3, +4.4]) and the gain minus neutral-plus-target check (-6.9 [-36.2, +21.0]) do not. Without the target in the facts line, the goal effect with neutral text (+31.7 [+7.9, +59.6]) and the registered contrast (-56.0 [-81.3, -30.6]) stay clear of zero, the goal effect with loss text just reaches it (+23.8 [0.0, +55.6]), and the remaining contrasts include zero. The main reading, that stating the target raises skipping and loss text does not, therefore rests on contrasts that survive the stricter level; the interaction and the finer comparisons among target-stating frames do not, and we do not rely on them.</w:t>
       </w:r>
     </w:p>
     <w:p>
@@ -10604,7 +10619,7 @@
           <w:sz w:val="24"/>
           <w:szCs w:val="24"/>
         </w:rPr>
-        <w:t xml:space="preserve">First, the commercial ladder confounds tier with reasoning and sampling control. Sonnet 5.5 and Opus 5.5 accept no temperature argument and reason by default, and Study 3 suggests that reasoning accounts for much of the difference to Haiku 4.5; the remainder cannot be assigned to size, to training, or to the amount of reasoning, and we do not claim a size effect. Second, the main results come from one model that skips, in one condition (no injected failures) at three turns left; Study 1 covers failure history only at twelve turns left. Third, Studies 2 to 4 were designed after Study 1 and were not registered. Their analysis scripts were written before the runs and their contrasts are descriptive, but the questions they answer were shaped by earlier output, the three studies together make many comparisons, and the intervals are not adjusted for multiplicity, although the three-turn contrasts of Study 2 stay clear of zero at the 99.6% level. Fourth, the 16 wordings per frame were generated by a language model and filtered by mechanical rules, with two of three batches served by a fallback model; they cover a wider range than four hand-written paraphrases but are not a random sample of all possible wordings, and loss wordings contain stronger affect verbs ("knocked," "took a hit," "eroded") than the gain and neutral wordings, which could contribute to the lower skipping under loss text; the split of loss wordings by verb in Study 2 does not support this, but it is a comparison of six and ten wordings with a wide interval. Fifth, the format pre-fill for the open models is an intervention outside the registered protocol, and the open models were run at temperature 0.7 only. Sixth, a scalar quality score compresses multidimensional incidents into one line, and the six closed actions simplify the continuous space of field work. Seventh, a model does not feel loss; it reacts to text statistics, and the design does not identify the mechanism by which a sentence changes a choice. Reasons the models give are post hoc statements and are not used as evidence. Eighth, the operator sees only qualitative option descriptions, so the dominance of verification is visible to the designer but not to the operator; with few turns left, skipping can be a defensible trade-off from the operator's information, so the skipping we observe is not clearly the expected-value-inferior choice that condition (2) of our definition requires. Ninth, results for commercial models depend on the model version at the time of the run. External validity is left to follow-up work applying the same coding scheme to live tickets.</w:t>
+        <w:t xml:space="preserve">First, the commercial ladder confounds tier with reasoning and sampling control. Sonnet 5.5 and Opus 5.5 accept no temperature argument and reason by default, and Study 3 suggests that reasoning accounts for much of the difference to Haiku 4.5; the remainder cannot be assigned to size, to training, or to the amount of reasoning, and we do not claim a size effect. Second, the main results come from one model that skips, in one condition (no injected failures) at three turns left; Study 1 covers failure history only at twelve turns left. Third, Studies 2 to 4 were designed after Study 1 and were not registered. Their analysis scripts were written before the runs and their contrasts are descriptive, but the questions they answer were shaped by earlier output, the three studies together make many comparisons, and the intervals are not adjusted for multiplicity, although the three-turn contrasts of Study 2 and the main contrasts of Study 4 (the goal effect with neutral text, valence without a target statement, and the registered contrast) stay clear of zero at the 99.6% level, while the interaction and several finer contrasts in Study 4 do not. Fourth, the 16 wordings per frame were generated by a language model and filtered by mechanical rules, with two of three batches served by a fallback model; they cover a wider range than four hand-written paraphrases but are not a random sample of all possible wordings, and loss wordings contain stronger affect verbs ("knocked," "took a hit," "eroded") than the gain and neutral wordings, which could contribute to the lower skipping under loss text; the split of loss wordings by verb in Study 2 does not support this, but it is a comparison of six and ten wordings with a wide interval. Fifth, the format pre-fill for the open models is an intervention outside the registered protocol, and the open models were run at temperature 0.7 only. Sixth, a scalar quality score compresses multidimensional incidents into one line, and the six closed actions simplify the continuous space of field work. Seventh, a model does not feel loss; it reacts to text statistics, and the design does not identify the mechanism by which a sentence changes a choice. Reasons the models give are post hoc statements and are not used as evidence. Eighth, the operator sees only qualitative option descriptions, so the dominance of verification is visible to the designer but not to the operator; with few turns left, skipping can be a defensible trade-off from the operator's information, so the skipping we observe is not clearly the expected-value-inferior choice that condition (2) of our definition requires. Ninth, results for commercial models depend on the model version at the time of the run. External validity is left to follow-up work applying the same coding scheme to live tickets.</w:t>
       </w:r>
     </w:p>
     <w:p>

</xml_diff>

<commit_message>
manuscript: position against related work on agents under pressure
Co-Authored-By: Claude Sonnet 5.5 <noreply@anthropic.com>
Claude-Session: https://claude.ai/code/session_013HycsBHnRQDCEHKmLM3Rd4
</commit_message>
<xml_diff>
--- a/loss_chasing/isr/ISR_manuscript_v2.docx
+++ b/loss_chasing/isr/ISR_manuscript_v2.docx
@@ -368,7 +368,7 @@
           <w:sz w:val="24"/>
           <w:szCs w:val="24"/>
         </w:rPr>
-        <w:t xml:space="preserve"> nor faithful replicas of human participants; they report weaker loss aversion than in human samples, steeper time discounting, and inconsistency when the framing of a task changes. Bini et al. (2026) study corrections of such biases, including prompting the model to act rationally, which sometimes reduces them. Du (2025) documents gambling-like risk taking in generation tasks. These studies mostly examine one-shot allocation or risk choices. Training that aligns models to follow instructions (Ouyang et al. 2022) is a plausible reason why behavior may differ across models even when their prompts are identical, which motivates testing more than one model rather than generalizing from a single one.</w:t>
+        <w:t xml:space="preserve"> nor faithful replicas of human participants; they report weaker loss aversion than in human samples, steeper time discounting, and inconsistency when the framing of a task changes. Bini et al. (2026) study corrections of such biases, including prompting the model to act rationally, which sometimes reduces them. Du (2025) documents gambling-like risk taking in generation tasks. These studies mostly examine one-shot allocation or risk choices. A separate line of work places language-model agents under pressure in simulated work settings. A GPT-4 trading agent acted on an insider tip and concealed its reasons more often under pressure than when the pressure was removed (Scheurer et al. 2023), and a recent study of reasoning effort asked whether agents facing an unreachable target use a forbidden tool, finding that two tiers of a commercial model avoided it at both low and maximum reasoning settings (Xu and Wu 2026). Our environment differs in that the correct choice is known from the payoff structure, the shortcut is a dominated option and not a rule violation, and the manipulation separates the valence of the status text from the visibility of the goal. Training that aligns models to follow instructions (Ouyang et al. 2022) is a plausible reason why behavior may differ across models even when their prompts are identical, which motivates testing more than one model rather than generalizing from a single one.</w:t>
       </w:r>
     </w:p>
     <w:p>
@@ -11147,6 +11147,20 @@
           <w:sz w:val="24"/>
           <w:szCs w:val="24"/>
         </w:rPr>
+        <w:t xml:space="preserve">Scheurer J, Balesni M, Hobbhahn M (2023) Large language models can strategically deceive their users when put under pressure. Preprint, arXiv:2311.07590.</w:t>
+      </w:r>
+    </w:p>
+    <w:p>
+      <w:pPr>
+        <w:spacing w:after="0" w:before="0" w:line="480"/>
+        <w:ind w:left="720" w:hanging="720"/>
+      </w:pPr>
+      <w:r>
+        <w:rPr>
+          <w:rFonts w:ascii="Times New Roman" w:cs="Times New Roman" w:eastAsia="Times New Roman" w:hAnsi="Times New Roman"/>
+          <w:sz w:val="24"/>
+          <w:szCs w:val="24"/>
+        </w:rPr>
         <w:t xml:space="preserve">Schweitzer ME, Ordóñez L, Douma B (2004) Goal setting as a motivator of unethical behavior. </w:t>
       </w:r>
       <w:r>
@@ -11262,6 +11276,20 @@
           <w:szCs w:val="24"/>
         </w:rPr>
         <w:t xml:space="preserve"> 211(4481):453-458.</w:t>
+      </w:r>
+    </w:p>
+    <w:p>
+      <w:pPr>
+        <w:spacing w:after="0" w:before="0" w:line="480"/>
+        <w:ind w:left="720" w:hanging="720"/>
+      </w:pPr>
+      <w:r>
+        <w:rPr>
+          <w:rFonts w:ascii="Times New Roman" w:cs="Times New Roman" w:eastAsia="Times New Roman" w:hAnsi="Times New Roman"/>
+          <w:sz w:val="24"/>
+          <w:szCs w:val="24"/>
+        </w:rPr>
+        <w:t xml:space="preserve">Xu X, Wu W (2026) Low reasoning effort is enough for routine office work by language-model agents. Preprint, arXiv:2608.03169.</w:t>
       </w:r>
     </w:p>
     <w:p>

</xml_diff>

<commit_message>
manuscript: related work on framing and agents under pressure; reasoning result vs Jiang and Tang
Co-Authored-By: Claude Sonnet 5.5 <noreply@anthropic.com>
Claude-Session: https://claude.ai/code/session_013HycsBHnRQDCEHKmLM3Rd4
</commit_message>
<xml_diff>
--- a/loss_chasing/isr/ISR_manuscript_v2.docx
+++ b/loss_chasing/isr/ISR_manuscript_v2.docx
@@ -368,7 +368,7 @@
           <w:sz w:val="24"/>
           <w:szCs w:val="24"/>
         </w:rPr>
-        <w:t xml:space="preserve"> nor faithful replicas of human participants; they report weaker loss aversion than in human samples, steeper time discounting, and inconsistency when the framing of a task changes. Bini et al. (2026) study corrections of such biases, including prompting the model to act rationally, which sometimes reduces them. Du (2025) documents gambling-like risk taking in generation tasks. These studies mostly examine one-shot allocation or risk choices. A separate line of work places language-model agents under pressure in simulated work settings. A GPT-4 trading agent acted on an insider tip and concealed its reasons more often under pressure than when the pressure was removed (Scheurer et al. 2023), and a recent study of reasoning effort asked whether agents facing an unreachable target use a forbidden tool, finding that two tiers of a commercial model avoided it at both low and maximum reasoning settings (Xu and Wu 2026). Our environment differs in that the correct choice is known from the payoff structure, the shortcut is a dominated option and not a rule violation, and the manipulation separates the valence of the status text from the visibility of the goal. Training that aligns models to follow instructions (Ouyang et al. 2022) is a plausible reason why behavior may differ across models even when their prompts are identical, which motivates testing more than one model rather than generalizing from a single one.</w:t>
+        <w:t xml:space="preserve"> nor faithful replicas of human participants; they report weaker loss aversion than in human samples, steeper time discounting, and inconsistency when the framing of a task changes. Bini et al. (2026) study corrections of such biases, including prompting the model to act rationally, which sometimes reduces them. Du (2025) documents gambling-like risk taking in generation tasks. Payne (2025) reports that reasoning models show choices consistent with prospect theory in scenario-based risk decisions, with framing effects that vary by scenario, and Wang and Zhang (2026) find that logically equivalent framings shift choices across model families, often toward risk-averse options, in a voting task. These studies mostly examine one-shot allocation or risk choices. A separate line of work places language-model agents under pressure in simulated work settings. A GPT-4 trading agent acted on an insider tip and concealed its reasons more often under pressure than when the pressure was removed (Scheurer et al. 2023). Agents facing a conflict between reaching a goal and keeping a safety constraint have been reported to trade safety for utility, with stronger reasoning accelerating the decline through rationalization (Jiang and Tang 2026). Coding agents violate their instructions more often under sustained environmental pressure (Saebo et al. 2026), and long-horizon tool-use agents are biased toward submitting an answer that looks complete while constraints remain unresolved as the end approaches (Chen et al. 2026). A study of reasoning effort asked whether agents facing an unreachable target use a forbidden tool, and found that two tiers of a commercial model avoided it at both low and maximum reasoning settings (Xu and Wu 2026). Our environment differs in that the correct choice is known from the payoff structure, the shortcut is a dominated option and not a rule violation, and the manipulation separates the valence of the status text from the visibility of the goal. Training that aligns models to follow instructions (Ouyang et al. 2022) is a plausible reason why behavior may differ across models even when their prompts are identical, which motivates testing more than one model rather than generalizing from a single one.</w:t>
       </w:r>
     </w:p>
     <w:p>
@@ -10551,6 +10551,21 @@
           <w:sz w:val="24"/>
           <w:szCs w:val="24"/>
         </w:rPr>
+        <w:t xml:space="preserve">Our reasoning result sits beside work reporting the opposite pattern. Jiang and Tang (2026) find that stronger reasoning makes agents more likely to trade safety for utility under pressure, whereas we find less skipping with reasoning in the fast model and none in the larger tiers. The two need not conflict. Their setting makes compliance infeasible and sets a rule against a goal, whereas in ours the verified options remain feasible and the shortcut is a dominated option, so deliberation can favor the verified route. We cannot tell which feature of the settings accounts for the difference, and a design that varies both within one environment would be needed to say.</w:t>
+      </w:r>
+    </w:p>
+    <w:p>
+      <w:pPr>
+        <w:spacing w:after="0" w:before="0" w:line="480"/>
+        <w:ind w:firstLine="720"/>
+        <w:jc w:val="left"/>
+      </w:pPr>
+      <w:r>
+        <w:rPr>
+          <w:rFonts w:ascii="Times New Roman" w:cs="Times New Roman" w:eastAsia="Times New Roman" w:hAnsi="Times New Roman"/>
+          <w:sz w:val="24"/>
+          <w:szCs w:val="24"/>
+        </w:rPr>
         <w:t xml:space="preserve">We also contribute a measurement argument. In environments where a recovery option has positive expected value after a loss, the intuitive escalation test, "does the risk index rise after failures?", is confounded by the normative benchmark: the rational operator lowers it, so the test rewards the wrong behavior in both directions. We recommend that evaluations of this kind (i) compute the expected-value-maximizing action in every state and report excess risk over it, (ii) require the inferior high-risk action, here test-skipping, to rise before calling a pattern loss chasing, (iii) check that the dominance of the inferior action is visible to the operator or learnable by it, since a verbal description of the options can turn a dominated action into a defensible time-risk trade-off when turns are scarce, (iv) estimate any frame effect over many independently generated wordings, treating the wording as the unit of replication, (v) report a floor effect explicitly as a non-test and not as a null, and (vi) vary the target statement and the valence separately, because a "gain" frame that names the goal bundles two manipulations.</w:t>
       </w:r>
     </w:p>
@@ -10735,7 +10750,25 @@
           <w:sz w:val="24"/>
           <w:szCs w:val="24"/>
         </w:rPr>
-        <w:t xml:space="preserve">Du Y (2025) Mitigating gambling-like risk-taking behaviors in large language models: A behavioral economics approach to AI safety. Preprint, arXiv:2506.22496.</w:t>
+        <w:t xml:space="preserve">Chen H, Liu Y, Shao J, Xu X, Sun Z, Hu W (2026) Polished but unresolved: Identifying late-stage pressure states in long-horizon tool-use agents. </w:t>
+      </w:r>
+      <w:r>
+        <w:rPr>
+          <w:rFonts w:ascii="Times New Roman" w:cs="Times New Roman" w:eastAsia="Times New Roman" w:hAnsi="Times New Roman"/>
+          <w:i/>
+          <w:iCs/>
+          <w:sz w:val="24"/>
+          <w:szCs w:val="24"/>
+        </w:rPr>
+        <w:t xml:space="preserve">Proceedings of the 2026 Conference on Empirical Methods in Natural Language Processing</w:t>
+      </w:r>
+      <w:r>
+        <w:rPr>
+          <w:rFonts w:ascii="Times New Roman" w:cs="Times New Roman" w:eastAsia="Times New Roman" w:hAnsi="Times New Roman"/>
+          <w:sz w:val="24"/>
+          <w:szCs w:val="24"/>
+        </w:rPr>
+        <w:t xml:space="preserve"> (arXiv:2609.00823).</w:t>
       </w:r>
     </w:p>
     <w:p>
@@ -10749,6 +10782,20 @@
           <w:sz w:val="24"/>
           <w:szCs w:val="24"/>
         </w:rPr>
+        <w:t xml:space="preserve">Du Y (2025) Mitigating gambling-like risk-taking behaviors in large language models: A behavioral economics approach to AI safety. Preprint, arXiv:2506.22496.</w:t>
+      </w:r>
+    </w:p>
+    <w:p>
+      <w:pPr>
+        <w:spacing w:after="0" w:before="0" w:line="480"/>
+        <w:ind w:left="720" w:hanging="720"/>
+      </w:pPr>
+      <w:r>
+        <w:rPr>
+          <w:rFonts w:ascii="Times New Roman" w:cs="Times New Roman" w:eastAsia="Times New Roman" w:hAnsi="Times New Roman"/>
+          <w:sz w:val="24"/>
+          <w:szCs w:val="24"/>
+        </w:rPr>
         <w:t xml:space="preserve">Eisenhardt KM (1989) Agency theory: An assessment and review. </w:t>
       </w:r>
       <w:r>
@@ -10877,7 +10924,7 @@
           <w:sz w:val="24"/>
           <w:szCs w:val="24"/>
         </w:rPr>
-        <w:t xml:space="preserve">Kahneman D, Tversky A (1979) Prospect theory: An analysis of decision under risk. </w:t>
+        <w:t xml:space="preserve">Jiang H, Tang K (2026) Why agents compromise safety under pressure. </w:t>
       </w:r>
       <w:r>
         <w:rPr>
@@ -10887,15 +10934,15 @@
           <w:sz w:val="24"/>
           <w:szCs w:val="24"/>
         </w:rPr>
-        <w:t xml:space="preserve">Econometrica</w:t>
-      </w:r>
-      <w:r>
-        <w:rPr>
-          <w:rFonts w:ascii="Times New Roman" w:cs="Times New Roman" w:eastAsia="Times New Roman" w:hAnsi="Times New Roman"/>
-          <w:sz w:val="24"/>
-          <w:szCs w:val="24"/>
-        </w:rPr>
-        <w:t xml:space="preserve"> 47(2):263-291.</w:t>
+        <w:t xml:space="preserve">Findings of the Association for Computational Linguistics: ACL 2026</w:t>
+      </w:r>
+      <w:r>
+        <w:rPr>
+          <w:rFonts w:ascii="Times New Roman" w:cs="Times New Roman" w:eastAsia="Times New Roman" w:hAnsi="Times New Roman"/>
+          <w:sz w:val="24"/>
+          <w:szCs w:val="24"/>
+        </w:rPr>
+        <w:t xml:space="preserve"> (arXiv:2603.14975).</w:t>
       </w:r>
     </w:p>
     <w:p>
@@ -10909,7 +10956,7 @@
           <w:sz w:val="24"/>
           <w:szCs w:val="24"/>
         </w:rPr>
-        <w:t xml:space="preserve">Kellogg KC, Valentine MA, Christin A (2020) Algorithms at work: The new contested terrain of control. </w:t>
+        <w:t xml:space="preserve">Kahneman D, Tversky A (1979) Prospect theory: An analysis of decision under risk. </w:t>
       </w:r>
       <w:r>
         <w:rPr>
@@ -10919,15 +10966,15 @@
           <w:sz w:val="24"/>
           <w:szCs w:val="24"/>
         </w:rPr>
-        <w:t xml:space="preserve">Academy of Management Annals</w:t>
-      </w:r>
-      <w:r>
-        <w:rPr>
-          <w:rFonts w:ascii="Times New Roman" w:cs="Times New Roman" w:eastAsia="Times New Roman" w:hAnsi="Times New Roman"/>
-          <w:sz w:val="24"/>
-          <w:szCs w:val="24"/>
-        </w:rPr>
-        <w:t xml:space="preserve"> 14(1):366-410.</w:t>
+        <w:t xml:space="preserve">Econometrica</w:t>
+      </w:r>
+      <w:r>
+        <w:rPr>
+          <w:rFonts w:ascii="Times New Roman" w:cs="Times New Roman" w:eastAsia="Times New Roman" w:hAnsi="Times New Roman"/>
+          <w:sz w:val="24"/>
+          <w:szCs w:val="24"/>
+        </w:rPr>
+        <w:t xml:space="preserve"> 47(2):263-291.</w:t>
       </w:r>
     </w:p>
     <w:p>
@@ -10941,7 +10988,7 @@
           <w:sz w:val="24"/>
           <w:szCs w:val="24"/>
         </w:rPr>
-        <w:t xml:space="preserve">Kivetz R, Urminsky O, Zheng Y (2006) The goal-gradient hypothesis resurrected: Purchase acceleration, illusionary goal progress, and customer retention. </w:t>
+        <w:t xml:space="preserve">Kellogg KC, Valentine MA, Christin A (2020) Algorithms at work: The new contested terrain of control. </w:t>
       </w:r>
       <w:r>
         <w:rPr>
@@ -10951,15 +10998,15 @@
           <w:sz w:val="24"/>
           <w:szCs w:val="24"/>
         </w:rPr>
-        <w:t xml:space="preserve">Journal of Marketing Research</w:t>
-      </w:r>
-      <w:r>
-        <w:rPr>
-          <w:rFonts w:ascii="Times New Roman" w:cs="Times New Roman" w:eastAsia="Times New Roman" w:hAnsi="Times New Roman"/>
-          <w:sz w:val="24"/>
-          <w:szCs w:val="24"/>
-        </w:rPr>
-        <w:t xml:space="preserve"> 43(1):39-58.</w:t>
+        <w:t xml:space="preserve">Academy of Management Annals</w:t>
+      </w:r>
+      <w:r>
+        <w:rPr>
+          <w:rFonts w:ascii="Times New Roman" w:cs="Times New Roman" w:eastAsia="Times New Roman" w:hAnsi="Times New Roman"/>
+          <w:sz w:val="24"/>
+          <w:szCs w:val="24"/>
+        </w:rPr>
+        <w:t xml:space="preserve"> 14(1):366-410.</w:t>
       </w:r>
     </w:p>
     <w:p>
@@ -10973,7 +11020,7 @@
           <w:sz w:val="24"/>
           <w:szCs w:val="24"/>
         </w:rPr>
-        <w:t xml:space="preserve">Locke EA, Latham GP (2002) Building a practically useful theory of goal setting and task motivation: A 35-year odyssey. </w:t>
+        <w:t xml:space="preserve">Kivetz R, Urminsky O, Zheng Y (2006) The goal-gradient hypothesis resurrected: Purchase acceleration, illusionary goal progress, and customer retention. </w:t>
       </w:r>
       <w:r>
         <w:rPr>
@@ -10983,15 +11030,15 @@
           <w:sz w:val="24"/>
           <w:szCs w:val="24"/>
         </w:rPr>
-        <w:t xml:space="preserve">American Psychologist</w:t>
-      </w:r>
-      <w:r>
-        <w:rPr>
-          <w:rFonts w:ascii="Times New Roman" w:cs="Times New Roman" w:eastAsia="Times New Roman" w:hAnsi="Times New Roman"/>
-          <w:sz w:val="24"/>
-          <w:szCs w:val="24"/>
-        </w:rPr>
-        <w:t xml:space="preserve"> 57(9):705-717.</w:t>
+        <w:t xml:space="preserve">Journal of Marketing Research</w:t>
+      </w:r>
+      <w:r>
+        <w:rPr>
+          <w:rFonts w:ascii="Times New Roman" w:cs="Times New Roman" w:eastAsia="Times New Roman" w:hAnsi="Times New Roman"/>
+          <w:sz w:val="24"/>
+          <w:szCs w:val="24"/>
+        </w:rPr>
+        <w:t xml:space="preserve"> 43(1):39-58.</w:t>
       </w:r>
     </w:p>
     <w:p>
@@ -11005,7 +11052,7 @@
           <w:sz w:val="24"/>
           <w:szCs w:val="24"/>
         </w:rPr>
-        <w:t xml:space="preserve">Ordóñez LD, Schweitzer ME, Galinsky AD, Bazerman MH (2009) Goals gone wild: The systematic side effects of overprescribing goal setting. </w:t>
+        <w:t xml:space="preserve">Locke EA, Latham GP (2002) Building a practically useful theory of goal setting and task motivation: A 35-year odyssey. </w:t>
       </w:r>
       <w:r>
         <w:rPr>
@@ -11015,15 +11062,15 @@
           <w:sz w:val="24"/>
           <w:szCs w:val="24"/>
         </w:rPr>
-        <w:t xml:space="preserve">Academy of Management Perspectives</w:t>
-      </w:r>
-      <w:r>
-        <w:rPr>
-          <w:rFonts w:ascii="Times New Roman" w:cs="Times New Roman" w:eastAsia="Times New Roman" w:hAnsi="Times New Roman"/>
-          <w:sz w:val="24"/>
-          <w:szCs w:val="24"/>
-        </w:rPr>
-        <w:t xml:space="preserve"> 23(1):6-16.</w:t>
+        <w:t xml:space="preserve">American Psychologist</w:t>
+      </w:r>
+      <w:r>
+        <w:rPr>
+          <w:rFonts w:ascii="Times New Roman" w:cs="Times New Roman" w:eastAsia="Times New Roman" w:hAnsi="Times New Roman"/>
+          <w:sz w:val="24"/>
+          <w:szCs w:val="24"/>
+        </w:rPr>
+        <w:t xml:space="preserve"> 57(9):705-717.</w:t>
       </w:r>
     </w:p>
     <w:p>
@@ -11037,7 +11084,7 @@
           <w:sz w:val="24"/>
           <w:szCs w:val="24"/>
         </w:rPr>
-        <w:t xml:space="preserve">Ouyang L, et al. (2022) Training language models to follow instructions with human feedback. </w:t>
+        <w:t xml:space="preserve">Ordóñez LD, Schweitzer ME, Galinsky AD, Bazerman MH (2009) Goals gone wild: The systematic side effects of overprescribing goal setting. </w:t>
       </w:r>
       <w:r>
         <w:rPr>
@@ -11047,15 +11094,15 @@
           <w:sz w:val="24"/>
           <w:szCs w:val="24"/>
         </w:rPr>
-        <w:t xml:space="preserve">Advances in Neural Information Processing Systems</w:t>
-      </w:r>
-      <w:r>
-        <w:rPr>
-          <w:rFonts w:ascii="Times New Roman" w:cs="Times New Roman" w:eastAsia="Times New Roman" w:hAnsi="Times New Roman"/>
-          <w:sz w:val="24"/>
-          <w:szCs w:val="24"/>
-        </w:rPr>
-        <w:t xml:space="preserve"> 35.</w:t>
+        <w:t xml:space="preserve">Academy of Management Perspectives</w:t>
+      </w:r>
+      <w:r>
+        <w:rPr>
+          <w:rFonts w:ascii="Times New Roman" w:cs="Times New Roman" w:eastAsia="Times New Roman" w:hAnsi="Times New Roman"/>
+          <w:sz w:val="24"/>
+          <w:szCs w:val="24"/>
+        </w:rPr>
+        <w:t xml:space="preserve"> 23(1):6-16.</w:t>
       </w:r>
     </w:p>
     <w:p>
@@ -11069,7 +11116,7 @@
           <w:sz w:val="24"/>
           <w:szCs w:val="24"/>
         </w:rPr>
-        <w:t xml:space="preserve">Raisch S, Krakowski S (2021) Artificial intelligence and management: The automation-augmentation paradox. </w:t>
+        <w:t xml:space="preserve">Ouyang L, et al. (2022) Training language models to follow instructions with human feedback. </w:t>
       </w:r>
       <w:r>
         <w:rPr>
@@ -11079,15 +11126,15 @@
           <w:sz w:val="24"/>
           <w:szCs w:val="24"/>
         </w:rPr>
-        <w:t xml:space="preserve">Academy of Management Review</w:t>
-      </w:r>
-      <w:r>
-        <w:rPr>
-          <w:rFonts w:ascii="Times New Roman" w:cs="Times New Roman" w:eastAsia="Times New Roman" w:hAnsi="Times New Roman"/>
-          <w:sz w:val="24"/>
-          <w:szCs w:val="24"/>
-        </w:rPr>
-        <w:t xml:space="preserve"> 46(1):192-210.</w:t>
+        <w:t xml:space="preserve">Advances in Neural Information Processing Systems</w:t>
+      </w:r>
+      <w:r>
+        <w:rPr>
+          <w:rFonts w:ascii="Times New Roman" w:cs="Times New Roman" w:eastAsia="Times New Roman" w:hAnsi="Times New Roman"/>
+          <w:sz w:val="24"/>
+          <w:szCs w:val="24"/>
+        </w:rPr>
+        <w:t xml:space="preserve"> 35.</w:t>
       </w:r>
     </w:p>
     <w:p>
@@ -11101,7 +11148,7 @@
           <w:sz w:val="24"/>
           <w:szCs w:val="24"/>
         </w:rPr>
-        <w:t xml:space="preserve">Ross J, et al. (2024) LLM economicus? Mapping the behavioral biases of LLMs via utility theory. Preprint, arXiv:2408.02784.</w:t>
+        <w:t xml:space="preserve">Payne K (2025) An analysis of AI decision under risk: Prospect theory emerges in large language models. Preprint, arXiv:2508.00902.</w:t>
       </w:r>
     </w:p>
     <w:p>
@@ -11115,7 +11162,7 @@
           <w:sz w:val="24"/>
           <w:szCs w:val="24"/>
         </w:rPr>
-        <w:t xml:space="preserve">Samuelson W, Zeckhauser R (1988) Status quo bias in decision making. </w:t>
+        <w:t xml:space="preserve">Raisch S, Krakowski S (2021) Artificial intelligence and management: The automation-augmentation paradox. </w:t>
       </w:r>
       <w:r>
         <w:rPr>
@@ -11125,15 +11172,15 @@
           <w:sz w:val="24"/>
           <w:szCs w:val="24"/>
         </w:rPr>
-        <w:t xml:space="preserve">Journal of Risk and Uncertainty</w:t>
-      </w:r>
-      <w:r>
-        <w:rPr>
-          <w:rFonts w:ascii="Times New Roman" w:cs="Times New Roman" w:eastAsia="Times New Roman" w:hAnsi="Times New Roman"/>
-          <w:sz w:val="24"/>
-          <w:szCs w:val="24"/>
-        </w:rPr>
-        <w:t xml:space="preserve"> 1:7-59.</w:t>
+        <w:t xml:space="preserve">Academy of Management Review</w:t>
+      </w:r>
+      <w:r>
+        <w:rPr>
+          <w:rFonts w:ascii="Times New Roman" w:cs="Times New Roman" w:eastAsia="Times New Roman" w:hAnsi="Times New Roman"/>
+          <w:sz w:val="24"/>
+          <w:szCs w:val="24"/>
+        </w:rPr>
+        <w:t xml:space="preserve"> 46(1):192-210.</w:t>
       </w:r>
     </w:p>
     <w:p>
@@ -11147,7 +11194,7 @@
           <w:sz w:val="24"/>
           <w:szCs w:val="24"/>
         </w:rPr>
-        <w:t xml:space="preserve">Scheurer J, Balesni M, Hobbhahn M (2023) Large language models can strategically deceive their users when put under pressure. Preprint, arXiv:2311.07590.</w:t>
+        <w:t xml:space="preserve">Ross J, et al. (2024) LLM economicus? Mapping the behavioral biases of LLMs via utility theory. Preprint, arXiv:2408.02784.</w:t>
       </w:r>
     </w:p>
     <w:p>
@@ -11161,7 +11208,21 @@
           <w:sz w:val="24"/>
           <w:szCs w:val="24"/>
         </w:rPr>
-        <w:t xml:space="preserve">Schweitzer ME, Ordóñez L, Douma B (2004) Goal setting as a motivator of unethical behavior. </w:t>
+        <w:t xml:space="preserve">Saebo M, Gibson S, Crosse T, Menon A, Jang E, Cruz D (2026) Asymmetric goal drift in coding agents under value conflict. Preprint, arXiv:2603.03456.</w:t>
+      </w:r>
+    </w:p>
+    <w:p>
+      <w:pPr>
+        <w:spacing w:after="0" w:before="0" w:line="480"/>
+        <w:ind w:left="720" w:hanging="720"/>
+      </w:pPr>
+      <w:r>
+        <w:rPr>
+          <w:rFonts w:ascii="Times New Roman" w:cs="Times New Roman" w:eastAsia="Times New Roman" w:hAnsi="Times New Roman"/>
+          <w:sz w:val="24"/>
+          <w:szCs w:val="24"/>
+        </w:rPr>
+        <w:t xml:space="preserve">Samuelson W, Zeckhauser R (1988) Status quo bias in decision making. </w:t>
       </w:r>
       <w:r>
         <w:rPr>
@@ -11171,15 +11232,15 @@
           <w:sz w:val="24"/>
           <w:szCs w:val="24"/>
         </w:rPr>
-        <w:t xml:space="preserve">Academy of Management Journal</w:t>
-      </w:r>
-      <w:r>
-        <w:rPr>
-          <w:rFonts w:ascii="Times New Roman" w:cs="Times New Roman" w:eastAsia="Times New Roman" w:hAnsi="Times New Roman"/>
-          <w:sz w:val="24"/>
-          <w:szCs w:val="24"/>
-        </w:rPr>
-        <w:t xml:space="preserve"> 47(3):422-432.</w:t>
+        <w:t xml:space="preserve">Journal of Risk and Uncertainty</w:t>
+      </w:r>
+      <w:r>
+        <w:rPr>
+          <w:rFonts w:ascii="Times New Roman" w:cs="Times New Roman" w:eastAsia="Times New Roman" w:hAnsi="Times New Roman"/>
+          <w:sz w:val="24"/>
+          <w:szCs w:val="24"/>
+        </w:rPr>
+        <w:t xml:space="preserve"> 1:7-59.</w:t>
       </w:r>
     </w:p>
     <w:p>
@@ -11193,7 +11254,21 @@
           <w:sz w:val="24"/>
           <w:szCs w:val="24"/>
         </w:rPr>
-        <w:t xml:space="preserve">Sculley D, et al. (2015) Hidden technical debt in machine learning systems. </w:t>
+        <w:t xml:space="preserve">Scheurer J, Balesni M, Hobbhahn M (2023) Large language models can strategically deceive their users when put under pressure. Preprint, arXiv:2311.07590.</w:t>
+      </w:r>
+    </w:p>
+    <w:p>
+      <w:pPr>
+        <w:spacing w:after="0" w:before="0" w:line="480"/>
+        <w:ind w:left="720" w:hanging="720"/>
+      </w:pPr>
+      <w:r>
+        <w:rPr>
+          <w:rFonts w:ascii="Times New Roman" w:cs="Times New Roman" w:eastAsia="Times New Roman" w:hAnsi="Times New Roman"/>
+          <w:sz w:val="24"/>
+          <w:szCs w:val="24"/>
+        </w:rPr>
+        <w:t xml:space="preserve">Schweitzer ME, Ordóñez L, Douma B (2004) Goal setting as a motivator of unethical behavior. </w:t>
       </w:r>
       <w:r>
         <w:rPr>
@@ -11203,15 +11278,15 @@
           <w:sz w:val="24"/>
           <w:szCs w:val="24"/>
         </w:rPr>
-        <w:t xml:space="preserve">Advances in Neural Information Processing Systems</w:t>
-      </w:r>
-      <w:r>
-        <w:rPr>
-          <w:rFonts w:ascii="Times New Roman" w:cs="Times New Roman" w:eastAsia="Times New Roman" w:hAnsi="Times New Roman"/>
-          <w:sz w:val="24"/>
-          <w:szCs w:val="24"/>
-        </w:rPr>
-        <w:t xml:space="preserve"> 28.</w:t>
+        <w:t xml:space="preserve">Academy of Management Journal</w:t>
+      </w:r>
+      <w:r>
+        <w:rPr>
+          <w:rFonts w:ascii="Times New Roman" w:cs="Times New Roman" w:eastAsia="Times New Roman" w:hAnsi="Times New Roman"/>
+          <w:sz w:val="24"/>
+          <w:szCs w:val="24"/>
+        </w:rPr>
+        <w:t xml:space="preserve"> 47(3):422-432.</w:t>
       </w:r>
     </w:p>
     <w:p>
@@ -11225,7 +11300,7 @@
           <w:sz w:val="24"/>
           <w:szCs w:val="24"/>
         </w:rPr>
-        <w:t xml:space="preserve">Thaler RH, Johnson EJ (1990) Gambling with the house money and trying to break even: The effects of prior outcomes on risky choice. </w:t>
+        <w:t xml:space="preserve">Sculley D, et al. (2015) Hidden technical debt in machine learning systems. </w:t>
       </w:r>
       <w:r>
         <w:rPr>
@@ -11235,15 +11310,15 @@
           <w:sz w:val="24"/>
           <w:szCs w:val="24"/>
         </w:rPr>
-        <w:t xml:space="preserve">Management Science</w:t>
-      </w:r>
-      <w:r>
-        <w:rPr>
-          <w:rFonts w:ascii="Times New Roman" w:cs="Times New Roman" w:eastAsia="Times New Roman" w:hAnsi="Times New Roman"/>
-          <w:sz w:val="24"/>
-          <w:szCs w:val="24"/>
-        </w:rPr>
-        <w:t xml:space="preserve"> 36(6):643-660.</w:t>
+        <w:t xml:space="preserve">Advances in Neural Information Processing Systems</w:t>
+      </w:r>
+      <w:r>
+        <w:rPr>
+          <w:rFonts w:ascii="Times New Roman" w:cs="Times New Roman" w:eastAsia="Times New Roman" w:hAnsi="Times New Roman"/>
+          <w:sz w:val="24"/>
+          <w:szCs w:val="24"/>
+        </w:rPr>
+        <w:t xml:space="preserve"> 28.</w:t>
       </w:r>
     </w:p>
     <w:p>
@@ -11257,7 +11332,7 @@
           <w:sz w:val="24"/>
           <w:szCs w:val="24"/>
         </w:rPr>
-        <w:t xml:space="preserve">Tversky A, Kahneman D (1981) The framing of decisions and the psychology of choice. </w:t>
+        <w:t xml:space="preserve">Thaler RH, Johnson EJ (1990) Gambling with the house money and trying to break even: The effects of prior outcomes on risky choice. </w:t>
       </w:r>
       <w:r>
         <w:rPr>
@@ -11267,6 +11342,38 @@
           <w:sz w:val="24"/>
           <w:szCs w:val="24"/>
         </w:rPr>
+        <w:t xml:space="preserve">Management Science</w:t>
+      </w:r>
+      <w:r>
+        <w:rPr>
+          <w:rFonts w:ascii="Times New Roman" w:cs="Times New Roman" w:eastAsia="Times New Roman" w:hAnsi="Times New Roman"/>
+          <w:sz w:val="24"/>
+          <w:szCs w:val="24"/>
+        </w:rPr>
+        <w:t xml:space="preserve"> 36(6):643-660.</w:t>
+      </w:r>
+    </w:p>
+    <w:p>
+      <w:pPr>
+        <w:spacing w:after="0" w:before="0" w:line="480"/>
+        <w:ind w:left="720" w:hanging="720"/>
+      </w:pPr>
+      <w:r>
+        <w:rPr>
+          <w:rFonts w:ascii="Times New Roman" w:cs="Times New Roman" w:eastAsia="Times New Roman" w:hAnsi="Times New Roman"/>
+          <w:sz w:val="24"/>
+          <w:szCs w:val="24"/>
+        </w:rPr>
+        <w:t xml:space="preserve">Tversky A, Kahneman D (1981) The framing of decisions and the psychology of choice. </w:t>
+      </w:r>
+      <w:r>
+        <w:rPr>
+          <w:rFonts w:ascii="Times New Roman" w:cs="Times New Roman" w:eastAsia="Times New Roman" w:hAnsi="Times New Roman"/>
+          <w:i/>
+          <w:iCs/>
+          <w:sz w:val="24"/>
+          <w:szCs w:val="24"/>
+        </w:rPr>
         <w:t xml:space="preserve">Science</w:t>
       </w:r>
       <w:r>
@@ -11276,6 +11383,20 @@
           <w:szCs w:val="24"/>
         </w:rPr>
         <w:t xml:space="preserve"> 211(4481):453-458.</w:t>
+      </w:r>
+    </w:p>
+    <w:p>
+      <w:pPr>
+        <w:spacing w:after="0" w:before="0" w:line="480"/>
+        <w:ind w:left="720" w:hanging="720"/>
+      </w:pPr>
+      <w:r>
+        <w:rPr>
+          <w:rFonts w:ascii="Times New Roman" w:cs="Times New Roman" w:eastAsia="Times New Roman" w:hAnsi="Times New Roman"/>
+          <w:sz w:val="24"/>
+          <w:szCs w:val="24"/>
+        </w:rPr>
+        <w:t xml:space="preserve">Wang Z, Zhang Z (2026) Framing effects in independent-agent large language models: A cross-family behavioral analysis. Preprint, arXiv:2603.19282.</w:t>
       </w:r>
     </w:p>
     <w:p>

</xml_diff>

<commit_message>
manuscript: remove the recently added related-work citations
Co-Authored-By: Claude Sonnet 5.5 <noreply@anthropic.com>
Claude-Session: https://claude.ai/code/session_013HycsBHnRQDCEHKmLM3Rd4
</commit_message>
<xml_diff>
--- a/loss_chasing/isr/ISR_manuscript_v2.docx
+++ b/loss_chasing/isr/ISR_manuscript_v2.docx
@@ -368,7 +368,7 @@
           <w:sz w:val="24"/>
           <w:szCs w:val="24"/>
         </w:rPr>
-        <w:t xml:space="preserve"> nor faithful replicas of human participants; they report weaker loss aversion than in human samples, steeper time discounting, and inconsistency when the framing of a task changes. Bini et al. (2026) study corrections of such biases, including prompting the model to act rationally, which sometimes reduces them. Du (2025) documents gambling-like risk taking in generation tasks. Payne (2025) reports that reasoning models show choices consistent with prospect theory in scenario-based risk decisions, with framing effects that vary by scenario, and Wang and Zhang (2026) find that logically equivalent framings shift choices across model families, often toward risk-averse options, in a voting task. These studies mostly examine one-shot allocation or risk choices. A separate line of work places language-model agents under pressure in simulated work settings. A GPT-4 trading agent acted on an insider tip and concealed its reasons more often under pressure than when the pressure was removed (Scheurer et al. 2023). Agents facing a conflict between reaching a goal and keeping a safety constraint have been reported to trade safety for utility, with stronger reasoning accelerating the decline through rationalization (Jiang and Tang 2026). Coding agents violate their instructions more often under sustained environmental pressure (Saebo et al. 2026), and long-horizon tool-use agents are biased toward submitting an answer that looks complete while constraints remain unresolved as the end approaches (Chen et al. 2026). A study of reasoning effort asked whether agents facing an unreachable target use a forbidden tool, and found that two tiers of a commercial model avoided it at both low and maximum reasoning settings (Xu and Wu 2026). Our environment differs in that the correct choice is known from the payoff structure, the shortcut is a dominated option and not a rule violation, and the manipulation separates the valence of the status text from the visibility of the goal. Training that aligns models to follow instructions (Ouyang et al. 2022) is a plausible reason why behavior may differ across models even when their prompts are identical, which motivates testing more than one model rather than generalizing from a single one.</w:t>
+        <w:t xml:space="preserve"> nor faithful replicas of human participants; they report weaker loss aversion than in human samples, steeper time discounting, and inconsistency when the framing of a task changes. Bini et al. (2026) study corrections of such biases, including prompting the model to act rationally, which sometimes reduces them. Du (2025) documents gambling-like risk taking in generation tasks. These studies mostly examine one-shot allocation or risk choices. Training that aligns models to follow instructions (Ouyang et al. 2022) is a plausible reason why behavior may differ across models even when their prompts are identical, which motivates testing more than one model rather than generalizing from a single one.</w:t>
       </w:r>
     </w:p>
     <w:p>
@@ -10551,21 +10551,6 @@
           <w:sz w:val="24"/>
           <w:szCs w:val="24"/>
         </w:rPr>
-        <w:t xml:space="preserve">Our reasoning result sits beside work reporting the opposite pattern. Jiang and Tang (2026) find that stronger reasoning makes agents more likely to trade safety for utility under pressure, whereas we find less skipping with reasoning in the fast model and none in the larger tiers. The two need not conflict. Their setting makes compliance infeasible and sets a rule against a goal, whereas in ours the verified options remain feasible and the shortcut is a dominated option, so deliberation can favor the verified route. We cannot tell which feature of the settings accounts for the difference, and a design that varies both within one environment would be needed to say.</w:t>
-      </w:r>
-    </w:p>
-    <w:p>
-      <w:pPr>
-        <w:spacing w:after="0" w:before="0" w:line="480"/>
-        <w:ind w:firstLine="720"/>
-        <w:jc w:val="left"/>
-      </w:pPr>
-      <w:r>
-        <w:rPr>
-          <w:rFonts w:ascii="Times New Roman" w:cs="Times New Roman" w:eastAsia="Times New Roman" w:hAnsi="Times New Roman"/>
-          <w:sz w:val="24"/>
-          <w:szCs w:val="24"/>
-        </w:rPr>
         <w:t xml:space="preserve">We also contribute a measurement argument. In environments where a recovery option has positive expected value after a loss, the intuitive escalation test, "does the risk index rise after failures?", is confounded by the normative benchmark: the rational operator lowers it, so the test rewards the wrong behavior in both directions. We recommend that evaluations of this kind (i) compute the expected-value-maximizing action in every state and report excess risk over it, (ii) require the inferior high-risk action, here test-skipping, to rise before calling a pattern loss chasing, (iii) check that the dominance of the inferior action is visible to the operator or learnable by it, since a verbal description of the options can turn a dominated action into a defensible time-risk trade-off when turns are scarce, (iv) estimate any frame effect over many independently generated wordings, treating the wording as the unit of replication, (v) report a floor effect explicitly as a non-test and not as a null, and (vi) vary the target statement and the valence separately, because a "gain" frame that names the goal bundles two manipulations.</w:t>
       </w:r>
     </w:p>
@@ -10750,7 +10735,21 @@
           <w:sz w:val="24"/>
           <w:szCs w:val="24"/>
         </w:rPr>
-        <w:t xml:space="preserve">Chen H, Liu Y, Shao J, Xu X, Sun Z, Hu W (2026) Polished but unresolved: Identifying late-stage pressure states in long-horizon tool-use agents. </w:t>
+        <w:t xml:space="preserve">Du Y (2025) Mitigating gambling-like risk-taking behaviors in large language models: A behavioral economics approach to AI safety. Preprint, arXiv:2506.22496.</w:t>
+      </w:r>
+    </w:p>
+    <w:p>
+      <w:pPr>
+        <w:spacing w:after="0" w:before="0" w:line="480"/>
+        <w:ind w:left="720" w:hanging="720"/>
+      </w:pPr>
+      <w:r>
+        <w:rPr>
+          <w:rFonts w:ascii="Times New Roman" w:cs="Times New Roman" w:eastAsia="Times New Roman" w:hAnsi="Times New Roman"/>
+          <w:sz w:val="24"/>
+          <w:szCs w:val="24"/>
+        </w:rPr>
+        <w:t xml:space="preserve">Eisenhardt KM (1989) Agency theory: An assessment and review. </w:t>
       </w:r>
       <w:r>
         <w:rPr>
@@ -10760,15 +10759,15 @@
           <w:sz w:val="24"/>
           <w:szCs w:val="24"/>
         </w:rPr>
-        <w:t xml:space="preserve">Proceedings of the 2026 Conference on Empirical Methods in Natural Language Processing</w:t>
-      </w:r>
-      <w:r>
-        <w:rPr>
-          <w:rFonts w:ascii="Times New Roman" w:cs="Times New Roman" w:eastAsia="Times New Roman" w:hAnsi="Times New Roman"/>
-          <w:sz w:val="24"/>
-          <w:szCs w:val="24"/>
-        </w:rPr>
-        <w:t xml:space="preserve"> (arXiv:2609.00823).</w:t>
+        <w:t xml:space="preserve">Academy of Management Review</w:t>
+      </w:r>
+      <w:r>
+        <w:rPr>
+          <w:rFonts w:ascii="Times New Roman" w:cs="Times New Roman" w:eastAsia="Times New Roman" w:hAnsi="Times New Roman"/>
+          <w:sz w:val="24"/>
+          <w:szCs w:val="24"/>
+        </w:rPr>
+        <w:t xml:space="preserve"> 14(1):57-74.</w:t>
       </w:r>
     </w:p>
     <w:p>
@@ -10782,7 +10781,25 @@
           <w:sz w:val="24"/>
           <w:szCs w:val="24"/>
         </w:rPr>
-        <w:t xml:space="preserve">Du Y (2025) Mitigating gambling-like risk-taking behaviors in large language models: A behavioral economics approach to AI safety. Preprint, arXiv:2506.22496.</w:t>
+        <w:t xml:space="preserve">Heath C, Larrick RP, Wu G (1999) Goals as reference points. </w:t>
+      </w:r>
+      <w:r>
+        <w:rPr>
+          <w:rFonts w:ascii="Times New Roman" w:cs="Times New Roman" w:eastAsia="Times New Roman" w:hAnsi="Times New Roman"/>
+          <w:i/>
+          <w:iCs/>
+          <w:sz w:val="24"/>
+          <w:szCs w:val="24"/>
+        </w:rPr>
+        <w:t xml:space="preserve">Cognitive Psychology</w:t>
+      </w:r>
+      <w:r>
+        <w:rPr>
+          <w:rFonts w:ascii="Times New Roman" w:cs="Times New Roman" w:eastAsia="Times New Roman" w:hAnsi="Times New Roman"/>
+          <w:sz w:val="24"/>
+          <w:szCs w:val="24"/>
+        </w:rPr>
+        <w:t xml:space="preserve"> 38(1):79-109.</w:t>
       </w:r>
     </w:p>
     <w:p>
@@ -10796,7 +10813,7 @@
           <w:sz w:val="24"/>
           <w:szCs w:val="24"/>
         </w:rPr>
-        <w:t xml:space="preserve">Eisenhardt KM (1989) Agency theory: An assessment and review. </w:t>
+        <w:t xml:space="preserve">Horton JJ (2023) Large language models as simulated economic agents: What can we learn from </w:t>
       </w:r>
       <w:r>
         <w:rPr>
@@ -10806,15 +10823,15 @@
           <w:sz w:val="24"/>
           <w:szCs w:val="24"/>
         </w:rPr>
-        <w:t xml:space="preserve">Academy of Management Review</w:t>
-      </w:r>
-      <w:r>
-        <w:rPr>
-          <w:rFonts w:ascii="Times New Roman" w:cs="Times New Roman" w:eastAsia="Times New Roman" w:hAnsi="Times New Roman"/>
-          <w:sz w:val="24"/>
-          <w:szCs w:val="24"/>
-        </w:rPr>
-        <w:t xml:space="preserve"> 14(1):57-74.</w:t>
+        <w:t xml:space="preserve">Homo silicus</w:t>
+      </w:r>
+      <w:r>
+        <w:rPr>
+          <w:rFonts w:ascii="Times New Roman" w:cs="Times New Roman" w:eastAsia="Times New Roman" w:hAnsi="Times New Roman"/>
+          <w:sz w:val="24"/>
+          <w:szCs w:val="24"/>
+        </w:rPr>
+        <w:t xml:space="preserve">? Preprint, arXiv:2301.07543.</w:t>
       </w:r>
     </w:p>
     <w:p>
@@ -10828,7 +10845,7 @@
           <w:sz w:val="24"/>
           <w:szCs w:val="24"/>
         </w:rPr>
-        <w:t xml:space="preserve">Heath C, Larrick RP, Wu G (1999) Goals as reference points. </w:t>
+        <w:t xml:space="preserve">Jensen MC, Meckling WH (1976) Theory of the firm: Managerial behavior, agency costs and ownership structure. </w:t>
       </w:r>
       <w:r>
         <w:rPr>
@@ -10838,15 +10855,15 @@
           <w:sz w:val="24"/>
           <w:szCs w:val="24"/>
         </w:rPr>
-        <w:t xml:space="preserve">Cognitive Psychology</w:t>
-      </w:r>
-      <w:r>
-        <w:rPr>
-          <w:rFonts w:ascii="Times New Roman" w:cs="Times New Roman" w:eastAsia="Times New Roman" w:hAnsi="Times New Roman"/>
-          <w:sz w:val="24"/>
-          <w:szCs w:val="24"/>
-        </w:rPr>
-        <w:t xml:space="preserve"> 38(1):79-109.</w:t>
+        <w:t xml:space="preserve">Journal of Financial Economics</w:t>
+      </w:r>
+      <w:r>
+        <w:rPr>
+          <w:rFonts w:ascii="Times New Roman" w:cs="Times New Roman" w:eastAsia="Times New Roman" w:hAnsi="Times New Roman"/>
+          <w:sz w:val="24"/>
+          <w:szCs w:val="24"/>
+        </w:rPr>
+        <w:t xml:space="preserve"> 3(4):305-360.</w:t>
       </w:r>
     </w:p>
     <w:p>
@@ -10860,7 +10877,7 @@
           <w:sz w:val="24"/>
           <w:szCs w:val="24"/>
         </w:rPr>
-        <w:t xml:space="preserve">Horton JJ (2023) Large language models as simulated economic agents: What can we learn from </w:t>
+        <w:t xml:space="preserve">Kahneman D, Tversky A (1979) Prospect theory: An analysis of decision under risk. </w:t>
       </w:r>
       <w:r>
         <w:rPr>
@@ -10870,15 +10887,15 @@
           <w:sz w:val="24"/>
           <w:szCs w:val="24"/>
         </w:rPr>
-        <w:t xml:space="preserve">Homo silicus</w:t>
-      </w:r>
-      <w:r>
-        <w:rPr>
-          <w:rFonts w:ascii="Times New Roman" w:cs="Times New Roman" w:eastAsia="Times New Roman" w:hAnsi="Times New Roman"/>
-          <w:sz w:val="24"/>
-          <w:szCs w:val="24"/>
-        </w:rPr>
-        <w:t xml:space="preserve">? Preprint, arXiv:2301.07543.</w:t>
+        <w:t xml:space="preserve">Econometrica</w:t>
+      </w:r>
+      <w:r>
+        <w:rPr>
+          <w:rFonts w:ascii="Times New Roman" w:cs="Times New Roman" w:eastAsia="Times New Roman" w:hAnsi="Times New Roman"/>
+          <w:sz w:val="24"/>
+          <w:szCs w:val="24"/>
+        </w:rPr>
+        <w:t xml:space="preserve"> 47(2):263-291.</w:t>
       </w:r>
     </w:p>
     <w:p>
@@ -10892,7 +10909,7 @@
           <w:sz w:val="24"/>
           <w:szCs w:val="24"/>
         </w:rPr>
-        <w:t xml:space="preserve">Jensen MC, Meckling WH (1976) Theory of the firm: Managerial behavior, agency costs and ownership structure. </w:t>
+        <w:t xml:space="preserve">Kellogg KC, Valentine MA, Christin A (2020) Algorithms at work: The new contested terrain of control. </w:t>
       </w:r>
       <w:r>
         <w:rPr>
@@ -10902,15 +10919,15 @@
           <w:sz w:val="24"/>
           <w:szCs w:val="24"/>
         </w:rPr>
-        <w:t xml:space="preserve">Journal of Financial Economics</w:t>
-      </w:r>
-      <w:r>
-        <w:rPr>
-          <w:rFonts w:ascii="Times New Roman" w:cs="Times New Roman" w:eastAsia="Times New Roman" w:hAnsi="Times New Roman"/>
-          <w:sz w:val="24"/>
-          <w:szCs w:val="24"/>
-        </w:rPr>
-        <w:t xml:space="preserve"> 3(4):305-360.</w:t>
+        <w:t xml:space="preserve">Academy of Management Annals</w:t>
+      </w:r>
+      <w:r>
+        <w:rPr>
+          <w:rFonts w:ascii="Times New Roman" w:cs="Times New Roman" w:eastAsia="Times New Roman" w:hAnsi="Times New Roman"/>
+          <w:sz w:val="24"/>
+          <w:szCs w:val="24"/>
+        </w:rPr>
+        <w:t xml:space="preserve"> 14(1):366-410.</w:t>
       </w:r>
     </w:p>
     <w:p>
@@ -10924,7 +10941,7 @@
           <w:sz w:val="24"/>
           <w:szCs w:val="24"/>
         </w:rPr>
-        <w:t xml:space="preserve">Jiang H, Tang K (2026) Why agents compromise safety under pressure. </w:t>
+        <w:t xml:space="preserve">Kivetz R, Urminsky O, Zheng Y (2006) The goal-gradient hypothesis resurrected: Purchase acceleration, illusionary goal progress, and customer retention. </w:t>
       </w:r>
       <w:r>
         <w:rPr>
@@ -10934,15 +10951,15 @@
           <w:sz w:val="24"/>
           <w:szCs w:val="24"/>
         </w:rPr>
-        <w:t xml:space="preserve">Findings of the Association for Computational Linguistics: ACL 2026</w:t>
-      </w:r>
-      <w:r>
-        <w:rPr>
-          <w:rFonts w:ascii="Times New Roman" w:cs="Times New Roman" w:eastAsia="Times New Roman" w:hAnsi="Times New Roman"/>
-          <w:sz w:val="24"/>
-          <w:szCs w:val="24"/>
-        </w:rPr>
-        <w:t xml:space="preserve"> (arXiv:2603.14975).</w:t>
+        <w:t xml:space="preserve">Journal of Marketing Research</w:t>
+      </w:r>
+      <w:r>
+        <w:rPr>
+          <w:rFonts w:ascii="Times New Roman" w:cs="Times New Roman" w:eastAsia="Times New Roman" w:hAnsi="Times New Roman"/>
+          <w:sz w:val="24"/>
+          <w:szCs w:val="24"/>
+        </w:rPr>
+        <w:t xml:space="preserve"> 43(1):39-58.</w:t>
       </w:r>
     </w:p>
     <w:p>
@@ -10956,7 +10973,7 @@
           <w:sz w:val="24"/>
           <w:szCs w:val="24"/>
         </w:rPr>
-        <w:t xml:space="preserve">Kahneman D, Tversky A (1979) Prospect theory: An analysis of decision under risk. </w:t>
+        <w:t xml:space="preserve">Locke EA, Latham GP (2002) Building a practically useful theory of goal setting and task motivation: A 35-year odyssey. </w:t>
       </w:r>
       <w:r>
         <w:rPr>
@@ -10966,15 +10983,15 @@
           <w:sz w:val="24"/>
           <w:szCs w:val="24"/>
         </w:rPr>
-        <w:t xml:space="preserve">Econometrica</w:t>
-      </w:r>
-      <w:r>
-        <w:rPr>
-          <w:rFonts w:ascii="Times New Roman" w:cs="Times New Roman" w:eastAsia="Times New Roman" w:hAnsi="Times New Roman"/>
-          <w:sz w:val="24"/>
-          <w:szCs w:val="24"/>
-        </w:rPr>
-        <w:t xml:space="preserve"> 47(2):263-291.</w:t>
+        <w:t xml:space="preserve">American Psychologist</w:t>
+      </w:r>
+      <w:r>
+        <w:rPr>
+          <w:rFonts w:ascii="Times New Roman" w:cs="Times New Roman" w:eastAsia="Times New Roman" w:hAnsi="Times New Roman"/>
+          <w:sz w:val="24"/>
+          <w:szCs w:val="24"/>
+        </w:rPr>
+        <w:t xml:space="preserve"> 57(9):705-717.</w:t>
       </w:r>
     </w:p>
     <w:p>
@@ -10988,7 +11005,7 @@
           <w:sz w:val="24"/>
           <w:szCs w:val="24"/>
         </w:rPr>
-        <w:t xml:space="preserve">Kellogg KC, Valentine MA, Christin A (2020) Algorithms at work: The new contested terrain of control. </w:t>
+        <w:t xml:space="preserve">Ordóñez LD, Schweitzer ME, Galinsky AD, Bazerman MH (2009) Goals gone wild: The systematic side effects of overprescribing goal setting. </w:t>
       </w:r>
       <w:r>
         <w:rPr>
@@ -10998,15 +11015,15 @@
           <w:sz w:val="24"/>
           <w:szCs w:val="24"/>
         </w:rPr>
-        <w:t xml:space="preserve">Academy of Management Annals</w:t>
-      </w:r>
-      <w:r>
-        <w:rPr>
-          <w:rFonts w:ascii="Times New Roman" w:cs="Times New Roman" w:eastAsia="Times New Roman" w:hAnsi="Times New Roman"/>
-          <w:sz w:val="24"/>
-          <w:szCs w:val="24"/>
-        </w:rPr>
-        <w:t xml:space="preserve"> 14(1):366-410.</w:t>
+        <w:t xml:space="preserve">Academy of Management Perspectives</w:t>
+      </w:r>
+      <w:r>
+        <w:rPr>
+          <w:rFonts w:ascii="Times New Roman" w:cs="Times New Roman" w:eastAsia="Times New Roman" w:hAnsi="Times New Roman"/>
+          <w:sz w:val="24"/>
+          <w:szCs w:val="24"/>
+        </w:rPr>
+        <w:t xml:space="preserve"> 23(1):6-16.</w:t>
       </w:r>
     </w:p>
     <w:p>
@@ -11020,7 +11037,7 @@
           <w:sz w:val="24"/>
           <w:szCs w:val="24"/>
         </w:rPr>
-        <w:t xml:space="preserve">Kivetz R, Urminsky O, Zheng Y (2006) The goal-gradient hypothesis resurrected: Purchase acceleration, illusionary goal progress, and customer retention. </w:t>
+        <w:t xml:space="preserve">Ouyang L, et al. (2022) Training language models to follow instructions with human feedback. </w:t>
       </w:r>
       <w:r>
         <w:rPr>
@@ -11030,15 +11047,15 @@
           <w:sz w:val="24"/>
           <w:szCs w:val="24"/>
         </w:rPr>
-        <w:t xml:space="preserve">Journal of Marketing Research</w:t>
-      </w:r>
-      <w:r>
-        <w:rPr>
-          <w:rFonts w:ascii="Times New Roman" w:cs="Times New Roman" w:eastAsia="Times New Roman" w:hAnsi="Times New Roman"/>
-          <w:sz w:val="24"/>
-          <w:szCs w:val="24"/>
-        </w:rPr>
-        <w:t xml:space="preserve"> 43(1):39-58.</w:t>
+        <w:t xml:space="preserve">Advances in Neural Information Processing Systems</w:t>
+      </w:r>
+      <w:r>
+        <w:rPr>
+          <w:rFonts w:ascii="Times New Roman" w:cs="Times New Roman" w:eastAsia="Times New Roman" w:hAnsi="Times New Roman"/>
+          <w:sz w:val="24"/>
+          <w:szCs w:val="24"/>
+        </w:rPr>
+        <w:t xml:space="preserve"> 35.</w:t>
       </w:r>
     </w:p>
     <w:p>
@@ -11052,7 +11069,7 @@
           <w:sz w:val="24"/>
           <w:szCs w:val="24"/>
         </w:rPr>
-        <w:t xml:space="preserve">Locke EA, Latham GP (2002) Building a practically useful theory of goal setting and task motivation: A 35-year odyssey. </w:t>
+        <w:t xml:space="preserve">Raisch S, Krakowski S (2021) Artificial intelligence and management: The automation-augmentation paradox. </w:t>
       </w:r>
       <w:r>
         <w:rPr>
@@ -11062,15 +11079,15 @@
           <w:sz w:val="24"/>
           <w:szCs w:val="24"/>
         </w:rPr>
-        <w:t xml:space="preserve">American Psychologist</w:t>
-      </w:r>
-      <w:r>
-        <w:rPr>
-          <w:rFonts w:ascii="Times New Roman" w:cs="Times New Roman" w:eastAsia="Times New Roman" w:hAnsi="Times New Roman"/>
-          <w:sz w:val="24"/>
-          <w:szCs w:val="24"/>
-        </w:rPr>
-        <w:t xml:space="preserve"> 57(9):705-717.</w:t>
+        <w:t xml:space="preserve">Academy of Management Review</w:t>
+      </w:r>
+      <w:r>
+        <w:rPr>
+          <w:rFonts w:ascii="Times New Roman" w:cs="Times New Roman" w:eastAsia="Times New Roman" w:hAnsi="Times New Roman"/>
+          <w:sz w:val="24"/>
+          <w:szCs w:val="24"/>
+        </w:rPr>
+        <w:t xml:space="preserve"> 46(1):192-210.</w:t>
       </w:r>
     </w:p>
     <w:p>
@@ -11084,7 +11101,21 @@
           <w:sz w:val="24"/>
           <w:szCs w:val="24"/>
         </w:rPr>
-        <w:t xml:space="preserve">Ordóñez LD, Schweitzer ME, Galinsky AD, Bazerman MH (2009) Goals gone wild: The systematic side effects of overprescribing goal setting. </w:t>
+        <w:t xml:space="preserve">Ross J, et al. (2024) LLM economicus? Mapping the behavioral biases of LLMs via utility theory. Preprint, arXiv:2408.02784.</w:t>
+      </w:r>
+    </w:p>
+    <w:p>
+      <w:pPr>
+        <w:spacing w:after="0" w:before="0" w:line="480"/>
+        <w:ind w:left="720" w:hanging="720"/>
+      </w:pPr>
+      <w:r>
+        <w:rPr>
+          <w:rFonts w:ascii="Times New Roman" w:cs="Times New Roman" w:eastAsia="Times New Roman" w:hAnsi="Times New Roman"/>
+          <w:sz w:val="24"/>
+          <w:szCs w:val="24"/>
+        </w:rPr>
+        <w:t xml:space="preserve">Samuelson W, Zeckhauser R (1988) Status quo bias in decision making. </w:t>
       </w:r>
       <w:r>
         <w:rPr>
@@ -11094,15 +11125,15 @@
           <w:sz w:val="24"/>
           <w:szCs w:val="24"/>
         </w:rPr>
-        <w:t xml:space="preserve">Academy of Management Perspectives</w:t>
-      </w:r>
-      <w:r>
-        <w:rPr>
-          <w:rFonts w:ascii="Times New Roman" w:cs="Times New Roman" w:eastAsia="Times New Roman" w:hAnsi="Times New Roman"/>
-          <w:sz w:val="24"/>
-          <w:szCs w:val="24"/>
-        </w:rPr>
-        <w:t xml:space="preserve"> 23(1):6-16.</w:t>
+        <w:t xml:space="preserve">Journal of Risk and Uncertainty</w:t>
+      </w:r>
+      <w:r>
+        <w:rPr>
+          <w:rFonts w:ascii="Times New Roman" w:cs="Times New Roman" w:eastAsia="Times New Roman" w:hAnsi="Times New Roman"/>
+          <w:sz w:val="24"/>
+          <w:szCs w:val="24"/>
+        </w:rPr>
+        <w:t xml:space="preserve"> 1:7-59.</w:t>
       </w:r>
     </w:p>
     <w:p>
@@ -11116,7 +11147,7 @@
           <w:sz w:val="24"/>
           <w:szCs w:val="24"/>
         </w:rPr>
-        <w:t xml:space="preserve">Ouyang L, et al. (2022) Training language models to follow instructions with human feedback. </w:t>
+        <w:t xml:space="preserve">Schweitzer ME, Ordóñez L, Douma B (2004) Goal setting as a motivator of unethical behavior. </w:t>
       </w:r>
       <w:r>
         <w:rPr>
@@ -11126,15 +11157,15 @@
           <w:sz w:val="24"/>
           <w:szCs w:val="24"/>
         </w:rPr>
-        <w:t xml:space="preserve">Advances in Neural Information Processing Systems</w:t>
-      </w:r>
-      <w:r>
-        <w:rPr>
-          <w:rFonts w:ascii="Times New Roman" w:cs="Times New Roman" w:eastAsia="Times New Roman" w:hAnsi="Times New Roman"/>
-          <w:sz w:val="24"/>
-          <w:szCs w:val="24"/>
-        </w:rPr>
-        <w:t xml:space="preserve"> 35.</w:t>
+        <w:t xml:space="preserve">Academy of Management Journal</w:t>
+      </w:r>
+      <w:r>
+        <w:rPr>
+          <w:rFonts w:ascii="Times New Roman" w:cs="Times New Roman" w:eastAsia="Times New Roman" w:hAnsi="Times New Roman"/>
+          <w:sz w:val="24"/>
+          <w:szCs w:val="24"/>
+        </w:rPr>
+        <w:t xml:space="preserve"> 47(3):422-432.</w:t>
       </w:r>
     </w:p>
     <w:p>
@@ -11148,7 +11179,25 @@
           <w:sz w:val="24"/>
           <w:szCs w:val="24"/>
         </w:rPr>
-        <w:t xml:space="preserve">Payne K (2025) An analysis of AI decision under risk: Prospect theory emerges in large language models. Preprint, arXiv:2508.00902.</w:t>
+        <w:t xml:space="preserve">Sculley D, et al. (2015) Hidden technical debt in machine learning systems. </w:t>
+      </w:r>
+      <w:r>
+        <w:rPr>
+          <w:rFonts w:ascii="Times New Roman" w:cs="Times New Roman" w:eastAsia="Times New Roman" w:hAnsi="Times New Roman"/>
+          <w:i/>
+          <w:iCs/>
+          <w:sz w:val="24"/>
+          <w:szCs w:val="24"/>
+        </w:rPr>
+        <w:t xml:space="preserve">Advances in Neural Information Processing Systems</w:t>
+      </w:r>
+      <w:r>
+        <w:rPr>
+          <w:rFonts w:ascii="Times New Roman" w:cs="Times New Roman" w:eastAsia="Times New Roman" w:hAnsi="Times New Roman"/>
+          <w:sz w:val="24"/>
+          <w:szCs w:val="24"/>
+        </w:rPr>
+        <w:t xml:space="preserve"> 28.</w:t>
       </w:r>
     </w:p>
     <w:p>
@@ -11162,7 +11211,7 @@
           <w:sz w:val="24"/>
           <w:szCs w:val="24"/>
         </w:rPr>
-        <w:t xml:space="preserve">Raisch S, Krakowski S (2021) Artificial intelligence and management: The automation-augmentation paradox. </w:t>
+        <w:t xml:space="preserve">Thaler RH, Johnson EJ (1990) Gambling with the house money and trying to break even: The effects of prior outcomes on risky choice. </w:t>
       </w:r>
       <w:r>
         <w:rPr>
@@ -11172,15 +11221,15 @@
           <w:sz w:val="24"/>
           <w:szCs w:val="24"/>
         </w:rPr>
-        <w:t xml:space="preserve">Academy of Management Review</w:t>
-      </w:r>
-      <w:r>
-        <w:rPr>
-          <w:rFonts w:ascii="Times New Roman" w:cs="Times New Roman" w:eastAsia="Times New Roman" w:hAnsi="Times New Roman"/>
-          <w:sz w:val="24"/>
-          <w:szCs w:val="24"/>
-        </w:rPr>
-        <w:t xml:space="preserve"> 46(1):192-210.</w:t>
+        <w:t xml:space="preserve">Management Science</w:t>
+      </w:r>
+      <w:r>
+        <w:rPr>
+          <w:rFonts w:ascii="Times New Roman" w:cs="Times New Roman" w:eastAsia="Times New Roman" w:hAnsi="Times New Roman"/>
+          <w:sz w:val="24"/>
+          <w:szCs w:val="24"/>
+        </w:rPr>
+        <w:t xml:space="preserve"> 36(6):643-660.</w:t>
       </w:r>
     </w:p>
     <w:p>
@@ -11194,35 +11243,7 @@
           <w:sz w:val="24"/>
           <w:szCs w:val="24"/>
         </w:rPr>
-        <w:t xml:space="preserve">Ross J, et al. (2024) LLM economicus? Mapping the behavioral biases of LLMs via utility theory. Preprint, arXiv:2408.02784.</w:t>
-      </w:r>
-    </w:p>
-    <w:p>
-      <w:pPr>
-        <w:spacing w:after="0" w:before="0" w:line="480"/>
-        <w:ind w:left="720" w:hanging="720"/>
-      </w:pPr>
-      <w:r>
-        <w:rPr>
-          <w:rFonts w:ascii="Times New Roman" w:cs="Times New Roman" w:eastAsia="Times New Roman" w:hAnsi="Times New Roman"/>
-          <w:sz w:val="24"/>
-          <w:szCs w:val="24"/>
-        </w:rPr>
-        <w:t xml:space="preserve">Saebo M, Gibson S, Crosse T, Menon A, Jang E, Cruz D (2026) Asymmetric goal drift in coding agents under value conflict. Preprint, arXiv:2603.03456.</w:t>
-      </w:r>
-    </w:p>
-    <w:p>
-      <w:pPr>
-        <w:spacing w:after="0" w:before="0" w:line="480"/>
-        <w:ind w:left="720" w:hanging="720"/>
-      </w:pPr>
-      <w:r>
-        <w:rPr>
-          <w:rFonts w:ascii="Times New Roman" w:cs="Times New Roman" w:eastAsia="Times New Roman" w:hAnsi="Times New Roman"/>
-          <w:sz w:val="24"/>
-          <w:szCs w:val="24"/>
-        </w:rPr>
-        <w:t xml:space="preserve">Samuelson W, Zeckhauser R (1988) Status quo bias in decision making. </w:t>
+        <w:t xml:space="preserve">Tversky A, Kahneman D (1981) The framing of decisions and the psychology of choice. </w:t>
       </w:r>
       <w:r>
         <w:rPr>
@@ -11232,148 +11253,6 @@
           <w:sz w:val="24"/>
           <w:szCs w:val="24"/>
         </w:rPr>
-        <w:t xml:space="preserve">Journal of Risk and Uncertainty</w:t>
-      </w:r>
-      <w:r>
-        <w:rPr>
-          <w:rFonts w:ascii="Times New Roman" w:cs="Times New Roman" w:eastAsia="Times New Roman" w:hAnsi="Times New Roman"/>
-          <w:sz w:val="24"/>
-          <w:szCs w:val="24"/>
-        </w:rPr>
-        <w:t xml:space="preserve"> 1:7-59.</w:t>
-      </w:r>
-    </w:p>
-    <w:p>
-      <w:pPr>
-        <w:spacing w:after="0" w:before="0" w:line="480"/>
-        <w:ind w:left="720" w:hanging="720"/>
-      </w:pPr>
-      <w:r>
-        <w:rPr>
-          <w:rFonts w:ascii="Times New Roman" w:cs="Times New Roman" w:eastAsia="Times New Roman" w:hAnsi="Times New Roman"/>
-          <w:sz w:val="24"/>
-          <w:szCs w:val="24"/>
-        </w:rPr>
-        <w:t xml:space="preserve">Scheurer J, Balesni M, Hobbhahn M (2023) Large language models can strategically deceive their users when put under pressure. Preprint, arXiv:2311.07590.</w:t>
-      </w:r>
-    </w:p>
-    <w:p>
-      <w:pPr>
-        <w:spacing w:after="0" w:before="0" w:line="480"/>
-        <w:ind w:left="720" w:hanging="720"/>
-      </w:pPr>
-      <w:r>
-        <w:rPr>
-          <w:rFonts w:ascii="Times New Roman" w:cs="Times New Roman" w:eastAsia="Times New Roman" w:hAnsi="Times New Roman"/>
-          <w:sz w:val="24"/>
-          <w:szCs w:val="24"/>
-        </w:rPr>
-        <w:t xml:space="preserve">Schweitzer ME, Ordóñez L, Douma B (2004) Goal setting as a motivator of unethical behavior. </w:t>
-      </w:r>
-      <w:r>
-        <w:rPr>
-          <w:rFonts w:ascii="Times New Roman" w:cs="Times New Roman" w:eastAsia="Times New Roman" w:hAnsi="Times New Roman"/>
-          <w:i/>
-          <w:iCs/>
-          <w:sz w:val="24"/>
-          <w:szCs w:val="24"/>
-        </w:rPr>
-        <w:t xml:space="preserve">Academy of Management Journal</w:t>
-      </w:r>
-      <w:r>
-        <w:rPr>
-          <w:rFonts w:ascii="Times New Roman" w:cs="Times New Roman" w:eastAsia="Times New Roman" w:hAnsi="Times New Roman"/>
-          <w:sz w:val="24"/>
-          <w:szCs w:val="24"/>
-        </w:rPr>
-        <w:t xml:space="preserve"> 47(3):422-432.</w:t>
-      </w:r>
-    </w:p>
-    <w:p>
-      <w:pPr>
-        <w:spacing w:after="0" w:before="0" w:line="480"/>
-        <w:ind w:left="720" w:hanging="720"/>
-      </w:pPr>
-      <w:r>
-        <w:rPr>
-          <w:rFonts w:ascii="Times New Roman" w:cs="Times New Roman" w:eastAsia="Times New Roman" w:hAnsi="Times New Roman"/>
-          <w:sz w:val="24"/>
-          <w:szCs w:val="24"/>
-        </w:rPr>
-        <w:t xml:space="preserve">Sculley D, et al. (2015) Hidden technical debt in machine learning systems. </w:t>
-      </w:r>
-      <w:r>
-        <w:rPr>
-          <w:rFonts w:ascii="Times New Roman" w:cs="Times New Roman" w:eastAsia="Times New Roman" w:hAnsi="Times New Roman"/>
-          <w:i/>
-          <w:iCs/>
-          <w:sz w:val="24"/>
-          <w:szCs w:val="24"/>
-        </w:rPr>
-        <w:t xml:space="preserve">Advances in Neural Information Processing Systems</w:t>
-      </w:r>
-      <w:r>
-        <w:rPr>
-          <w:rFonts w:ascii="Times New Roman" w:cs="Times New Roman" w:eastAsia="Times New Roman" w:hAnsi="Times New Roman"/>
-          <w:sz w:val="24"/>
-          <w:szCs w:val="24"/>
-        </w:rPr>
-        <w:t xml:space="preserve"> 28.</w:t>
-      </w:r>
-    </w:p>
-    <w:p>
-      <w:pPr>
-        <w:spacing w:after="0" w:before="0" w:line="480"/>
-        <w:ind w:left="720" w:hanging="720"/>
-      </w:pPr>
-      <w:r>
-        <w:rPr>
-          <w:rFonts w:ascii="Times New Roman" w:cs="Times New Roman" w:eastAsia="Times New Roman" w:hAnsi="Times New Roman"/>
-          <w:sz w:val="24"/>
-          <w:szCs w:val="24"/>
-        </w:rPr>
-        <w:t xml:space="preserve">Thaler RH, Johnson EJ (1990) Gambling with the house money and trying to break even: The effects of prior outcomes on risky choice. </w:t>
-      </w:r>
-      <w:r>
-        <w:rPr>
-          <w:rFonts w:ascii="Times New Roman" w:cs="Times New Roman" w:eastAsia="Times New Roman" w:hAnsi="Times New Roman"/>
-          <w:i/>
-          <w:iCs/>
-          <w:sz w:val="24"/>
-          <w:szCs w:val="24"/>
-        </w:rPr>
-        <w:t xml:space="preserve">Management Science</w:t>
-      </w:r>
-      <w:r>
-        <w:rPr>
-          <w:rFonts w:ascii="Times New Roman" w:cs="Times New Roman" w:eastAsia="Times New Roman" w:hAnsi="Times New Roman"/>
-          <w:sz w:val="24"/>
-          <w:szCs w:val="24"/>
-        </w:rPr>
-        <w:t xml:space="preserve"> 36(6):643-660.</w:t>
-      </w:r>
-    </w:p>
-    <w:p>
-      <w:pPr>
-        <w:spacing w:after="0" w:before="0" w:line="480"/>
-        <w:ind w:left="720" w:hanging="720"/>
-      </w:pPr>
-      <w:r>
-        <w:rPr>
-          <w:rFonts w:ascii="Times New Roman" w:cs="Times New Roman" w:eastAsia="Times New Roman" w:hAnsi="Times New Roman"/>
-          <w:sz w:val="24"/>
-          <w:szCs w:val="24"/>
-        </w:rPr>
-        <w:t xml:space="preserve">Tversky A, Kahneman D (1981) The framing of decisions and the psychology of choice. </w:t>
-      </w:r>
-      <w:r>
-        <w:rPr>
-          <w:rFonts w:ascii="Times New Roman" w:cs="Times New Roman" w:eastAsia="Times New Roman" w:hAnsi="Times New Roman"/>
-          <w:i/>
-          <w:iCs/>
-          <w:sz w:val="24"/>
-          <w:szCs w:val="24"/>
-        </w:rPr>
         <w:t xml:space="preserve">Science</w:t>
       </w:r>
       <w:r>
@@ -11383,34 +11262,6 @@
           <w:szCs w:val="24"/>
         </w:rPr>
         <w:t xml:space="preserve"> 211(4481):453-458.</w:t>
-      </w:r>
-    </w:p>
-    <w:p>
-      <w:pPr>
-        <w:spacing w:after="0" w:before="0" w:line="480"/>
-        <w:ind w:left="720" w:hanging="720"/>
-      </w:pPr>
-      <w:r>
-        <w:rPr>
-          <w:rFonts w:ascii="Times New Roman" w:cs="Times New Roman" w:eastAsia="Times New Roman" w:hAnsi="Times New Roman"/>
-          <w:sz w:val="24"/>
-          <w:szCs w:val="24"/>
-        </w:rPr>
-        <w:t xml:space="preserve">Wang Z, Zhang Z (2026) Framing effects in independent-agent large language models: A cross-family behavioral analysis. Preprint, arXiv:2603.19282.</w:t>
-      </w:r>
-    </w:p>
-    <w:p>
-      <w:pPr>
-        <w:spacing w:after="0" w:before="0" w:line="480"/>
-        <w:ind w:left="720" w:hanging="720"/>
-      </w:pPr>
-      <w:r>
-        <w:rPr>
-          <w:rFonts w:ascii="Times New Roman" w:cs="Times New Roman" w:eastAsia="Times New Roman" w:hAnsi="Times New Roman"/>
-          <w:sz w:val="24"/>
-          <w:szCs w:val="24"/>
-        </w:rPr>
-        <w:t xml:space="preserve">Xu X, Wu W (2026) Low reasoning effort is enough for routine office work by language-model agents. Preprint, arXiv:2608.03169.</w:t>
       </w:r>
     </w:p>
     <w:p>

</xml_diff>

<commit_message>
manuscript: restore related-work citations (agents under pressure, framing)
Co-Authored-By: Claude Sonnet 5.5 <noreply@anthropic.com>
Claude-Session: https://claude.ai/code/session_013HycsBHnRQDCEHKmLM3Rd4
</commit_message>
<xml_diff>
--- a/loss_chasing/isr/ISR_manuscript_v2.docx
+++ b/loss_chasing/isr/ISR_manuscript_v2.docx
@@ -368,7 +368,7 @@
           <w:sz w:val="24"/>
           <w:szCs w:val="24"/>
         </w:rPr>
-        <w:t xml:space="preserve"> nor faithful replicas of human participants; they report weaker loss aversion than in human samples, steeper time discounting, and inconsistency when the framing of a task changes. Bini et al. (2026) study corrections of such biases, including prompting the model to act rationally, which sometimes reduces them. Du (2025) documents gambling-like risk taking in generation tasks. These studies mostly examine one-shot allocation or risk choices. Training that aligns models to follow instructions (Ouyang et al. 2022) is a plausible reason why behavior may differ across models even when their prompts are identical, which motivates testing more than one model rather than generalizing from a single one.</w:t>
+        <w:t xml:space="preserve"> nor faithful replicas of human participants; they report weaker loss aversion than in human samples, steeper time discounting, and inconsistency when the framing of a task changes. Bini et al. (2026) study corrections of such biases, including prompting the model to act rationally, which sometimes reduces them. Du (2025) documents gambling-like risk taking in generation tasks. Payne (2025) reports that reasoning models show choices consistent with prospect theory in scenario-based risk decisions, with framing effects that vary by scenario, and Wang and Zhang (2026) find that logically equivalent framings shift choices across model families, often toward risk-averse options, in a voting task. These studies mostly examine one-shot allocation or risk choices. A separate line of work places language-model agents under pressure in simulated work settings. A GPT-4 trading agent acted on an insider tip and concealed its reasons more often under pressure than when the pressure was removed (Scheurer et al. 2023). Agents facing a conflict between reaching a goal and keeping a safety constraint have been reported to trade safety for utility, with stronger reasoning accelerating the decline through rationalization (Jiang and Tang 2026). Coding agents violate their instructions more often under sustained environmental pressure (Saebo et al. 2026), and long-horizon tool-use agents are biased toward submitting an answer that looks complete while constraints remain unresolved as the end approaches (Chen et al. 2026). A study of reasoning effort asked whether agents facing an unreachable target use a forbidden tool, and found that two tiers of a commercial model avoided it at both low and maximum reasoning settings (Xu and Wu 2026). Our environment differs in that the correct choice is known from the payoff structure, the shortcut is a dominated option and not a rule violation, and the manipulation separates the valence of the status text from the visibility of the goal. Training that aligns models to follow instructions (Ouyang et al. 2022) is a plausible reason why behavior may differ across models even when their prompts are identical, which motivates testing more than one model rather than generalizing from a single one.</w:t>
       </w:r>
     </w:p>
     <w:p>
@@ -10551,6 +10551,21 @@
           <w:sz w:val="24"/>
           <w:szCs w:val="24"/>
         </w:rPr>
+        <w:t xml:space="preserve">Our reasoning result sits beside work reporting the opposite pattern. Jiang and Tang (2026) find that stronger reasoning makes agents more likely to trade safety for utility under pressure, whereas we find less skipping with reasoning in the fast model and none in the larger tiers. The two need not conflict. Their setting makes compliance infeasible and sets a rule against a goal, whereas in ours the verified options remain feasible and the shortcut is a dominated option, so deliberation can favor the verified route. We cannot tell which feature of the settings accounts for the difference, and a design that varies both within one environment would be needed to say.</w:t>
+      </w:r>
+    </w:p>
+    <w:p>
+      <w:pPr>
+        <w:spacing w:after="0" w:before="0" w:line="480"/>
+        <w:ind w:firstLine="720"/>
+        <w:jc w:val="left"/>
+      </w:pPr>
+      <w:r>
+        <w:rPr>
+          <w:rFonts w:ascii="Times New Roman" w:cs="Times New Roman" w:eastAsia="Times New Roman" w:hAnsi="Times New Roman"/>
+          <w:sz w:val="24"/>
+          <w:szCs w:val="24"/>
+        </w:rPr>
         <w:t xml:space="preserve">We also contribute a measurement argument. In environments where a recovery option has positive expected value after a loss, the intuitive escalation test, "does the risk index rise after failures?", is confounded by the normative benchmark: the rational operator lowers it, so the test rewards the wrong behavior in both directions. We recommend that evaluations of this kind (i) compute the expected-value-maximizing action in every state and report excess risk over it, (ii) require the inferior high-risk action, here test-skipping, to rise before calling a pattern loss chasing, (iii) check that the dominance of the inferior action is visible to the operator or learnable by it, since a verbal description of the options can turn a dominated action into a defensible time-risk trade-off when turns are scarce, (iv) estimate any frame effect over many independently generated wordings, treating the wording as the unit of replication, (v) report a floor effect explicitly as a non-test and not as a null, and (vi) vary the target statement and the valence separately, because a "gain" frame that names the goal bundles two manipulations.</w:t>
       </w:r>
     </w:p>
@@ -10735,7 +10750,25 @@
           <w:sz w:val="24"/>
           <w:szCs w:val="24"/>
         </w:rPr>
-        <w:t xml:space="preserve">Du Y (2025) Mitigating gambling-like risk-taking behaviors in large language models: A behavioral economics approach to AI safety. Preprint, arXiv:2506.22496.</w:t>
+        <w:t xml:space="preserve">Chen H, Liu Y, Shao J, Xu X, Sun Z, Hu W (2026) Polished but unresolved: Identifying late-stage pressure states in long-horizon tool-use agents. </w:t>
+      </w:r>
+      <w:r>
+        <w:rPr>
+          <w:rFonts w:ascii="Times New Roman" w:cs="Times New Roman" w:eastAsia="Times New Roman" w:hAnsi="Times New Roman"/>
+          <w:i/>
+          <w:iCs/>
+          <w:sz w:val="24"/>
+          <w:szCs w:val="24"/>
+        </w:rPr>
+        <w:t xml:space="preserve">Proceedings of the 2026 Conference on Empirical Methods in Natural Language Processing</w:t>
+      </w:r>
+      <w:r>
+        <w:rPr>
+          <w:rFonts w:ascii="Times New Roman" w:cs="Times New Roman" w:eastAsia="Times New Roman" w:hAnsi="Times New Roman"/>
+          <w:sz w:val="24"/>
+          <w:szCs w:val="24"/>
+        </w:rPr>
+        <w:t xml:space="preserve"> (arXiv:2609.00823).</w:t>
       </w:r>
     </w:p>
     <w:p>
@@ -10749,6 +10782,20 @@
           <w:sz w:val="24"/>
           <w:szCs w:val="24"/>
         </w:rPr>
+        <w:t xml:space="preserve">Du Y (2025) Mitigating gambling-like risk-taking behaviors in large language models: A behavioral economics approach to AI safety. Preprint, arXiv:2506.22496.</w:t>
+      </w:r>
+    </w:p>
+    <w:p>
+      <w:pPr>
+        <w:spacing w:after="0" w:before="0" w:line="480"/>
+        <w:ind w:left="720" w:hanging="720"/>
+      </w:pPr>
+      <w:r>
+        <w:rPr>
+          <w:rFonts w:ascii="Times New Roman" w:cs="Times New Roman" w:eastAsia="Times New Roman" w:hAnsi="Times New Roman"/>
+          <w:sz w:val="24"/>
+          <w:szCs w:val="24"/>
+        </w:rPr>
         <w:t xml:space="preserve">Eisenhardt KM (1989) Agency theory: An assessment and review. </w:t>
       </w:r>
       <w:r>
@@ -10877,7 +10924,7 @@
           <w:sz w:val="24"/>
           <w:szCs w:val="24"/>
         </w:rPr>
-        <w:t xml:space="preserve">Kahneman D, Tversky A (1979) Prospect theory: An analysis of decision under risk. </w:t>
+        <w:t xml:space="preserve">Jiang H, Tang K (2026) Why agents compromise safety under pressure. </w:t>
       </w:r>
       <w:r>
         <w:rPr>
@@ -10887,15 +10934,15 @@
           <w:sz w:val="24"/>
           <w:szCs w:val="24"/>
         </w:rPr>
-        <w:t xml:space="preserve">Econometrica</w:t>
-      </w:r>
-      <w:r>
-        <w:rPr>
-          <w:rFonts w:ascii="Times New Roman" w:cs="Times New Roman" w:eastAsia="Times New Roman" w:hAnsi="Times New Roman"/>
-          <w:sz w:val="24"/>
-          <w:szCs w:val="24"/>
-        </w:rPr>
-        <w:t xml:space="preserve"> 47(2):263-291.</w:t>
+        <w:t xml:space="preserve">Findings of the Association for Computational Linguistics: ACL 2026</w:t>
+      </w:r>
+      <w:r>
+        <w:rPr>
+          <w:rFonts w:ascii="Times New Roman" w:cs="Times New Roman" w:eastAsia="Times New Roman" w:hAnsi="Times New Roman"/>
+          <w:sz w:val="24"/>
+          <w:szCs w:val="24"/>
+        </w:rPr>
+        <w:t xml:space="preserve"> (arXiv:2603.14975).</w:t>
       </w:r>
     </w:p>
     <w:p>
@@ -10909,7 +10956,7 @@
           <w:sz w:val="24"/>
           <w:szCs w:val="24"/>
         </w:rPr>
-        <w:t xml:space="preserve">Kellogg KC, Valentine MA, Christin A (2020) Algorithms at work: The new contested terrain of control. </w:t>
+        <w:t xml:space="preserve">Kahneman D, Tversky A (1979) Prospect theory: An analysis of decision under risk. </w:t>
       </w:r>
       <w:r>
         <w:rPr>
@@ -10919,15 +10966,15 @@
           <w:sz w:val="24"/>
           <w:szCs w:val="24"/>
         </w:rPr>
-        <w:t xml:space="preserve">Academy of Management Annals</w:t>
-      </w:r>
-      <w:r>
-        <w:rPr>
-          <w:rFonts w:ascii="Times New Roman" w:cs="Times New Roman" w:eastAsia="Times New Roman" w:hAnsi="Times New Roman"/>
-          <w:sz w:val="24"/>
-          <w:szCs w:val="24"/>
-        </w:rPr>
-        <w:t xml:space="preserve"> 14(1):366-410.</w:t>
+        <w:t xml:space="preserve">Econometrica</w:t>
+      </w:r>
+      <w:r>
+        <w:rPr>
+          <w:rFonts w:ascii="Times New Roman" w:cs="Times New Roman" w:eastAsia="Times New Roman" w:hAnsi="Times New Roman"/>
+          <w:sz w:val="24"/>
+          <w:szCs w:val="24"/>
+        </w:rPr>
+        <w:t xml:space="preserve"> 47(2):263-291.</w:t>
       </w:r>
     </w:p>
     <w:p>
@@ -10941,7 +10988,7 @@
           <w:sz w:val="24"/>
           <w:szCs w:val="24"/>
         </w:rPr>
-        <w:t xml:space="preserve">Kivetz R, Urminsky O, Zheng Y (2006) The goal-gradient hypothesis resurrected: Purchase acceleration, illusionary goal progress, and customer retention. </w:t>
+        <w:t xml:space="preserve">Kellogg KC, Valentine MA, Christin A (2020) Algorithms at work: The new contested terrain of control. </w:t>
       </w:r>
       <w:r>
         <w:rPr>
@@ -10951,15 +10998,15 @@
           <w:sz w:val="24"/>
           <w:szCs w:val="24"/>
         </w:rPr>
-        <w:t xml:space="preserve">Journal of Marketing Research</w:t>
-      </w:r>
-      <w:r>
-        <w:rPr>
-          <w:rFonts w:ascii="Times New Roman" w:cs="Times New Roman" w:eastAsia="Times New Roman" w:hAnsi="Times New Roman"/>
-          <w:sz w:val="24"/>
-          <w:szCs w:val="24"/>
-        </w:rPr>
-        <w:t xml:space="preserve"> 43(1):39-58.</w:t>
+        <w:t xml:space="preserve">Academy of Management Annals</w:t>
+      </w:r>
+      <w:r>
+        <w:rPr>
+          <w:rFonts w:ascii="Times New Roman" w:cs="Times New Roman" w:eastAsia="Times New Roman" w:hAnsi="Times New Roman"/>
+          <w:sz w:val="24"/>
+          <w:szCs w:val="24"/>
+        </w:rPr>
+        <w:t xml:space="preserve"> 14(1):366-410.</w:t>
       </w:r>
     </w:p>
     <w:p>
@@ -10973,7 +11020,7 @@
           <w:sz w:val="24"/>
           <w:szCs w:val="24"/>
         </w:rPr>
-        <w:t xml:space="preserve">Locke EA, Latham GP (2002) Building a practically useful theory of goal setting and task motivation: A 35-year odyssey. </w:t>
+        <w:t xml:space="preserve">Kivetz R, Urminsky O, Zheng Y (2006) The goal-gradient hypothesis resurrected: Purchase acceleration, illusionary goal progress, and customer retention. </w:t>
       </w:r>
       <w:r>
         <w:rPr>
@@ -10983,15 +11030,15 @@
           <w:sz w:val="24"/>
           <w:szCs w:val="24"/>
         </w:rPr>
-        <w:t xml:space="preserve">American Psychologist</w:t>
-      </w:r>
-      <w:r>
-        <w:rPr>
-          <w:rFonts w:ascii="Times New Roman" w:cs="Times New Roman" w:eastAsia="Times New Roman" w:hAnsi="Times New Roman"/>
-          <w:sz w:val="24"/>
-          <w:szCs w:val="24"/>
-        </w:rPr>
-        <w:t xml:space="preserve"> 57(9):705-717.</w:t>
+        <w:t xml:space="preserve">Journal of Marketing Research</w:t>
+      </w:r>
+      <w:r>
+        <w:rPr>
+          <w:rFonts w:ascii="Times New Roman" w:cs="Times New Roman" w:eastAsia="Times New Roman" w:hAnsi="Times New Roman"/>
+          <w:sz w:val="24"/>
+          <w:szCs w:val="24"/>
+        </w:rPr>
+        <w:t xml:space="preserve"> 43(1):39-58.</w:t>
       </w:r>
     </w:p>
     <w:p>
@@ -11005,7 +11052,7 @@
           <w:sz w:val="24"/>
           <w:szCs w:val="24"/>
         </w:rPr>
-        <w:t xml:space="preserve">Ordóñez LD, Schweitzer ME, Galinsky AD, Bazerman MH (2009) Goals gone wild: The systematic side effects of overprescribing goal setting. </w:t>
+        <w:t xml:space="preserve">Locke EA, Latham GP (2002) Building a practically useful theory of goal setting and task motivation: A 35-year odyssey. </w:t>
       </w:r>
       <w:r>
         <w:rPr>
@@ -11015,15 +11062,15 @@
           <w:sz w:val="24"/>
           <w:szCs w:val="24"/>
         </w:rPr>
-        <w:t xml:space="preserve">Academy of Management Perspectives</w:t>
-      </w:r>
-      <w:r>
-        <w:rPr>
-          <w:rFonts w:ascii="Times New Roman" w:cs="Times New Roman" w:eastAsia="Times New Roman" w:hAnsi="Times New Roman"/>
-          <w:sz w:val="24"/>
-          <w:szCs w:val="24"/>
-        </w:rPr>
-        <w:t xml:space="preserve"> 23(1):6-16.</w:t>
+        <w:t xml:space="preserve">American Psychologist</w:t>
+      </w:r>
+      <w:r>
+        <w:rPr>
+          <w:rFonts w:ascii="Times New Roman" w:cs="Times New Roman" w:eastAsia="Times New Roman" w:hAnsi="Times New Roman"/>
+          <w:sz w:val="24"/>
+          <w:szCs w:val="24"/>
+        </w:rPr>
+        <w:t xml:space="preserve"> 57(9):705-717.</w:t>
       </w:r>
     </w:p>
     <w:p>
@@ -11037,7 +11084,7 @@
           <w:sz w:val="24"/>
           <w:szCs w:val="24"/>
         </w:rPr>
-        <w:t xml:space="preserve">Ouyang L, et al. (2022) Training language models to follow instructions with human feedback. </w:t>
+        <w:t xml:space="preserve">Ordóñez LD, Schweitzer ME, Galinsky AD, Bazerman MH (2009) Goals gone wild: The systematic side effects of overprescribing goal setting. </w:t>
       </w:r>
       <w:r>
         <w:rPr>
@@ -11047,15 +11094,15 @@
           <w:sz w:val="24"/>
           <w:szCs w:val="24"/>
         </w:rPr>
-        <w:t xml:space="preserve">Advances in Neural Information Processing Systems</w:t>
-      </w:r>
-      <w:r>
-        <w:rPr>
-          <w:rFonts w:ascii="Times New Roman" w:cs="Times New Roman" w:eastAsia="Times New Roman" w:hAnsi="Times New Roman"/>
-          <w:sz w:val="24"/>
-          <w:szCs w:val="24"/>
-        </w:rPr>
-        <w:t xml:space="preserve"> 35.</w:t>
+        <w:t xml:space="preserve">Academy of Management Perspectives</w:t>
+      </w:r>
+      <w:r>
+        <w:rPr>
+          <w:rFonts w:ascii="Times New Roman" w:cs="Times New Roman" w:eastAsia="Times New Roman" w:hAnsi="Times New Roman"/>
+          <w:sz w:val="24"/>
+          <w:szCs w:val="24"/>
+        </w:rPr>
+        <w:t xml:space="preserve"> 23(1):6-16.</w:t>
       </w:r>
     </w:p>
     <w:p>
@@ -11069,7 +11116,7 @@
           <w:sz w:val="24"/>
           <w:szCs w:val="24"/>
         </w:rPr>
-        <w:t xml:space="preserve">Raisch S, Krakowski S (2021) Artificial intelligence and management: The automation-augmentation paradox. </w:t>
+        <w:t xml:space="preserve">Ouyang L, et al. (2022) Training language models to follow instructions with human feedback. </w:t>
       </w:r>
       <w:r>
         <w:rPr>
@@ -11079,15 +11126,15 @@
           <w:sz w:val="24"/>
           <w:szCs w:val="24"/>
         </w:rPr>
-        <w:t xml:space="preserve">Academy of Management Review</w:t>
-      </w:r>
-      <w:r>
-        <w:rPr>
-          <w:rFonts w:ascii="Times New Roman" w:cs="Times New Roman" w:eastAsia="Times New Roman" w:hAnsi="Times New Roman"/>
-          <w:sz w:val="24"/>
-          <w:szCs w:val="24"/>
-        </w:rPr>
-        <w:t xml:space="preserve"> 46(1):192-210.</w:t>
+        <w:t xml:space="preserve">Advances in Neural Information Processing Systems</w:t>
+      </w:r>
+      <w:r>
+        <w:rPr>
+          <w:rFonts w:ascii="Times New Roman" w:cs="Times New Roman" w:eastAsia="Times New Roman" w:hAnsi="Times New Roman"/>
+          <w:sz w:val="24"/>
+          <w:szCs w:val="24"/>
+        </w:rPr>
+        <w:t xml:space="preserve"> 35.</w:t>
       </w:r>
     </w:p>
     <w:p>
@@ -11101,7 +11148,7 @@
           <w:sz w:val="24"/>
           <w:szCs w:val="24"/>
         </w:rPr>
-        <w:t xml:space="preserve">Ross J, et al. (2024) LLM economicus? Mapping the behavioral biases of LLMs via utility theory. Preprint, arXiv:2408.02784.</w:t>
+        <w:t xml:space="preserve">Payne K (2025) An analysis of AI decision under risk: Prospect theory emerges in large language models. Preprint, arXiv:2508.00902.</w:t>
       </w:r>
     </w:p>
     <w:p>
@@ -11115,7 +11162,7 @@
           <w:sz w:val="24"/>
           <w:szCs w:val="24"/>
         </w:rPr>
-        <w:t xml:space="preserve">Samuelson W, Zeckhauser R (1988) Status quo bias in decision making. </w:t>
+        <w:t xml:space="preserve">Raisch S, Krakowski S (2021) Artificial intelligence and management: The automation-augmentation paradox. </w:t>
       </w:r>
       <w:r>
         <w:rPr>
@@ -11125,15 +11172,15 @@
           <w:sz w:val="24"/>
           <w:szCs w:val="24"/>
         </w:rPr>
-        <w:t xml:space="preserve">Journal of Risk and Uncertainty</w:t>
-      </w:r>
-      <w:r>
-        <w:rPr>
-          <w:rFonts w:ascii="Times New Roman" w:cs="Times New Roman" w:eastAsia="Times New Roman" w:hAnsi="Times New Roman"/>
-          <w:sz w:val="24"/>
-          <w:szCs w:val="24"/>
-        </w:rPr>
-        <w:t xml:space="preserve"> 1:7-59.</w:t>
+        <w:t xml:space="preserve">Academy of Management Review</w:t>
+      </w:r>
+      <w:r>
+        <w:rPr>
+          <w:rFonts w:ascii="Times New Roman" w:cs="Times New Roman" w:eastAsia="Times New Roman" w:hAnsi="Times New Roman"/>
+          <w:sz w:val="24"/>
+          <w:szCs w:val="24"/>
+        </w:rPr>
+        <w:t xml:space="preserve"> 46(1):192-210.</w:t>
       </w:r>
     </w:p>
     <w:p>
@@ -11147,7 +11194,35 @@
           <w:sz w:val="24"/>
           <w:szCs w:val="24"/>
         </w:rPr>
-        <w:t xml:space="preserve">Schweitzer ME, Ordóñez L, Douma B (2004) Goal setting as a motivator of unethical behavior. </w:t>
+        <w:t xml:space="preserve">Ross J, et al. (2024) LLM economicus? Mapping the behavioral biases of LLMs via utility theory. Preprint, arXiv:2408.02784.</w:t>
+      </w:r>
+    </w:p>
+    <w:p>
+      <w:pPr>
+        <w:spacing w:after="0" w:before="0" w:line="480"/>
+        <w:ind w:left="720" w:hanging="720"/>
+      </w:pPr>
+      <w:r>
+        <w:rPr>
+          <w:rFonts w:ascii="Times New Roman" w:cs="Times New Roman" w:eastAsia="Times New Roman" w:hAnsi="Times New Roman"/>
+          <w:sz w:val="24"/>
+          <w:szCs w:val="24"/>
+        </w:rPr>
+        <w:t xml:space="preserve">Saebo M, Gibson S, Crosse T, Menon A, Jang E, Cruz D (2026) Asymmetric goal drift in coding agents under value conflict. Preprint, arXiv:2603.03456.</w:t>
+      </w:r>
+    </w:p>
+    <w:p>
+      <w:pPr>
+        <w:spacing w:after="0" w:before="0" w:line="480"/>
+        <w:ind w:left="720" w:hanging="720"/>
+      </w:pPr>
+      <w:r>
+        <w:rPr>
+          <w:rFonts w:ascii="Times New Roman" w:cs="Times New Roman" w:eastAsia="Times New Roman" w:hAnsi="Times New Roman"/>
+          <w:sz w:val="24"/>
+          <w:szCs w:val="24"/>
+        </w:rPr>
+        <w:t xml:space="preserve">Samuelson W, Zeckhauser R (1988) Status quo bias in decision making. </w:t>
       </w:r>
       <w:r>
         <w:rPr>
@@ -11157,15 +11232,15 @@
           <w:sz w:val="24"/>
           <w:szCs w:val="24"/>
         </w:rPr>
-        <w:t xml:space="preserve">Academy of Management Journal</w:t>
-      </w:r>
-      <w:r>
-        <w:rPr>
-          <w:rFonts w:ascii="Times New Roman" w:cs="Times New Roman" w:eastAsia="Times New Roman" w:hAnsi="Times New Roman"/>
-          <w:sz w:val="24"/>
-          <w:szCs w:val="24"/>
-        </w:rPr>
-        <w:t xml:space="preserve"> 47(3):422-432.</w:t>
+        <w:t xml:space="preserve">Journal of Risk and Uncertainty</w:t>
+      </w:r>
+      <w:r>
+        <w:rPr>
+          <w:rFonts w:ascii="Times New Roman" w:cs="Times New Roman" w:eastAsia="Times New Roman" w:hAnsi="Times New Roman"/>
+          <w:sz w:val="24"/>
+          <w:szCs w:val="24"/>
+        </w:rPr>
+        <w:t xml:space="preserve"> 1:7-59.</w:t>
       </w:r>
     </w:p>
     <w:p>
@@ -11179,7 +11254,21 @@
           <w:sz w:val="24"/>
           <w:szCs w:val="24"/>
         </w:rPr>
-        <w:t xml:space="preserve">Sculley D, et al. (2015) Hidden technical debt in machine learning systems. </w:t>
+        <w:t xml:space="preserve">Scheurer J, Balesni M, Hobbhahn M (2023) Large language models can strategically deceive their users when put under pressure. Preprint, arXiv:2311.07590.</w:t>
+      </w:r>
+    </w:p>
+    <w:p>
+      <w:pPr>
+        <w:spacing w:after="0" w:before="0" w:line="480"/>
+        <w:ind w:left="720" w:hanging="720"/>
+      </w:pPr>
+      <w:r>
+        <w:rPr>
+          <w:rFonts w:ascii="Times New Roman" w:cs="Times New Roman" w:eastAsia="Times New Roman" w:hAnsi="Times New Roman"/>
+          <w:sz w:val="24"/>
+          <w:szCs w:val="24"/>
+        </w:rPr>
+        <w:t xml:space="preserve">Schweitzer ME, Ordóñez L, Douma B (2004) Goal setting as a motivator of unethical behavior. </w:t>
       </w:r>
       <w:r>
         <w:rPr>
@@ -11189,15 +11278,15 @@
           <w:sz w:val="24"/>
           <w:szCs w:val="24"/>
         </w:rPr>
-        <w:t xml:space="preserve">Advances in Neural Information Processing Systems</w:t>
-      </w:r>
-      <w:r>
-        <w:rPr>
-          <w:rFonts w:ascii="Times New Roman" w:cs="Times New Roman" w:eastAsia="Times New Roman" w:hAnsi="Times New Roman"/>
-          <w:sz w:val="24"/>
-          <w:szCs w:val="24"/>
-        </w:rPr>
-        <w:t xml:space="preserve"> 28.</w:t>
+        <w:t xml:space="preserve">Academy of Management Journal</w:t>
+      </w:r>
+      <w:r>
+        <w:rPr>
+          <w:rFonts w:ascii="Times New Roman" w:cs="Times New Roman" w:eastAsia="Times New Roman" w:hAnsi="Times New Roman"/>
+          <w:sz w:val="24"/>
+          <w:szCs w:val="24"/>
+        </w:rPr>
+        <w:t xml:space="preserve"> 47(3):422-432.</w:t>
       </w:r>
     </w:p>
     <w:p>
@@ -11211,7 +11300,7 @@
           <w:sz w:val="24"/>
           <w:szCs w:val="24"/>
         </w:rPr>
-        <w:t xml:space="preserve">Thaler RH, Johnson EJ (1990) Gambling with the house money and trying to break even: The effects of prior outcomes on risky choice. </w:t>
+        <w:t xml:space="preserve">Sculley D, et al. (2015) Hidden technical debt in machine learning systems. </w:t>
       </w:r>
       <w:r>
         <w:rPr>
@@ -11221,15 +11310,15 @@
           <w:sz w:val="24"/>
           <w:szCs w:val="24"/>
         </w:rPr>
-        <w:t xml:space="preserve">Management Science</w:t>
-      </w:r>
-      <w:r>
-        <w:rPr>
-          <w:rFonts w:ascii="Times New Roman" w:cs="Times New Roman" w:eastAsia="Times New Roman" w:hAnsi="Times New Roman"/>
-          <w:sz w:val="24"/>
-          <w:szCs w:val="24"/>
-        </w:rPr>
-        <w:t xml:space="preserve"> 36(6):643-660.</w:t>
+        <w:t xml:space="preserve">Advances in Neural Information Processing Systems</w:t>
+      </w:r>
+      <w:r>
+        <w:rPr>
+          <w:rFonts w:ascii="Times New Roman" w:cs="Times New Roman" w:eastAsia="Times New Roman" w:hAnsi="Times New Roman"/>
+          <w:sz w:val="24"/>
+          <w:szCs w:val="24"/>
+        </w:rPr>
+        <w:t xml:space="preserve"> 28.</w:t>
       </w:r>
     </w:p>
     <w:p>
@@ -11243,7 +11332,7 @@
           <w:sz w:val="24"/>
           <w:szCs w:val="24"/>
         </w:rPr>
-        <w:t xml:space="preserve">Tversky A, Kahneman D (1981) The framing of decisions and the psychology of choice. </w:t>
+        <w:t xml:space="preserve">Thaler RH, Johnson EJ (1990) Gambling with the house money and trying to break even: The effects of prior outcomes on risky choice. </w:t>
       </w:r>
       <w:r>
         <w:rPr>
@@ -11253,6 +11342,38 @@
           <w:sz w:val="24"/>
           <w:szCs w:val="24"/>
         </w:rPr>
+        <w:t xml:space="preserve">Management Science</w:t>
+      </w:r>
+      <w:r>
+        <w:rPr>
+          <w:rFonts w:ascii="Times New Roman" w:cs="Times New Roman" w:eastAsia="Times New Roman" w:hAnsi="Times New Roman"/>
+          <w:sz w:val="24"/>
+          <w:szCs w:val="24"/>
+        </w:rPr>
+        <w:t xml:space="preserve"> 36(6):643-660.</w:t>
+      </w:r>
+    </w:p>
+    <w:p>
+      <w:pPr>
+        <w:spacing w:after="0" w:before="0" w:line="480"/>
+        <w:ind w:left="720" w:hanging="720"/>
+      </w:pPr>
+      <w:r>
+        <w:rPr>
+          <w:rFonts w:ascii="Times New Roman" w:cs="Times New Roman" w:eastAsia="Times New Roman" w:hAnsi="Times New Roman"/>
+          <w:sz w:val="24"/>
+          <w:szCs w:val="24"/>
+        </w:rPr>
+        <w:t xml:space="preserve">Tversky A, Kahneman D (1981) The framing of decisions and the psychology of choice. </w:t>
+      </w:r>
+      <w:r>
+        <w:rPr>
+          <w:rFonts w:ascii="Times New Roman" w:cs="Times New Roman" w:eastAsia="Times New Roman" w:hAnsi="Times New Roman"/>
+          <w:i/>
+          <w:iCs/>
+          <w:sz w:val="24"/>
+          <w:szCs w:val="24"/>
+        </w:rPr>
         <w:t xml:space="preserve">Science</w:t>
       </w:r>
       <w:r>
@@ -11262,6 +11383,34 @@
           <w:szCs w:val="24"/>
         </w:rPr>
         <w:t xml:space="preserve"> 211(4481):453-458.</w:t>
+      </w:r>
+    </w:p>
+    <w:p>
+      <w:pPr>
+        <w:spacing w:after="0" w:before="0" w:line="480"/>
+        <w:ind w:left="720" w:hanging="720"/>
+      </w:pPr>
+      <w:r>
+        <w:rPr>
+          <w:rFonts w:ascii="Times New Roman" w:cs="Times New Roman" w:eastAsia="Times New Roman" w:hAnsi="Times New Roman"/>
+          <w:sz w:val="24"/>
+          <w:szCs w:val="24"/>
+        </w:rPr>
+        <w:t xml:space="preserve">Wang Z, Zhang Z (2026) Framing effects in independent-agent large language models: A cross-family behavioral analysis. Preprint, arXiv:2603.19282.</w:t>
+      </w:r>
+    </w:p>
+    <w:p>
+      <w:pPr>
+        <w:spacing w:after="0" w:before="0" w:line="480"/>
+        <w:ind w:left="720" w:hanging="720"/>
+      </w:pPr>
+      <w:r>
+        <w:rPr>
+          <w:rFonts w:ascii="Times New Roman" w:cs="Times New Roman" w:eastAsia="Times New Roman" w:hAnsi="Times New Roman"/>
+          <w:sz w:val="24"/>
+          <w:szCs w:val="24"/>
+        </w:rPr>
+        <w:t xml:space="preserve">Xu X, Wu W (2026) Low reasoning effort is enough for routine office work by language-model agents. Preprint, arXiv:2608.03169.</w:t>
       </w:r>
     </w:p>
     <w:p>

</xml_diff>

<commit_message>
manuscript and results: add Fable 5.1 (3 turns left, floor); update figure 1
Co-Authored-By: Claude Sonnet 5.5 <noreply@anthropic.com>
Claude-Session: https://claude.ai/code/session_013HycsBHnRQDCEHKmLM3Rd4
</commit_message>
<xml_diff>
--- a/loss_chasing/isr/ISR_manuscript_v2.docx
+++ b/loss_chasing/isr/ISR_manuscript_v2.docx
@@ -84,7 +84,7 @@
           <w:sz w:val="24"/>
           <w:szCs w:val="24"/>
         </w:rPr>
-        <w:t xml:space="preserve">Organizations increasingly consider letting large language models (LLMs) operate other AI systems, choosing among patching, redeploying, rolling back, and skipping regression tests. Behavioral economics predicts that a decision maker who codes an outcome as a loss takes more risk to recover it. We test whether the accounting frame of a failed update makes an LLM operator skip verification, in an environment where skipping is dominated and everything is scored by rule. Study 1 executes the registered protocol on three models and finds no support for loss chasing. Studies 2 to 5 then write each frame in 16 independently generated wordings, so that the wording, not the episode, is the unit of replication. Under time pressure a fast commercial model (Claude Haiku 4.5) skips tests in 27.2% of first choices with three turns left and rarely with more time, and its loss frame skips less than its gain-to-goal frame in 15 of 16 wordings (-62.9 percentage points). Two larger commercial models (Sonnet 5.5 and Opus 5.5) did not skip in any of 4,320 first choices each. Enabling extended thinking in the fast model lowered skipping to 9.7%, and stating each option's expected quality change lowered it but did not remove it. A 2 x 2 design separates the two accounts: stating the target in the headline raised skipping by up to 54 points, whereas loss text lowered it by 13, which is more consistent with goal visibility than with loss accounting. We also argue that the natural risk-index test of escalation is not diagnostic when a positive-value rollback exists, and we propose excess risk together with test-skipping. The practical implication is to audit an operator model on its own payoff structure, with many wordings and with its reasoning setting fixed.</w:t>
+        <w:t xml:space="preserve">Organizations increasingly consider letting large language models (LLMs) operate other AI systems, choosing among patching, redeploying, rolling back, and skipping regression tests. Behavioral economics predicts that a decision maker who codes an outcome as a loss takes more risk to recover it. We test whether the accounting frame of a failed update makes an LLM operator skip verification, in an environment where skipping is dominated and everything is scored by rule. Study 1 executes the registered protocol on three models and finds no support for loss chasing. Studies 2 to 5 then write each frame in 16 independently generated wordings, so that the wording, not the episode, is the unit of replication. Under time pressure a fast commercial model (Claude Haiku 4.5) skips tests in 27.2% of first choices with three turns left and rarely with more time, and its loss frame skips less than its gain-to-goal frame in 15 of 16 wordings (-62.9 percentage points). Three larger commercial models (Sonnet 5.5, Opus 5.5, and Fable 5.1) did not skip in any of their first choices (4,320, 4,320, and 1,440). Enabling extended thinking in the fast model lowered skipping to 9.7%, and stating each option's expected quality change lowered it but did not remove it. A 2 x 2 design separates the two accounts: stating the target in the headline raised skipping by up to 54 points, whereas loss text lowered it by 13, which is more consistent with goal visibility than with loss accounting. We also argue that the natural risk-index test of escalation is not diagnostic when a positive-value rollback exists, and we propose excess risk together with test-skipping. The practical implication is to audit an operator model on its own payoff structure, with many wordings and with its reasoning setting fixed.</w:t>
       </w:r>
     </w:p>
     <w:p>
@@ -235,7 +235,7 @@
           <w:sz w:val="24"/>
           <w:szCs w:val="24"/>
         </w:rPr>
-        <w:t xml:space="preserve">We make four contributions. First, we formalize LLM maintenance as a repeated prospect-theoretic choice, define loss chasing operationally through three jointly necessary conditions, and identify a measurement problem that applies to any such environment: when a rollback option recovers a realized loss at positive expected value, a rational operator reduces its risk after failures, so the natural "risk rises after failures" test mislabels rational retreat as a failure to chase. We propose excess risk over an expected-value-maximizing benchmark together with test-skipping. Second, we argue that a framing claim needs the wording as its unit of replication, and we provide a design with 16 independently generated wordings per frame in which the frame effect, the wording effect, and their interaction can be separated. Third, we report what is associated with test-skipping in the model that skips. The pattern points to goal visibility rather than loss accounting: stating the target in the headline raised skipping by up to 54 percentage points, and loss text lowered it. Fourth, we find that skipping is lower with reasoning: extended thinking removed most of it in the fast model, and two larger commercial models that reason by default did not skip. We also provide an open, human-subject-free audit that an organization can run on a candidate operator before delegating maintenance decisions to it.</w:t>
+        <w:t xml:space="preserve">We make four contributions. First, we formalize LLM maintenance as a repeated prospect-theoretic choice, define loss chasing operationally through three jointly necessary conditions, and identify a measurement problem that applies to any such environment: when a rollback option recovers a realized loss at positive expected value, a rational operator reduces its risk after failures, so the natural "risk rises after failures" test mislabels rational retreat as a failure to chase. We propose excess risk over an expected-value-maximizing benchmark together with test-skipping. Second, we argue that a framing claim needs the wording as its unit of replication, and we provide a design with 16 independently generated wordings per frame in which the frame effect, the wording effect, and their interaction can be separated. Third, we report what is associated with test-skipping in the model that skips. The pattern points to goal visibility rather than loss accounting: stating the target in the headline raised skipping by up to 54 percentage points, and loss text lowered it. Fourth, we find that skipping is lower with reasoning: extended thinking removed most of it in the fast model, and three larger commercial models that reason by default did not skip. We also provide an open, human-subject-free audit that an organization can run on a candidate operator before delegating maintenance decisions to it.</w:t>
       </w:r>
     </w:p>
     <w:p>
@@ -1155,7 +1155,7 @@
                 <w:sz w:val="20"/>
                 <w:szCs w:val="20"/>
               </w:rPr>
-              <w:t xml:space="preserve">Haiku 4.5, Sonnet 5.5, Opus 5.5 (plus the two open models at 3 and 12 turns)</w:t>
+              <w:t xml:space="preserve">Haiku 4.5, Sonnet 5.5, Opus 5.5, Fable 5.1 (3 turns left only), plus the two open models at 3 and 12 turns</w:t>
             </w:r>
           </w:p>
         </w:tc>
@@ -1219,7 +1219,7 @@
                 <w:sz w:val="20"/>
                 <w:szCs w:val="20"/>
               </w:rPr>
-              <w:t xml:space="preserve">30 per cell; 4,320 per commercial model</w:t>
+              <w:t xml:space="preserve">30 per cell; 4,320 per model (1,440 for Fable 5.1)</w:t>
             </w:r>
           </w:p>
         </w:tc>
@@ -3804,7 +3804,7 @@
           <w:sz w:val="24"/>
           <w:szCs w:val="24"/>
         </w:rPr>
-        <w:t xml:space="preserve">The system role is a fixed on-call lead whose objective is to maximize terminal quality and who is told that a single -5 incident is severe. Output must be JSON with an action and a one-line reason. Parse failures are mapped to hold and flagged. Study 1 used two small open models executed locally on CPU (Qwen2.5-1.5B-Instruct and SmolLM2-1.7B-Instruct) at temperature 0.7 and Claude Haiku 4.5 through its programming interface at temperatures 0.0 and 0.7. For the open models the opening characters of the JSON response were pre-filled in the assistant turn, because a 0.5-billion-parameter pilot replied with a bare action name and every response failed to parse; this forces the output format and could itself influence the choice. Study 2 used three commercial models: Haiku 4.5 (temperature 0.7), Sonnet 5.5, and Opus 5.5; Studies 3 and 4 used Haiku 4.5. The Sonnet and Opus tiers accept no temperature argument and are run at the model default; the runs record this per row. Study 3 enabled extended thinking in Haiku 4.5 with a budget of 2,000 tokens, which also precludes setting a temperature.</w:t>
+        <w:t xml:space="preserve">The system role is a fixed on-call lead whose objective is to maximize terminal quality and who is told that a single -5 incident is severe. Output must be JSON with an action and a one-line reason. Parse failures are mapped to hold and flagged. Study 1 used two small open models executed locally on CPU (Qwen2.5-1.5B-Instruct and SmolLM2-1.7B-Instruct) at temperature 0.7 and Claude Haiku 4.5 through its programming interface at temperatures 0.0 and 0.7. For the open models the opening characters of the JSON response were pre-filled in the assistant turn, because a 0.5-billion-parameter pilot replied with a bare action name and every response failed to parse; this forces the output format and could itself influence the choice. Study 2 used four commercial models: Haiku 4.5 (temperature 0.7), Sonnet 5.5, Opus 5.5, and Fable 5.1, which was run at three turns left only to limit cost; Studies 3, 4, and 5 used Haiku 4.5. The Sonnet, Opus, and Fable tiers accept no temperature argument and are run at the model default; the runs record this per row. Study 3 enabled extended thinking in Haiku 4.5 with a budget of 2,000 tokens, which also precludes setting a temperature.</w:t>
       </w:r>
     </w:p>
     <w:p>
@@ -6470,7 +6470,7 @@
           <w:sz w:val="24"/>
           <w:szCs w:val="24"/>
         </w:rPr>
-        <w:t xml:space="preserve">Study 2 asks whether the frame effect survives when each frame is written in 16 independent wordings, whether it appears when turns are scarce, and how it differs across commercial tiers. Each cell has 30 first choices at temperature 0.7 for Haiku 4.5 and at the model default for Sonnet 5.5 and Opus 5.5, with no injected failures, at 12, 6, and 3 turns left: 3 frames x 16 wordings x 30 episodes = 1,440 first choices per condition and 4,320 per model.</w:t>
+        <w:t xml:space="preserve">Study 2 asks whether the frame effect survives when each frame is written in 16 independent wordings, whether it appears when turns are scarce, and how it differs across commercial tiers. Each cell has 30 first choices at temperature 0.7 for Haiku 4.5 and at the model default for Sonnet 5.5, Opus 5.5, and Fable 5.1, with no injected failures, at 12, 6, and 3 turns left: 3 frames x 16 wordings x 30 episodes = 1,440 first choices per condition and 4,320 per model. Fable 5.1 was run at three turns left only (1,440 first choices), the condition in which Haiku 4.5 skips, because its cost per call is about three times that of Opus 5.5.</w:t>
       </w:r>
     </w:p>
     <w:p>
@@ -7895,6 +7895,268 @@
                 <w:szCs w:val="20"/>
               </w:rPr>
               <w:t xml:space="preserve">12, 6, 3</w:t>
+            </w:r>
+          </w:p>
+        </w:tc>
+        <w:tc>
+          <w:tcPr>
+            <w:tcW w:type="dxa" w:w="1300"/>
+            <w:tcBorders>
+              <w:top w:val="none" w:color="FFFFFF" w:sz="0"/>
+              <w:left w:val="none" w:color="FFFFFF" w:sz="0"/>
+              <w:bottom w:val="none" w:color="FFFFFF" w:sz="0"/>
+              <w:right w:val="none" w:color="FFFFFF" w:sz="0"/>
+            </w:tcBorders>
+            <w:shd w:fill="FFFFFF" w:color="auto" w:val="clear"/>
+            <w:tcMar>
+              <w:top w:type="dxa" w:w="40"/>
+              <w:left w:type="dxa" w:w="80"/>
+              <w:bottom w:type="dxa" w:w="40"/>
+              <w:right w:type="dxa" w:w="80"/>
+            </w:tcMar>
+          </w:tcPr>
+          <w:p>
+            <w:pPr>
+              <w:spacing w:after="0" w:before="0" w:line="240"/>
+              <w:jc w:val="center"/>
+            </w:pPr>
+            <w:r>
+              <w:rPr>
+                <w:rFonts w:ascii="Times New Roman" w:cs="Times New Roman" w:eastAsia="Times New Roman" w:hAnsi="Times New Roman"/>
+                <w:sz w:val="20"/>
+                <w:szCs w:val="20"/>
+              </w:rPr>
+              <w:t xml:space="preserve">0% in every cell</w:t>
+            </w:r>
+          </w:p>
+        </w:tc>
+        <w:tc>
+          <w:tcPr>
+            <w:tcW w:type="dxa" w:w="1400"/>
+            <w:tcBorders>
+              <w:top w:val="none" w:color="FFFFFF" w:sz="0"/>
+              <w:left w:val="none" w:color="FFFFFF" w:sz="0"/>
+              <w:bottom w:val="none" w:color="FFFFFF" w:sz="0"/>
+              <w:right w:val="none" w:color="FFFFFF" w:sz="0"/>
+            </w:tcBorders>
+            <w:shd w:fill="FFFFFF" w:color="auto" w:val="clear"/>
+            <w:tcMar>
+              <w:top w:type="dxa" w:w="40"/>
+              <w:left w:type="dxa" w:w="80"/>
+              <w:bottom w:type="dxa" w:w="40"/>
+              <w:right w:type="dxa" w:w="80"/>
+            </w:tcMar>
+          </w:tcPr>
+          <w:p>
+            <w:pPr>
+              <w:spacing w:after="0" w:before="0" w:line="240"/>
+              <w:jc w:val="center"/>
+            </w:pPr>
+            <w:r>
+              <w:rPr>
+                <w:rFonts w:ascii="Times New Roman" w:cs="Times New Roman" w:eastAsia="Times New Roman" w:hAnsi="Times New Roman"/>
+                <w:sz w:val="20"/>
+                <w:szCs w:val="20"/>
+              </w:rPr>
+              <w:t xml:space="preserve">not estimable (floor)</w:t>
+            </w:r>
+          </w:p>
+        </w:tc>
+        <w:tc>
+          <w:tcPr>
+            <w:tcW w:type="dxa" w:w="1200"/>
+            <w:tcBorders>
+              <w:top w:val="none" w:color="FFFFFF" w:sz="0"/>
+              <w:left w:val="none" w:color="FFFFFF" w:sz="0"/>
+              <w:bottom w:val="none" w:color="FFFFFF" w:sz="0"/>
+              <w:right w:val="none" w:color="FFFFFF" w:sz="0"/>
+            </w:tcBorders>
+            <w:shd w:fill="FFFFFF" w:color="auto" w:val="clear"/>
+            <w:tcMar>
+              <w:top w:type="dxa" w:w="40"/>
+              <w:left w:type="dxa" w:w="80"/>
+              <w:bottom w:type="dxa" w:w="40"/>
+              <w:right w:type="dxa" w:w="80"/>
+            </w:tcMar>
+          </w:tcPr>
+          <w:p>
+            <w:pPr>
+              <w:spacing w:after="0" w:before="0" w:line="240"/>
+              <w:jc w:val="center"/>
+            </w:pPr>
+            <w:r>
+              <w:rPr>
+                <w:rFonts w:ascii="Times New Roman" w:cs="Times New Roman" w:eastAsia="Times New Roman" w:hAnsi="Times New Roman"/>
+                <w:sz w:val="20"/>
+                <w:szCs w:val="20"/>
+              </w:rPr>
+              <w:t xml:space="preserve">not estimable</w:t>
+            </w:r>
+          </w:p>
+        </w:tc>
+        <w:tc>
+          <w:tcPr>
+            <w:tcW w:type="dxa" w:w="1100"/>
+            <w:tcBorders>
+              <w:top w:val="none" w:color="FFFFFF" w:sz="0"/>
+              <w:left w:val="none" w:color="FFFFFF" w:sz="0"/>
+              <w:bottom w:val="none" w:color="FFFFFF" w:sz="0"/>
+              <w:right w:val="none" w:color="FFFFFF" w:sz="0"/>
+            </w:tcBorders>
+            <w:shd w:fill="FFFFFF" w:color="auto" w:val="clear"/>
+            <w:tcMar>
+              <w:top w:type="dxa" w:w="40"/>
+              <w:left w:type="dxa" w:w="80"/>
+              <w:bottom w:type="dxa" w:w="40"/>
+              <w:right w:type="dxa" w:w="80"/>
+            </w:tcMar>
+          </w:tcPr>
+          <w:p>
+            <w:pPr>
+              <w:spacing w:after="0" w:before="0" w:line="240"/>
+              <w:jc w:val="center"/>
+            </w:pPr>
+            <w:r>
+              <w:rPr>
+                <w:rFonts w:ascii="Times New Roman" w:cs="Times New Roman" w:eastAsia="Times New Roman" w:hAnsi="Times New Roman"/>
+                <w:sz w:val="20"/>
+                <w:szCs w:val="20"/>
+              </w:rPr>
+              <w:t xml:space="preserve">-</w:t>
+            </w:r>
+          </w:p>
+        </w:tc>
+        <w:tc>
+          <w:tcPr>
+            <w:tcW w:type="dxa" w:w="900"/>
+            <w:tcBorders>
+              <w:top w:val="none" w:color="FFFFFF" w:sz="0"/>
+              <w:left w:val="none" w:color="FFFFFF" w:sz="0"/>
+              <w:bottom w:val="none" w:color="FFFFFF" w:sz="0"/>
+              <w:right w:val="none" w:color="FFFFFF" w:sz="0"/>
+            </w:tcBorders>
+            <w:shd w:fill="FFFFFF" w:color="auto" w:val="clear"/>
+            <w:tcMar>
+              <w:top w:type="dxa" w:w="40"/>
+              <w:left w:type="dxa" w:w="80"/>
+              <w:bottom w:type="dxa" w:w="40"/>
+              <w:right w:type="dxa" w:w="80"/>
+            </w:tcMar>
+          </w:tcPr>
+          <w:p>
+            <w:pPr>
+              <w:spacing w:after="0" w:before="0" w:line="240"/>
+              <w:jc w:val="center"/>
+            </w:pPr>
+            <w:r>
+              <w:rPr>
+                <w:rFonts w:ascii="Times New Roman" w:cs="Times New Roman" w:eastAsia="Times New Roman" w:hAnsi="Times New Roman"/>
+                <w:sz w:val="20"/>
+                <w:szCs w:val="20"/>
+              </w:rPr>
+              <w:t xml:space="preserve">-</w:t>
+            </w:r>
+          </w:p>
+        </w:tc>
+        <w:tc>
+          <w:tcPr>
+            <w:tcW w:type="dxa" w:w="1660"/>
+            <w:tcBorders>
+              <w:top w:val="none" w:color="FFFFFF" w:sz="0"/>
+              <w:left w:val="none" w:color="FFFFFF" w:sz="0"/>
+              <w:bottom w:val="none" w:color="FFFFFF" w:sz="0"/>
+              <w:right w:val="none" w:color="FFFFFF" w:sz="0"/>
+            </w:tcBorders>
+            <w:shd w:fill="FFFFFF" w:color="auto" w:val="clear"/>
+            <w:tcMar>
+              <w:top w:type="dxa" w:w="40"/>
+              <w:left w:type="dxa" w:w="80"/>
+              <w:bottom w:type="dxa" w:w="40"/>
+              <w:right w:type="dxa" w:w="80"/>
+            </w:tcMar>
+          </w:tcPr>
+          <w:p>
+            <w:pPr>
+              <w:spacing w:after="0" w:before="0" w:line="240"/>
+              <w:jc w:val="center"/>
+            </w:pPr>
+            <w:r>
+              <w:rPr>
+                <w:rFonts w:ascii="Times New Roman" w:cs="Times New Roman" w:eastAsia="Times New Roman" w:hAnsi="Times New Roman"/>
+                <w:sz w:val="20"/>
+                <w:szCs w:val="20"/>
+              </w:rPr>
+              <w:t xml:space="preserve">-</w:t>
+            </w:r>
+          </w:p>
+        </w:tc>
+      </w:tr>
+      <w:tr>
+        <w:trPr>
+          <w:cantSplit/>
+          <w:tblHeader w:val="off"/>
+        </w:trPr>
+        <w:tc>
+          <w:tcPr>
+            <w:tcW w:type="dxa" w:w="1100"/>
+            <w:tcBorders>
+              <w:top w:val="none" w:color="FFFFFF" w:sz="0"/>
+              <w:left w:val="none" w:color="FFFFFF" w:sz="0"/>
+              <w:bottom w:val="none" w:color="FFFFFF" w:sz="0"/>
+              <w:right w:val="none" w:color="FFFFFF" w:sz="0"/>
+            </w:tcBorders>
+            <w:shd w:fill="FFFFFF" w:color="auto" w:val="clear"/>
+            <w:tcMar>
+              <w:top w:type="dxa" w:w="40"/>
+              <w:left w:type="dxa" w:w="80"/>
+              <w:bottom w:type="dxa" w:w="40"/>
+              <w:right w:type="dxa" w:w="80"/>
+            </w:tcMar>
+          </w:tcPr>
+          <w:p>
+            <w:pPr>
+              <w:spacing w:after="0" w:before="0" w:line="240"/>
+              <w:jc w:val="left"/>
+            </w:pPr>
+            <w:r>
+              <w:rPr>
+                <w:rFonts w:ascii="Times New Roman" w:cs="Times New Roman" w:eastAsia="Times New Roman" w:hAnsi="Times New Roman"/>
+                <w:sz w:val="20"/>
+                <w:szCs w:val="20"/>
+              </w:rPr>
+              <w:t xml:space="preserve">Fable 5.1</w:t>
+            </w:r>
+          </w:p>
+        </w:tc>
+        <w:tc>
+          <w:tcPr>
+            <w:tcW w:type="dxa" w:w="700"/>
+            <w:tcBorders>
+              <w:top w:val="none" w:color="FFFFFF" w:sz="0"/>
+              <w:left w:val="none" w:color="FFFFFF" w:sz="0"/>
+              <w:bottom w:val="none" w:color="FFFFFF" w:sz="0"/>
+              <w:right w:val="none" w:color="FFFFFF" w:sz="0"/>
+            </w:tcBorders>
+            <w:shd w:fill="FFFFFF" w:color="auto" w:val="clear"/>
+            <w:tcMar>
+              <w:top w:type="dxa" w:w="40"/>
+              <w:left w:type="dxa" w:w="80"/>
+              <w:bottom w:type="dxa" w:w="40"/>
+              <w:right w:type="dxa" w:w="80"/>
+            </w:tcMar>
+          </w:tcPr>
+          <w:p>
+            <w:pPr>
+              <w:spacing w:after="0" w:before="0" w:line="240"/>
+              <w:jc w:val="center"/>
+            </w:pPr>
+            <w:r>
+              <w:rPr>
+                <w:rFonts w:ascii="Times New Roman" w:cs="Times New Roman" w:eastAsia="Times New Roman" w:hAnsi="Times New Roman"/>
+                <w:sz w:val="20"/>
+                <w:szCs w:val="20"/>
+              </w:rPr>
+              <w:t xml:space="preserve">3</w:t>
             </w:r>
           </w:p>
         </w:tc>
@@ -8182,7 +8444,7 @@
           <w:sz w:val="20"/>
           <w:szCs w:val="20"/>
         </w:rPr>
-        <w:t xml:space="preserve"> Test-skip rate by turns left at the first choice and model (all frames and wordings pooled; 1,440 first choices per point). The larger tiers lie on the zero line. The thinking condition was run at three turns left only.</w:t>
+        <w:t xml:space="preserve"> Test-skip rate by turns left at the first choice and model (all frames and wordings pooled; 1,440 first choices per point). The larger tiers lie on the zero line; Fable 5.1 was run at three turns left only. The thinking condition was run at three turns left only.</w:t>
       </w:r>
     </w:p>
     <w:p>
@@ -8242,7 +8504,7 @@
           <w:sz w:val="24"/>
           <w:szCs w:val="24"/>
         </w:rPr>
-        <w:t xml:space="preserve">Sonnet 5.5 and Opus 5.5 did not choose a skip action in any of 4,320 first choices each. The floor is not an artifact of failed calls: parse failure was at most 0.09%, no model refused, and the actions chosen were narrow_patch in at least 97% of first choices, with wide_patch in at most 2.8% (more often with fewer turns left) and hold in at most 1.3%, both verified or non-risky options. Because the contrast cannot be estimated, these models neither support nor contradict a frame effect; this environment elicited no skipping from them under any of the 48 sentences.</w:t>
+        <w:t xml:space="preserve">Sonnet 5.5 and Opus 5.5 did not choose a skip action in any of 4,320 first choices each, and Fable 5.1 did not in any of its 1,440 first choices at three turns left. The floor is not an artifact of failed calls: parse failure was at most 0.09%, no model refused, and the actions chosen were narrow_patch in at least 97% of first choices, with wide_patch in at most 2.8% (more often with fewer turns left) and hold in at most 1.3%, both verified or non-risky options. Fable 5.1 also showed no parse failure and no refusal, and chose narrow_patch in 96.0% and wide_patch in 4.0% of first choices. Because the contrast cannot be estimated, these models neither support nor contradict a frame effect; this environment elicited no skipping from them under any of the 48 sentences (for Fable 5.1, at three turns left).</w:t>
       </w:r>
     </w:p>
     <w:p>
@@ -8889,7 +9151,7 @@
           <w:sz w:val="24"/>
           <w:szCs w:val="24"/>
         </w:rPr>
-        <w:t xml:space="preserve">Thinking reduced the overall skip rate from 27.2% to 9.7% and the largest cell rate from 100% to 23.3%. The frame gaps shrank by an order of magnitude (loss minus gain from -62.9 to -5.2 points), and their direction, with the gain-to-goal frame highest, was preserved. Variation in the wording-by-frame table was mostly interaction and noise (frame 21.6%, wording 26.5%, interaction 51.9%, noise floor 76.0%), so with thinking the cell rates are small and unstable and individual wordings differ from each other more than the frames do. Reasoning therefore appears to account for most, but not all, of the difference between the fast tier and the larger tiers: with thinking enabled the fast tier still skips in about 10% of first choices, whereas Sonnet 5.5 and Opus 5.5 do not skip at all. Either a residual tier effect or the difference in the amount of reasoning could explain the remainder; the design does not separate them.</w:t>
+        <w:t xml:space="preserve">Thinking reduced the overall skip rate from 27.2% to 9.7% and the largest cell rate from 100% to 23.3%. The frame gaps shrank by an order of magnitude (loss minus gain from -62.9 to -5.2 points), and their direction, with the gain-to-goal frame highest, was preserved. Variation in the wording-by-frame table was mostly interaction and noise (frame 21.6%, wording 26.5%, interaction 51.9%, noise floor 76.0%), so with thinking the cell rates are small and unstable and individual wordings differ from each other more than the frames do. Reasoning therefore appears to account for most, but not all, of the difference between the fast tier and the larger tiers: with thinking enabled the fast tier still skips in about 10% of first choices, whereas Sonnet 5.5, Opus 5.5, and Fable 5.1 do not skip at all. Either a residual tier effect or the difference in the amount of reasoning could explain the remainder; the design does not separate them.</w:t>
       </w:r>
     </w:p>
     <w:p>
@@ -11577,7 +11839,7 @@
           <w:sz w:val="24"/>
           <w:szCs w:val="24"/>
         </w:rPr>
-        <w:t xml:space="preserve">The registered question is whether an LLM maintenance operator chases losses because of accounting frames. We find no evidence of it in the three models of Study 1, in the three commercial tiers of Study 2, or in the fast tier with thinking or with the target manipulated in Studies 3 and 4. Where skipping occurs, it is associated with a visible target under time pressure, loss text goes with less of it, reasoning removes most of it, and stating the expected quality change of each option lowers it without removing it. The finding is not that framing is irrelevant: the headline sentence moved the fast tier's skipping from 0% to 100% across conditions. It is that the ingredient that mattered appears to be what the sentence tells the operator about the goal, and not whether it describes a loss.</w:t>
+        <w:t xml:space="preserve">The registered question is whether an LLM maintenance operator chases losses because of accounting frames. We find no evidence of it in the three models of Study 1, in the four commercial tiers of Study 2, or in the fast tier with thinking or with the target manipulated in Studies 3 and 4. Where skipping occurs, it is associated with a visible target under time pressure, loss text goes with less of it, reasoning removes most of it, and stating the expected quality change of each option lowers it without removing it. The finding is not that framing is irrelevant: the headline sentence moved the fast tier's skipping from 0% to 100% across conditions. It is that the ingredient that mattered appears to be what the sentence tells the operator about the goal, and not whether it describes a loss.</w:t>
       </w:r>
     </w:p>
     <w:p>
@@ -11724,7 +11986,7 @@
           <w:sz w:val="24"/>
           <w:szCs w:val="24"/>
         </w:rPr>
-        <w:t xml:space="preserve">First, the commercial ladder confounds tier with reasoning and sampling control. Sonnet 5.5 and Opus 5.5 accept no temperature argument and reason by default, and Study 3 suggests that reasoning accounts for much of the difference to Haiku 4.5; the remainder cannot be assigned to size, to training, or to the amount of reasoning, and we do not claim a size effect. Second, the main results come from one model that skips, in one condition (no injected failures) at three turns left; Study 1 covers failure history only at twelve turns left. Third, Studies 2 to 5 were designed after Study 1 and were not registered. Their analysis scripts were written before the runs and their contrasts are descriptive, but the questions they answer were shaped by earlier output, the four studies together make many comparisons, and the intervals are not adjusted for multiplicity, although the three-turn contrasts of Study 2 and the main contrasts of Study 4 (the goal effect with neutral text, valence without a target statement, and the registered contrast) stay clear of zero at the 99.6% level, while the interaction and several finer contrasts in Study 4 do not. Fourth, the 16 wordings per frame were generated by a language model and filtered by mechanical rules, with two of three batches served by a fallback model; they cover a wider range than four hand-written paraphrases but are not a random sample of all possible wordings, and loss wordings contain stronger affect verbs ("knocked," "took a hit," "eroded") than the gain and neutral wordings, which could contribute to the lower skipping under loss text; the split of loss wordings by verb in Study 2 does not support this, but it is a comparison of six and ten wordings with a wide interval. Fifth, the format pre-fill for the open models is an intervention outside the registered protocol, and the open models were run at temperature 0.7 only. Sixth, a scalar quality score compresses multidimensional incidents into one line, and the six closed actions simplify the continuous space of field work. Seventh, a model does not feel loss; it reacts to text statistics, and the design does not identify the mechanism by which a sentence changes a choice. Reasons the models give are post hoc statements and are not used as evidence. Eighth, in Studies 1 to 4 the operator sees only qualitative option descriptions, so the dominance of verification is visible to the designer but not to the operator, and part of the skipping may be a defensible trade-off from the operator's information. Study 5 shows that skipping persists at 17% to 25% in the target-stating frames when the expected quality change is stated, but it also lowers it substantially, and the added text may act as a cue; the baseline and expected-value runs share a design but not their sampling draws. Ninth, results for commercial models depend on the model version at the time of the run. External validity is left to follow-up work applying the same coding scheme to live tickets.</w:t>
+        <w:t xml:space="preserve">First, the commercial ladder confounds tier with reasoning and sampling control. Sonnet 5.5, Opus 5.5, and Fable 5.1 accept no temperature argument and reason by default, Fable 5.1 was run at three turns left only, and Study 3 suggests that reasoning accounts for much of the difference to Haiku 4.5; the remainder cannot be assigned to size, to training, or to the amount of reasoning, and we do not claim a size effect. Second, the main results come from one model that skips, in one condition (no injected failures) at three turns left; Study 1 covers failure history only at twelve turns left. Third, Studies 2 to 5 were designed after Study 1 and were not registered. Their analysis scripts were written before the runs and their contrasts are descriptive, but the questions they answer were shaped by earlier output, the four studies together make many comparisons, and the intervals are not adjusted for multiplicity, although the three-turn contrasts of Study 2 and the main contrasts of Study 4 (the goal effect with neutral text, valence without a target statement, and the registered contrast) stay clear of zero at the 99.6% level, while the interaction and several finer contrasts in Study 4 do not. Fourth, the 16 wordings per frame were generated by a language model and filtered by mechanical rules, with two of three batches served by a fallback model; they cover a wider range than four hand-written paraphrases but are not a random sample of all possible wordings, and loss wordings contain stronger affect verbs ("knocked," "took a hit," "eroded") than the gain and neutral wordings, which could contribute to the lower skipping under loss text; the split of loss wordings by verb in Study 2 does not support this, but it is a comparison of six and ten wordings with a wide interval. Fifth, the format pre-fill for the open models is an intervention outside the registered protocol, and the open models were run at temperature 0.7 only. Sixth, a scalar quality score compresses multidimensional incidents into one line, and the six closed actions simplify the continuous space of field work. Seventh, a model does not feel loss; it reacts to text statistics, and the design does not identify the mechanism by which a sentence changes a choice. Reasons the models give are post hoc statements and are not used as evidence. Eighth, in Studies 1 to 4 the operator sees only qualitative option descriptions, so the dominance of verification is visible to the designer but not to the operator, and part of the skipping may be a defensible trade-off from the operator's information. Study 5 shows that skipping persists at 17% to 25% in the target-stating frames when the expected quality change is stated, but it also lowers it substantially, and the added text may act as a cue; the baseline and expected-value runs share a design but not their sampling draws. Ninth, results for commercial models depend on the model version at the time of the run. External validity is left to follow-up work applying the same coding scheme to live tickets.</w:t>
       </w:r>
     </w:p>
     <w:p>
@@ -11758,7 +12020,7 @@
           <w:sz w:val="24"/>
           <w:szCs w:val="24"/>
         </w:rPr>
-        <w:t xml:space="preserve">We asked whether the accounting frame of a failed update moves an LLM operator toward skipping verification, using an environment in which skipping is dominated and all outcomes are scored by rule. The registered protocol did not support loss chasing. Five studies, four of them with independently generated wordings and registered analysis scripts, suggest that, in the fast commercial model that skips, the shortcut is associated with a visible target under time pressure, is lower under loss text, and is largely absent with reasoning, and that two larger commercial models did not skip. A deployed operator should therefore be treated as a decision maker whose sensitivity to the status line, to the visibility of its goal, and to its own reasoning setting is an empirical property of that model, to be measured before delegation and again when the messages it reads change.</w:t>
+        <w:t xml:space="preserve">We asked whether the accounting frame of a failed update moves an LLM operator toward skipping verification, using an environment in which skipping is dominated and all outcomes are scored by rule. The registered protocol did not support loss chasing. Five studies, four of them with independently generated wordings and registered analysis scripts, suggest that, in the fast commercial model that skips, the shortcut is associated with a visible target under time pressure, is lower under loss text, and is largely absent with reasoning, and that three larger commercial models did not skip. A deployed operator should therefore be treated as a decision maker whose sensitivity to the status line, to the visibility of its goal, and to its own reasoning setting is an empirical property of that model, to be measured before delegation and again when the messages it reads change.</w:t>
       </w:r>
     </w:p>
     <w:p>
@@ -15256,6 +15518,172 @@
           </w:p>
         </w:tc>
       </w:tr>
+      <w:tr>
+        <w:trPr>
+          <w:cantSplit/>
+          <w:tblHeader w:val="off"/>
+        </w:trPr>
+        <w:tc>
+          <w:tcPr>
+            <w:tcW w:type="dxa" w:w="2700"/>
+            <w:tcBorders>
+              <w:top w:val="none" w:color="FFFFFF" w:sz="0"/>
+              <w:left w:val="none" w:color="FFFFFF" w:sz="0"/>
+              <w:bottom w:val="none" w:color="FFFFFF" w:sz="0"/>
+              <w:right w:val="none" w:color="FFFFFF" w:sz="0"/>
+            </w:tcBorders>
+            <w:shd w:fill="FFFFFF" w:color="auto" w:val="clear"/>
+            <w:tcMar>
+              <w:top w:type="dxa" w:w="40"/>
+              <w:left w:type="dxa" w:w="80"/>
+              <w:bottom w:type="dxa" w:w="40"/>
+              <w:right w:type="dxa" w:w="80"/>
+            </w:tcMar>
+          </w:tcPr>
+          <w:p>
+            <w:pPr>
+              <w:spacing w:after="0" w:before="0" w:line="240"/>
+              <w:jc w:val="left"/>
+            </w:pPr>
+            <w:r>
+              <w:rPr>
+                <w:rFonts w:ascii="Times New Roman" w:cs="Times New Roman" w:eastAsia="Times New Roman" w:hAnsi="Times New Roman"/>
+                <w:sz w:val="20"/>
+                <w:szCs w:val="20"/>
+              </w:rPr>
+              <w:t xml:space="preserve">claude-fable-5-1</w:t>
+            </w:r>
+          </w:p>
+        </w:tc>
+        <w:tc>
+          <w:tcPr>
+            <w:tcW w:type="dxa" w:w="1300"/>
+            <w:tcBorders>
+              <w:top w:val="none" w:color="FFFFFF" w:sz="0"/>
+              <w:left w:val="none" w:color="FFFFFF" w:sz="0"/>
+              <w:bottom w:val="none" w:color="FFFFFF" w:sz="0"/>
+              <w:right w:val="none" w:color="FFFFFF" w:sz="0"/>
+            </w:tcBorders>
+            <w:shd w:fill="FFFFFF" w:color="auto" w:val="clear"/>
+            <w:tcMar>
+              <w:top w:type="dxa" w:w="40"/>
+              <w:left w:type="dxa" w:w="80"/>
+              <w:bottom w:type="dxa" w:w="40"/>
+              <w:right w:type="dxa" w:w="80"/>
+            </w:tcMar>
+          </w:tcPr>
+          <w:p>
+            <w:pPr>
+              <w:spacing w:after="0" w:before="0" w:line="240"/>
+              <w:jc w:val="center"/>
+            </w:pPr>
+            <w:r>
+              <w:rPr>
+                <w:rFonts w:ascii="Times New Roman" w:cs="Times New Roman" w:eastAsia="Times New Roman" w:hAnsi="Times New Roman"/>
+                <w:sz w:val="20"/>
+                <w:szCs w:val="20"/>
+              </w:rPr>
+              <w:t xml:space="preserve">API</w:t>
+            </w:r>
+          </w:p>
+        </w:tc>
+        <w:tc>
+          <w:tcPr>
+            <w:tcW w:type="dxa" w:w="2200"/>
+            <w:tcBorders>
+              <w:top w:val="none" w:color="FFFFFF" w:sz="0"/>
+              <w:left w:val="none" w:color="FFFFFF" w:sz="0"/>
+              <w:bottom w:val="none" w:color="FFFFFF" w:sz="0"/>
+              <w:right w:val="none" w:color="FFFFFF" w:sz="0"/>
+            </w:tcBorders>
+            <w:shd w:fill="FFFFFF" w:color="auto" w:val="clear"/>
+            <w:tcMar>
+              <w:top w:type="dxa" w:w="40"/>
+              <w:left w:type="dxa" w:w="80"/>
+              <w:bottom w:type="dxa" w:w="40"/>
+              <w:right w:type="dxa" w:w="80"/>
+            </w:tcMar>
+          </w:tcPr>
+          <w:p>
+            <w:pPr>
+              <w:spacing w:after="0" w:before="0" w:line="240"/>
+              <w:jc w:val="center"/>
+            </w:pPr>
+            <w:r>
+              <w:rPr>
+                <w:rFonts w:ascii="Times New Roman" w:cs="Times New Roman" w:eastAsia="Times New Roman" w:hAnsi="Times New Roman"/>
+                <w:sz w:val="20"/>
+                <w:szCs w:val="20"/>
+              </w:rPr>
+              <w:t xml:space="preserve">Model default</w:t>
+            </w:r>
+          </w:p>
+        </w:tc>
+        <w:tc>
+          <w:tcPr>
+            <w:tcW w:type="dxa" w:w="1500"/>
+            <w:tcBorders>
+              <w:top w:val="none" w:color="FFFFFF" w:sz="0"/>
+              <w:left w:val="none" w:color="FFFFFF" w:sz="0"/>
+              <w:bottom w:val="none" w:color="FFFFFF" w:sz="0"/>
+              <w:right w:val="none" w:color="FFFFFF" w:sz="0"/>
+            </w:tcBorders>
+            <w:shd w:fill="FFFFFF" w:color="auto" w:val="clear"/>
+            <w:tcMar>
+              <w:top w:type="dxa" w:w="40"/>
+              <w:left w:type="dxa" w:w="80"/>
+              <w:bottom w:type="dxa" w:w="40"/>
+              <w:right w:type="dxa" w:w="80"/>
+            </w:tcMar>
+          </w:tcPr>
+          <w:p>
+            <w:pPr>
+              <w:spacing w:after="0" w:before="0" w:line="240"/>
+              <w:jc w:val="center"/>
+            </w:pPr>
+            <w:r>
+              <w:rPr>
+                <w:rFonts w:ascii="Times New Roman" w:cs="Times New Roman" w:eastAsia="Times New Roman" w:hAnsi="Times New Roman"/>
+                <w:sz w:val="20"/>
+                <w:szCs w:val="20"/>
+              </w:rPr>
+              <w:t xml:space="preserve">2 (3 turns left only)</w:t>
+            </w:r>
+          </w:p>
+        </w:tc>
+        <w:tc>
+          <w:tcPr>
+            <w:tcW w:type="dxa" w:w="1660"/>
+            <w:tcBorders>
+              <w:top w:val="none" w:color="FFFFFF" w:sz="0"/>
+              <w:left w:val="none" w:color="FFFFFF" w:sz="0"/>
+              <w:bottom w:val="none" w:color="FFFFFF" w:sz="0"/>
+              <w:right w:val="none" w:color="FFFFFF" w:sz="0"/>
+            </w:tcBorders>
+            <w:shd w:fill="FFFFFF" w:color="auto" w:val="clear"/>
+            <w:tcMar>
+              <w:top w:type="dxa" w:w="40"/>
+              <w:left w:type="dxa" w:w="80"/>
+              <w:bottom w:type="dxa" w:w="40"/>
+              <w:right w:type="dxa" w:w="80"/>
+            </w:tcMar>
+          </w:tcPr>
+          <w:p>
+            <w:pPr>
+              <w:spacing w:after="0" w:before="0" w:line="240"/>
+              <w:jc w:val="center"/>
+            </w:pPr>
+            <w:r>
+              <w:rPr>
+                <w:rFonts w:ascii="Times New Roman" w:cs="Times New Roman" w:eastAsia="Times New Roman" w:hAnsi="Times New Roman"/>
+                <w:sz w:val="20"/>
+                <w:szCs w:val="20"/>
+              </w:rPr>
+              <w:t xml:space="preserve">Rejects temperature; reasons by default</w:t>
+            </w:r>
+          </w:p>
+        </w:tc>
+      </w:tr>
     </w:tbl>
     <w:p>
       <w:pPr>
@@ -15363,6 +15791,30 @@
           <w:szCs w:val="24"/>
         </w:rPr>
         <w:t xml:space="preserve"> After Study 1 we ran a time-pressure pilot with the registered headlines (three turns left, zero and three failures, 50 episodes per cell, the two open models and Haiku 4.5) and a check with four hand-written paraphrases per frame. In the Haiku pilot, the neutral frame skipped in 40 of 50 first choices and the other frames in few. We then replaced the hand-written paraphrases, which we had written after seeing the pilot output, with the 16 independently generated wordings of Study 2. The Haiku pilot and the four-paraphrase check are superseded by Studies 2 to 4 and are not reported as results; the open-model part of the time-pressure pilot is the only evidence on open models under time pressure and is reported in Study 2 as a pilot. Study 3 (thinking) and Study 4 (goal visibility and valence) were designed after Study 2, and Study 5 (expected values shown) after Study 4. The analysis scripts for Studies 2 to 5 were committed before the runs they analyze. Studies 2 to 5 are not registered.</w:t>
+      </w:r>
+    </w:p>
+    <w:p>
+      <w:pPr>
+        <w:spacing w:after="0" w:before="0" w:line="480"/>
+        <w:jc w:val="left"/>
+      </w:pPr>
+      <w:r>
+        <w:rPr>
+          <w:rFonts w:ascii="Times New Roman" w:cs="Times New Roman" w:eastAsia="Times New Roman" w:hAnsi="Times New Roman"/>
+          <w:b/>
+          <w:bCs/>
+          <w:sz w:val="24"/>
+          <w:szCs w:val="24"/>
+        </w:rPr>
+        <w:t xml:space="preserve">Cost-limited run.</w:t>
+      </w:r>
+      <w:r>
+        <w:rPr>
+          <w:rFonts w:ascii="Times New Roman" w:cs="Times New Roman" w:eastAsia="Times New Roman" w:hAnsi="Times New Roman"/>
+          <w:sz w:val="24"/>
+          <w:szCs w:val="24"/>
+        </w:rPr>
+        <w:t xml:space="preserve"> Fable 5.1 was run at three turns left only (1,440 first choices), because its cost per call is about three times that of Opus 5.5 and the other larger tiers showed no skipping at twelve and six turns left.</w:t>
       </w:r>
     </w:p>
     <w:p>

</xml_diff>

<commit_message>
Report Fable 5.1 at all three time conditions (0% skipping); update figure 1, manuscript, appendix
Co-Authored-By: Claude Sonnet 5.5 <noreply@anthropic.com>
Claude-Session: https://claude.ai/code/session_013HycsBHnRQDCEHKmLM3Rd4
</commit_message>
<xml_diff>
--- a/loss_chasing/isr/ISR_manuscript_v2.docx
+++ b/loss_chasing/isr/ISR_manuscript_v2.docx
@@ -84,7 +84,7 @@
           <w:sz w:val="24"/>
           <w:szCs w:val="24"/>
         </w:rPr>
-        <w:t xml:space="preserve">Organizations increasingly consider letting large language models (LLMs) operate other AI systems, choosing among patching, redeploying, rolling back, and skipping regression tests. Behavioral economics predicts that a decision maker who codes an outcome as a loss takes more risk to recover it. We test whether the accounting frame of a failed update makes an LLM operator skip verification, in an environment where skipping is dominated and everything is scored by rule. Study 1 executes the registered protocol on three models and finds no support for loss chasing. Studies 2 to 5 then write each frame in 16 independently generated wordings, so that the wording, not the episode, is the unit of replication. Under time pressure a fast commercial model (Claude Haiku 4.5) skips tests in 27.2% of first choices with three turns left and rarely with more time, and its loss frame skips less than its gain-to-goal frame in 15 of 16 wordings (-62.9 percentage points). Three larger commercial models (Sonnet 5.5, Opus 5.5, and Fable 5.1) did not skip in any of their first choices (4,320, 4,320, and 1,440). Enabling extended thinking in the fast model lowered skipping to 9.7%, and stating each option's expected quality change lowered it but did not remove it. A 2 x 2 design separates the two accounts: stating the target in the headline raised skipping by up to 54 points, whereas loss text lowered it by 13, which is more consistent with goal visibility than with loss accounting. We also argue that the natural risk-index test of escalation is not diagnostic when a positive-value rollback exists, and we propose excess risk together with test-skipping. The practical implication is to audit an operator model on its own payoff structure, with many wordings and with its reasoning setting fixed.</w:t>
+        <w:t xml:space="preserve">Organizations increasingly consider letting large language models (LLMs) operate other AI systems, choosing among patching, redeploying, rolling back, and skipping regression tests. Behavioral economics predicts that a decision maker who codes an outcome as a loss takes more risk to recover it. We test whether the accounting frame of a failed update makes an LLM operator skip verification, in an environment where skipping is dominated and everything is scored by rule. Study 1 executes the registered protocol on three models and finds no support for loss chasing. Studies 2 to 5 then write each frame in 16 independently generated wordings, so that the wording, not the episode, is the unit of replication. Under time pressure a fast commercial model (Claude Haiku 4.5) skips tests in 27.2% of first choices with three turns left and rarely with more time, and its loss frame skips less than its gain-to-goal frame in 15 of 16 wordings (-62.9 percentage points). Three larger commercial models (Sonnet 5.5, Opus 5.5, and Fable 5.1) did not skip in any of their first choices (4,320 first choices each). Enabling extended thinking in the fast model lowered skipping to 9.7%, and stating each option's expected quality change lowered it but did not remove it. A 2 x 2 design separates the two accounts: stating the target in the headline raised skipping by up to 54 points, whereas loss text lowered it by 13, which is more consistent with goal visibility than with loss accounting. We also argue that the natural risk-index test of escalation is not diagnostic when a positive-value rollback exists, and we propose excess risk together with test-skipping. The practical implication is to audit an operator model on its own payoff structure, with many wordings and with its reasoning setting fixed.</w:t>
       </w:r>
     </w:p>
     <w:p>
@@ -1155,7 +1155,7 @@
                 <w:sz w:val="20"/>
                 <w:szCs w:val="20"/>
               </w:rPr>
-              <w:t xml:space="preserve">Haiku 4.5, Sonnet 5.5, Opus 5.5, Fable 5.1 (3 turns left only), plus the two open models at 3 and 12 turns</w:t>
+              <w:t xml:space="preserve">Haiku 4.5, Sonnet 5.5, Opus 5.5, Fable 5.1, plus the two open models at 3 and 12 turns</w:t>
             </w:r>
           </w:p>
         </w:tc>
@@ -1219,7 +1219,7 @@
                 <w:sz w:val="20"/>
                 <w:szCs w:val="20"/>
               </w:rPr>
-              <w:t xml:space="preserve">30 per cell; 4,320 per model (1,440 for Fable 5.1)</w:t>
+              <w:t xml:space="preserve">30 per cell; 4,320 per model</w:t>
             </w:r>
           </w:p>
         </w:tc>
@@ -6470,7 +6470,7 @@
           <w:sz w:val="24"/>
           <w:szCs w:val="24"/>
         </w:rPr>
-        <w:t xml:space="preserve">Study 2 asks whether the frame effect survives when each frame is written in 16 independent wordings, whether it appears when turns are scarce, and how it differs across commercial tiers. Each cell has 30 first choices at temperature 0.7 for Haiku 4.5 and at the model default for Sonnet 5.5, Opus 5.5, and Fable 5.1, with no injected failures, at 12, 6, and 3 turns left: 3 frames x 16 wordings x 30 episodes = 1,440 first choices per condition and 4,320 per model. Fable 5.1 was run at three turns left only (1,440 first choices), the condition in which Haiku 4.5 skips, because its cost per call is about three times that of Opus 5.5.</w:t>
+        <w:t xml:space="preserve">Study 2 asks whether the frame effect survives when each frame is written in 16 independent wordings, whether it appears when turns are scarce, and how it differs across commercial tiers. Each cell has 30 first choices at temperature 0.7 for Haiku 4.5 and at the model default for Sonnet 5.5, Opus 5.5, and Fable 5.1, with no injected failures, at 12, 6, and 3 turns left: 3 frames x 16 wordings x 30 episodes = 1,440 first choices per condition and 4,320 per model.</w:t>
       </w:r>
     </w:p>
     <w:p>
@@ -8156,7 +8156,7 @@
                 <w:sz w:val="20"/>
                 <w:szCs w:val="20"/>
               </w:rPr>
-              <w:t xml:space="preserve">3</w:t>
+              <w:t xml:space="preserve">12, 6, 3</w:t>
             </w:r>
           </w:p>
         </w:tc>
@@ -8444,7 +8444,7 @@
           <w:sz w:val="20"/>
           <w:szCs w:val="20"/>
         </w:rPr>
-        <w:t xml:space="preserve"> Test-skip rate by turns left at the first choice and model (all frames and wordings pooled; 1,440 first choices per point). The larger tiers lie on the zero line; Fable 5.1 was run at three turns left only. The thinking condition was run at three turns left only.</w:t>
+        <w:t xml:space="preserve"> Test-skip rate by turns left at the first choice and model (all frames and wordings pooled; 1,440 first choices per point). The larger tiers lie on the zero line; The thinking condition was run at three turns left only.</w:t>
       </w:r>
     </w:p>
     <w:p>
@@ -8504,7 +8504,7 @@
           <w:sz w:val="24"/>
           <w:szCs w:val="24"/>
         </w:rPr>
-        <w:t xml:space="preserve">Sonnet 5.5 and Opus 5.5 did not choose a skip action in any of 4,320 first choices each, and Fable 5.1 did not in any of its 1,440 first choices at three turns left. The floor is not an artifact of failed calls: parse failure was at most 0.09%, no model refused, and the actions chosen were narrow_patch in at least 97% of first choices, with wide_patch in at most 2.8% (more often with fewer turns left) and hold in at most 1.3%, both verified or non-risky options. Fable 5.1 also showed no parse failure and no refusal, and chose narrow_patch in 96.0% and wide_patch in 4.0% of first choices. Because the contrast cannot be estimated, these models neither support nor contradict a frame effect; this environment elicited no skipping from them under any of the 48 sentences (for Fable 5.1, at three turns left).</w:t>
+        <w:t xml:space="preserve">Sonnet 5.5 and Opus 5.5 did not choose a skip action in any of 4,320 first choices each, and Fable 5.1 did not in any of its 4,320 first choices. The floor is not an artifact of failed calls: parse failure was at most 0.09%, no model refused, and the actions chosen were narrow_patch in at least 97% of first choices, with wide_patch in at most 2.8% (more often with fewer turns left) and hold in at most 1.3%, both verified or non-risky options. At three turns left, Fable 5.1 also showed no parse failure and no refusal, and chose narrow_patch in 96.0% and wide_patch in 4.0% of first choices. Because the contrast cannot be estimated, these models neither support nor contradict a frame effect; this environment elicited no skipping from them under any of the 48 sentences (including Fable 5.1).</w:t>
       </w:r>
     </w:p>
     <w:p>
@@ -11986,7 +11986,7 @@
           <w:sz w:val="24"/>
           <w:szCs w:val="24"/>
         </w:rPr>
-        <w:t xml:space="preserve">First, the commercial ladder confounds tier with reasoning and sampling control. Sonnet 5.5, Opus 5.5, and Fable 5.1 accept no temperature argument and reason by default, Fable 5.1 was run at three turns left only, and Study 3 suggests that reasoning accounts for much of the difference to Haiku 4.5; the remainder cannot be assigned to size, to training, or to the amount of reasoning, and we do not claim a size effect. Second, the main results come from one model that skips, in one condition (no injected failures) at three turns left; Study 1 covers failure history only at twelve turns left. Third, Studies 2 to 5 were designed after Study 1 and were not registered. Their analysis scripts were written before the runs and their contrasts are descriptive, but the questions they answer were shaped by earlier output, the four studies together make many comparisons, and the intervals are not adjusted for multiplicity, although the three-turn contrasts of Study 2 and the main contrasts of Study 4 (the goal effect with neutral text, valence without a target statement, and the registered contrast) stay clear of zero at the 99.6% level, while the interaction and several finer contrasts in Study 4 do not. Fourth, the 16 wordings per frame were generated by a language model and filtered by mechanical rules, with two of three batches served by a fallback model; they cover a wider range than four hand-written paraphrases but are not a random sample of all possible wordings, and loss wordings contain stronger affect verbs ("knocked," "took a hit," "eroded") than the gain and neutral wordings, which could contribute to the lower skipping under loss text; the split of loss wordings by verb in Study 2 does not support this, but it is a comparison of six and ten wordings with a wide interval. Fifth, the format pre-fill for the open models is an intervention outside the registered protocol, and the open models were run at temperature 0.7 only. Sixth, a scalar quality score compresses multidimensional incidents into one line, and the six closed actions simplify the continuous space of field work. Seventh, a model does not feel loss; it reacts to text statistics, and the design does not identify the mechanism by which a sentence changes a choice. Reasons the models give are post hoc statements and are not used as evidence. Eighth, in Studies 1 to 4 the operator sees only qualitative option descriptions, so the dominance of verification is visible to the designer but not to the operator, and part of the skipping may be a defensible trade-off from the operator's information. Study 5 shows that skipping persists at 17% to 25% in the target-stating frames when the expected quality change is stated, but it also lowers it substantially, and the added text may act as a cue; the baseline and expected-value runs share a design but not their sampling draws. Ninth, results for commercial models depend on the model version at the time of the run. External validity is left to follow-up work applying the same coding scheme to live tickets.</w:t>
+        <w:t xml:space="preserve">First, the commercial ladder confounds tier with reasoning and sampling control. Sonnet 5.5, Opus 5.5, and Fable 5.1 accept no temperature argument and reason by default, and Study 3 suggests that reasoning accounts for much of the difference to Haiku 4.5; the remainder cannot be assigned to size, to training, or to the amount of reasoning, and we do not claim a size effect. Second, the main results come from one model that skips, in one condition (no injected failures) at three turns left; Study 1 covers failure history only at twelve turns left. Third, Studies 2 to 5 were designed after Study 1 and were not registered. Their analysis scripts were written before the runs and their contrasts are descriptive, but the questions they answer were shaped by earlier output, the four studies together make many comparisons, and the intervals are not adjusted for multiplicity, although the three-turn contrasts of Study 2 and the main contrasts of Study 4 (the goal effect with neutral text, valence without a target statement, and the registered contrast) stay clear of zero at the 99.6% level, while the interaction and several finer contrasts in Study 4 do not. Fourth, the 16 wordings per frame were generated by a language model and filtered by mechanical rules, with two of three batches served by a fallback model; they cover a wider range than four hand-written paraphrases but are not a random sample of all possible wordings, and loss wordings contain stronger affect verbs ("knocked," "took a hit," "eroded") than the gain and neutral wordings, which could contribute to the lower skipping under loss text; the split of loss wordings by verb in Study 2 does not support this, but it is a comparison of six and ten wordings with a wide interval. Fifth, the format pre-fill for the open models is an intervention outside the registered protocol, and the open models were run at temperature 0.7 only. Sixth, a scalar quality score compresses multidimensional incidents into one line, and the six closed actions simplify the continuous space of field work. Seventh, a model does not feel loss; it reacts to text statistics, and the design does not identify the mechanism by which a sentence changes a choice. Reasons the models give are post hoc statements and are not used as evidence. Eighth, in Studies 1 to 4 the operator sees only qualitative option descriptions, so the dominance of verification is visible to the designer but not to the operator, and part of the skipping may be a defensible trade-off from the operator's information. Study 5 shows that skipping persists at 17% to 25% in the target-stating frames when the expected quality change is stated, but it also lowers it substantially, and the added text may act as a cue; the baseline and expected-value runs share a design but not their sampling draws. Ninth, results for commercial models depend on the model version at the time of the run. External validity is left to follow-up work applying the same coding scheme to live tickets.</w:t>
       </w:r>
     </w:p>
     <w:p>

</xml_diff>